<commit_message>
Proofcheck Inn Trouble Filipino: MINOR (16 fixes)
Co-Authored-By: Claude Opus 5.5 <noreply@anthropic.com>
Claude-Session: https://claude.ai/code/session_012Cm8JxdqzjuttdUSdkQCUg
</commit_message>
<xml_diff>
--- a/translated/corrected/Inn Trouble - ASSEMBLED - FORMATTED_Filipino.docx
+++ b/translated/corrected/Inn Trouble - ASSEMBLED - FORMATTED_Filipino.docx
@@ -128,7 +128,7 @@
     </w:p>
     <w:p>
       <w:r>
-        <w:t xml:space="preserve">Hinihingi sa nota ang kalahating milyong dolyar. Alam nito ang kinuha ng kanyang lola sa tuhod mula sa mga Blackburn noong 1924, at ang tindahan sa kabilang bayan kung saan niya ito ibinenta, at tinukoy nito ang batong nasa puso ng brotse — mga detalyeng nag-iisa sa loob ng isang naka-lock na baul sa atik ni Fiona, at sa isa pang lugar sa bayan.</w:t>
+        <w:t xml:space="preserve">Hinihingi sa nota ang kalahating milyong dolyar. Alam nito ang kinuha ng kanyang lola sa tuhod mula sa mga Blackburn noong 1924, at ang tindahang dalawang bayan ang layo kung saan niya ito ibinenta, at tinukoy nito ang batong nasa puso ng brotse — mga detalyeng nag-iisa sa loob ng isang naka-lock na baul sa atik ni Fiona, at sa isa pang lugar sa bayan.</w:t>
       </w:r>
     </w:p>
     <w:p>
@@ -520,7 +520,7 @@
     <w:p/>
     <w:p>
       <w:r>
-        <w:t>Tumingala si Pip mula sa kaniyang pwesto sa tabi ng bintana, at itinuwid ang kaniyang ulo sa tunog.</w:t>
+        <w:t xml:space="preserve">Tumingala si Pip mula sa kaniyang pwesto sa tabi ng bintana, at ikiniling ang kaniyang ulo sa tunog.</w:t>
       </w:r>
     </w:p>
     <w:p/>
@@ -568,7 +568,7 @@
     <w:p/>
     <w:p>
       <w:r>
-        <w:t>Naging matigas ang umaga sa magdamag. Ang mga putik sa daan ay may manipis na yelo sa ibabaw na lumalutong sa ilalim ng aking mga bota, at ang mga tuyong dahon ay naging matigas at makintab na parang pilak dahil sa hamog. Ang amoy ng usok ng kahoy mula sa mga tsimenea sa kahabaan ng Evergreen ay nakabitin nang mababa sa tahimik at malamig na hangin. Ang bayan ay halos hindi pa gising. Karamihan sa mga tindahan ay madilim pa rin, may mga kalabasa para sa pista sa mga baitang ng pinto, at ang aming mga yabag ay umalingawngaw sa bakanteng bangketa.</w:t>
+        <w:t xml:space="preserve">Naging matigas ang umaga sa magdamag. Ang mga lusak sa daan ay may manipis na yelo sa ibabaw na lumalutong sa ilalim ng aking mga bota, at ang mga tuyong dahon ay naging matigas at makintab na parang pilak dahil sa hamog. Ang amoy ng usok ng kahoy mula sa mga tsimenea sa kahabaan ng Evergreen ay nakabitin nang mababa sa tahimik at malamig na hangin. Ang bayan ay halos hindi pa gising. Karamihan sa mga tindahan ay madilim pa rin, may mga kalabasa para sa pista sa mga baitang ng pinto, at ang aming mga yabag ay umalingawngaw sa bakanteng bangketa.</w:t>
       </w:r>
     </w:p>
     <w:p/>
@@ -691,7 +691,7 @@
     <w:p/>
     <w:p>
       <w:r>
-        <w:t xml:space="preserve">“Dinala niya ito sa Ridgeline, dalawang bayan ang layo, sa isang sanglaan doon, at ipinagbili niya ito. At gamit ang pera.” Pumutok nang tuluyan ang boses ni Fiona sa gitna. “Gamit ang pera ay binili niya ang inn na ito. Ito. Ang Winter Wonderland Inn. Ganoon nagmay-ari ang pamilya ko nito. Iyon ang pundasyon kung saan nakatayo ang buong lugar. Isang daang taon ng mga Pasko at kasalan, agahan tuwing Linggo, mga manlalakbay na pumasok mula sa yelo, at sa ilalim ng lahat ng iyon, sumusuporta rito, isang brotse na ninakaw ng isang natatakot na dalaga mula sa mga taong pinaglingkuran niya.”</w:t>
+        <w:t xml:space="preserve">“Dinala niya ito sa Ridgeline, dalawang bayan ang layo, sa isang sanglaan doon, at ipinagbili niya ito. At gamit ang pera.” Pumutok nang tuluyan ang boses ni Fiona sa gitna. “Gamit ang pera ay binili niya ang inn na ito. Ito. Ang Winter Wonderland Inn. Ganoon nagmay-ari ang pamilya ko nito. Iyon ang pundasyon kung saan nakatayo ang buong lugar. Isang daang taon ng mga Pasko at kasalan, agahan tuwing Linggo, mga manlalakbay na pumasok mula sa niyebe, at sa ilalim ng lahat ng iyon, sumusuporta rito, isang brotse na ninakaw ng isang natatakot na dalaga mula sa mga taong pinaglingkuran niya.”</w:t>
       </w:r>
     </w:p>
     <w:p/>
@@ -724,7 +724,7 @@
     <w:p/>
     <w:p>
       <w:r>
-        <w:t xml:space="preserve">Lumapit ako at ipinatong ang aking kamay sa ibabaw ng kaniyang malamig na kamay. “Fiona. Makinig ka sa akin. Kung ano ang ginawa o hindi ginawa ng iyong lola sa tuhod, isang daang taon na ang nakalipas, sa isang malupit na taglamig na hindi natin kailanman maiimagine, hindi iyon ang naglalarawan kung sino ka. Ibinuhos mo ang iyong buong puso sa lugar na ito at sa bayang ito. Iyon ang nakikita ng mga tao. Iyon ang totoo tungkol sa iyo.”</w:t>
+        <w:t xml:space="preserve">Lumapit ako at ipinatong ang aking kamay sa ibabaw ng kaniyang malamig na kamay. “Fiona. Makinig ka sa akin. Kung ano ang ginawa o hindi ginawa ng iyong lola sa tuhod, isang daang taon na ang nakalipas, sa isang malupit na taglamig na hindi natin kailanman maiisip, hindi iyon ang naglalarawan kung sino ka. Ibinuhos mo ang iyong buong puso sa lugar na ito at sa bayang ito. Iyon ang nakikita ng mga tao. Iyon ang totoo tungkol sa iyo.”</w:t>
       </w:r>
     </w:p>
     <w:p/>
@@ -867,7 +867,7 @@
     <w:p/>
     <w:p>
       <w:r>
-        <w:t xml:space="preserve">Kaya ikinuwento ko sa kanya. Lahat, habang umuusok ang sabaw at idinuduyan ni Pip ang antok sa tabi ng kalan habang nakatakip ang isang palikpik sa mga mata nito. Ang tawag sa telepono. Ang maliit na sala na may maingay na orasan. Ang nota, ang pulang laso, at ang pera sa ilalim ng mga baitang. Ang litrato ng hindi pinangalanang babaeng Blackburn na may brotse sa leeg nito. Si Constance Okafor, labing-siyam o dalawampung taong gulang sa isang malupit na taglamig, ang pagnanakaw, ang sanglaan sa kabilang bayan sa Ridgeline, ang inn na binili gamit ang pera. At ang naka-lock na baul sa atik na walang nagbukas kundi si Fiona mismo.</w:t>
+        <w:t xml:space="preserve">Kaya ikinuwento ko sa kanya. Lahat, habang umuusok ang sabaw at idinuduyan ni Pip ang antok sa tabi ng kalan habang nakatakip ang isang palikpik sa mga mata nito. Ang tawag sa telepono. Ang maliit na sala na may maingay na orasan. Ang nota, ang pulang laso, at ang pera sa ilalim ng mga baitang. Ang litrato ng hindi pinangalanang babaeng Blackburn na may brotse sa leeg nito. Si Constance Okafor, labing-siyam o dalawampung taong gulang sa isang malupit na taglamig, ang pagnanakaw, ang sanglaan sa Ridgeline na dalawang bayan ang layo, ang inn na binili gamit ang pera. At ang naka-lock na baul sa atik na walang nagbukas kundi si Fiona mismo.</w:t>
       </w:r>
     </w:p>
     <w:p/>
@@ -1313,7 +1313,7 @@
         <w:t xml:space="preserve"/>
       </w:r>
       <w:r>
-        <w:t xml:space="preserve"> ay nakapuwesto sa kanto ng Evergreen at Maple, may bintanang punô ng mga madeha ng sinulid na nakasalansan ayon sa kulay parang kahon ng pinturang iniwang bukas. Mainit at medyo madilim sa loob. Amoy lana ito at ang mansanilyang laging ibinababad ni Olivia sa maliit na lutuan sa likod ng counter. Nang hapon na iyon, hinila ng bilog ang kanilang mga upuan malapit sa unahan, sa malabnaw na liwanag ng Oktubre mula sa bintana, at naroon silang lahat. Si Olivia ang nasa gitna, siyempre, dahil tindahan niya ito, mansanilya niya, at sa paanuman ay usapan din niya; si Dot sa tabi niya, matibay at kulay-abo, tuyo tulad ng biskwit; si Claire na may liksi ng mamamahayag, tatlong hanay na ang inuuna sa lahat; si Ivy, na tumatawa sa mga bagay bago pa man lubusang nakakatawa; si Martha, tuwid sa magandang upuan habang nakakrus ang mga bukung-bukong; at si Ellie, ang maamong si Ellie, na nakasimangot sa isang nahulog na tahi.</w:t>
+        <w:t xml:space="preserve"> ay nakapuwesto sa kanto ng Evergreen at Maple, may bintanang puno ng mga madeha ng sinulid na nakasalansan ayon sa kulay parang kahon ng pinturang iniwang bukas. Mainit at medyo madilim sa loob. Amoy lana ito at ang mansanilyang laging ibinababad ni Olivia sa maliit na lutuan sa likod ng counter. Nang hapon na iyon, hinila ng bilog ang kanilang mga upuan malapit sa unahan, sa malabnaw na liwanag ng Oktubre mula sa bintana, at naroon silang lahat. Si Olivia ang nasa gitna, siyempre, dahil tindahan niya ito, mansanilya niya, at sa paanuman ay usapan din niya; si Dot sa tabi niya, matibay at kulay-abo, tuyo tulad ng biskwit; si Claire na may liksi ng mamamahayag, tatlong hanay na ang inuuna sa lahat; si Ivy, na tumatawa sa mga bagay bago pa man lubusang nakakatawa; si Martha, tuwid sa magandang upuan habang nakakrus ang mga bukung-bukong; at si Ellie, ang maamong si Ellie, na nakasimangot sa isang nahulog na tahi.</w:t>
       </w:r>
     </w:p>
     <w:p>
@@ -1498,7 +1498,7 @@
     </w:p>
     <w:p>
       <w:r>
-        <w:t>Limang daang libong dolyar, hinihingi sa isang babaeng walang ikasampu man lamang nito, ng isang taong nakakaalam kung paano huhugot ng kayamanan mula sa isang lumang sikreto. Isang gusaling punô ng alaala ng bayan ang nagdidilim dahil sa kawalan ng bahagi ng parehong halagang iyon. At isang mabait at kulay-abong lalaki na ubos na ang tapat na pintong kakatukin.</w:t>
+        <w:t xml:space="preserve">Limang daang libong dolyar, hinihingi sa isang babaeng walang ikasampu man lamang nito, ng isang taong nakakaalam kung paano huhugot ng kayamanan mula sa isang lumang sikreto. Isang gusaling puno ng alaala ng bayan ang nagdidilim dahil sa kawalan ng bahagi ng parehong halagang iyon. At isang mabait at kulay-abong lalaki na ubos na ang tapat na pintong kakatukin.</w:t>
       </w:r>
     </w:p>
     <w:p>
@@ -1985,7 +1985,7 @@
     <w:p/>
     <w:p>
       <w:r>
-        <w:t xml:space="preserve">“Kanya rin ang mga ito,” sabi niya, habang dinadampot ang isa at iniikot ito sa liwanag, at naroon ang pagmamahal sa kanyang mga kamay para rito hanggang ngayon. “Ang mga sabitan sa beranda. Ang huli sa order. Naglagay ako ng malaking bahagi ng aking sarili sa lobby na iyon ngayong taon, alam ninyo. Hindi ka maaaring maglakad sa silid-tanggapán ni Fiona nang hindi hinahawakan ang isang bagay na ginawa ko, o tumatayo malapit dito.” Ibinaba niya ang bituin. “Bagay sa akin. Gusto ng isang panday na mag-iwan ng isang lugar na may amoy ng kanyang apoy.”</w:t>
+        <w:t xml:space="preserve">“Kanya rin ang mga ito,” sabi niya, habang dinadampot ang isa at iniikot ito sa liwanag, at naroon ang pagmamahal sa kanyang mga kamay para rito hanggang ngayon. “Ang mga sabitan sa beranda. Ang huli sa order. Naglagay ako ng malaking bahagi ng aking sarili sa lobby na iyon ngayong taon, alam ninyo. Hindi ka maaaring maglakad sa silid-tanggapan ni Fiona nang hindi hinahawakan ang isang bagay na ginawa ko, o tumatayo malapit dito.” Ibinaba niya ang bituin. “Bagay sa akin. Gusto ng isang panday na mag-iwan ng isang lugar na may amoy ng kanyang apoy.”</w:t>
       </w:r>
     </w:p>
     <w:p/>
@@ -2459,7 +2459,7 @@
     <w:p/>
     <w:p>
       <w:r>
-        <w:t xml:space="preserve">Umabot sa kaniya ang kabaitan kung saan hindi umabot ang tanong. Bumaba nang kaunti ang kaniyang mga balikat, at nag-alinlangan ang kaniyang mukha na tila maluluha bago niya ito napigilan. “Panahon na ng kapaskuhan,” sabi niya. “At nagbabayad ang alkalde ng sahod para sa bayan na katumbas ng trabaho ng isang lungsod, at hindi kailanman sapat ang katapusan ng buwan. Hindi para sa sinuman ngayong taon. Ang mga bayarin ay hindi nagbabayad sa sarili nila.” Naglabas siya ng maliit at gasgas na tawa na walang halong saya. “Walang mga bayarin ng sinuman ang nagbabayad sa sarili ngayong taon, hindi ba, Ginang Claus.”</w:t>
+        <w:t xml:space="preserve">Umabot sa kaniya ang kabaitan kung saan hindi umabot ang tanong. Bumaba nang kaunti ang kaniyang mga balikat, at nag-alinlangan ang kaniyang mukha na tila maluluha bago niya ito napigilan. “Ganito talaga sa panahong ito,” sabi niya. “At nagbabayad ang alkalde ng sahod para sa bayan na katumbas ng trabaho ng isang lungsod, at hindi kailanman sapat ang katapusan ng buwan. Hindi para sa sinuman ngayong taon. Ang mga bayarin ay hindi nagbabayad sa sarili nila.” Naglabas siya ng maliit at gasgas na tawa na walang halong saya. “Walang mga bayarin ng sinuman ang nagbabayad sa sarili ngayong taon, hindi ba, Ginang Claus.”</w:t>
       </w:r>
     </w:p>
     <w:p/>
@@ -3357,7 +3357,7 @@
     <w:p/>
     <w:p>
       <w:r>
-        <w:t xml:space="preserve">Binuksan ko ito. Maingat ang pagkagawa, isang sandaang taon na tinunton pahina pahina. At hindi nito sinabi ang sinabi ng nota ng pangingikil. Higit pa roon ang sinabi nito, at mas makatao.</w:t>
+        <w:t xml:space="preserve">Binuksan ko ito. Maingat ang pagkagawa, isang sandaang taon na tinunton pahina-pahina. At hindi nito sinabi ang sinabi ng nota ng pangingikil. Higit pa roon ang sinabi nito, at mas makatao.</w:t>
       </w:r>
     </w:p>
     <w:p/>
@@ -4317,7 +4317,7 @@
     <w:p/>
     <w:p>
       <w:r>
-        <w:t>Sinabi ko sa kanya ang lahat. Kung sino at paano, at na silang dalawa ang magkasama. Pinanood ko itong tumagos, ang dalamhati nito, na si Theo iyon, na si Vera iyon, mga taong pinakain niya at pinagtawanan sa kanyang mga mesa. At pagkatapos ay ibinigay ko sa kanya ang folder ni Neil, at sinabi ko sa kanya ang isa pang bagay, ang bagay na nagbago sa buong anyo nito.</w:t>
+        <w:t xml:space="preserve">Sinabi ko sa kanya ang lahat. Kung sino at paano, at na silang dalawa ang magkasama. Pinanood ko itong tumagos, ang dalamhati nito, na si Theo iyon, na si Vera iyon, mga taong pinakain niya at nakasabay niyang tumawa sa kanyang mga mesa. At pagkatapos ay ibinigay ko sa kanya ang folder ni Neil, at sinabi ko sa kanya ang isa pang bagay, ang bagay na nagbago sa buong anyo nito.</w:t>
       </w:r>
     </w:p>
     <w:p/>
@@ -4353,7 +4353,7 @@
     <w:p/>
     <w:p>
       <w:r>
-        <w:t xml:space="preserve">“Maging sa silid,” sabi ko. “Kung kaya mo itong tiisin. Hindi para magbintang ng sinuman. Kundi para lamang naroroon, upang kailangang tingnan ni Theo ang mukha ng kaibigan na sinubukan niyang saktan, at upang huminto ka sa pagiging naiiwan nang nag-iisa sa dilim kasama nito. Hindi mo kailangang magsabi kahit isang salita kung ayaw mo. Ngunit ito ang iyong kuwento, Fiona, higit sa kaninuman. Dapat naroroon ka kapag sa wakas ay umakyat na ito sa liwanag.”</w:t>
+        <w:t xml:space="preserve">“Naroon ka lang sa silid,” sabi ko. “Kung kaya mo itong tiisin. Hindi para magbintang ng sinuman. Kundi para lamang naroroon, upang kailangang tingnan ni Theo ang mukha ng kaibigan na sinubukan niyang saktan, at upang huminto ka sa pagiging naiiwan nang nag-iisa sa dilim kasama nito. Hindi mo kailangang magsabi kahit isang salita kung ayaw mo. Ngunit ito ang iyong kuwento, Fiona, higit sa kaninuman. Dapat naroroon ka kapag sa wakas ay umakyat na ito sa liwanag.”</w:t>
       </w:r>
     </w:p>
     <w:p/>
@@ -4463,7 +4463,7 @@
     <w:p/>
     <w:p>
       <w:r>
-        <w:t>Napaiyak na rin siya noon, gaya ni Theo, at ang lumabas sa kanya ay kapighatian, hayagan at malalim.</w:t>
+        <w:t xml:space="preserve">Napaiyak na rin siya noon, bigla, gaya ni Theo, at ang lumabas sa kanya ay kapighatian, hayagan at malalim.</w:t>
       </w:r>
     </w:p>
     <w:p/>
@@ -5167,7 +5167,7 @@
     </w:p>
     <w:p>
       <w:r>
-        <w:t>Pagkatapos ay may lumipad na ladrilyo sa bintana, at may nakasulat na salita sa dingding na pula kung saan babasahin ito ng bawat bata sa Evergreen Avenue habang dumadaan.</w:t>
+        <w:t xml:space="preserve">Pagkatapos ay may lumipad na ladrilyo sa bintana, at may salitang nakasulat nang pula sa dingding kung saan babasahin ito ng bawat bata sa Evergreen Avenue habang dumadaan.</w:t>
       </w:r>
     </w:p>
     <w:p>
@@ -5464,7 +5464,7 @@
     </w:p>
     <w:p>
       <w:r>
-        <w:t xml:space="preserve">Ngunit wala akong sinabi nito sa bilog. Kumuha ako ng gingersnap, sinabihan si Pip na hindi nang tingnan niya ang mga mumo, at umupo akong muli sa aking korona. Itinali ko ang balsam pauwi, usbong sa ibabaw ng usbong, lahat ay nakaturo sa parehong paraan. Sa likod ko ay pumutok ang isang troso sa kalan at nag-uusap ang mga kababaihan. Nakalatag ang niyebe na maliwanag sa liwasan na may isang taong-niyebe na nakatalikod sa maling paraan. May nagsisimula. Nagtiwala ako sa malamig na tusok na iyon sa likod ng aking leeg, at nanatili ito sa akin sa buong umaga.</w:t>
+        <w:t xml:space="preserve">Ngunit wala akong sinabi nito sa bilog. Kumuha ako ng gingersnap, sinabihan si Pip na hindi nang tingnan niya ang mga mumo, at umupo akong muli sa aking korona. Itinali ko ang balsam, usbong sa ibabaw ng usbong, lahat ay nakaturo sa parehong paraan. Sa likod ko ay pumutok ang isang troso sa kalan at nag-uusap ang mga kababaihan. Nakalatag ang niyebe na maliwanag sa liwasan na may isang taong-niyebe na nakatalikod sa maling paraan. May nagsisimula. Nagtiwala ako sa malamig na tusok na iyon sa likod ng aking leeg, at nanatili ito sa akin sa buong umaga.</w:t>
       </w:r>
     </w:p>
     <w:p/>

</xml_diff>

<commit_message>
Full proofcheck Inn Trouble Filipino: SIGNIFICANT (295 edits)
Co-Authored-By: Claude Opus 5.5 <noreply@anthropic.com>
Claude-Session: https://claude.ai/code/session_012Cm8JxdqzjuttdUSdkQCUg
</commit_message>
<xml_diff>
--- a/translated/corrected/Inn Trouble - ASSEMBLED - FORMATTED_Filipino.docx
+++ b/translated/corrected/Inn Trouble - ASSEMBLED - FORMATTED_Filipino.docx
@@ -149,13 +149,13 @@
     <w:p/>
     <w:p>
       <w:r>
-        <w:t>Mainit-init pa ang pie nang ihatid ko ito sa basket, sapat ang init kaya lumabo ang singaw sa salamin ng malamig na bintana ng kusina, at umalingasaw sa buong silid ang amoy ng kanela, mansanas, at pulang asukal na hinayaan ko munang lumagpas nang bahagya sa kulay-ginto dahil ganoon ito gusto ni Fiona. Minsan ay sinabi niya sa akin na sinadya palang sunugin ng kanyang ina ang asukal, hanggang sa dulo kung saan nawawala ang pagiging matamis nito at nagsisimulang maging mas malalim ang lasa. Ang amoy niyon, aniya, ay ang amoy ng pagiging musmos at ligtas sa isang mainit na kusina sa malamig na araw. Ganoon ang ginagawa ko para sa kanya mula noon.</w:t>
-      </w:r>
-    </w:p>
-    <w:p/>
-    <w:p>
-      <w:r>
-        <w:t>Naglagay ako ng basahang may disenyong tsekeng tela sa paligid ng pinggan at pinagpapatong ang mga sulok nito. Pagkatapos ay tiningnan ko si Pip, na pumosisyon sa may pintuan sa likod taglay ang di-mapagkakanulong tindig ng isang nilalang na pinangakuan ng pasyal at buong pusong nagbabalak maningil niyon nang lubusan.</w:t>
+        <w:t>Mainit-init pa ang pie nang iangat ko ito papasok sa basket, sapat ang init kaya lumabo ang singaw sa salamin ng malamig na bintana ng kusina, at umalingasaw sa buong silid ang amoy ng kanela, mansanas, at pulang asukal na hinayaan ko munang lumagpas nang bahagya sa kulay-ginto dahil ganoon ito gusto ni Fiona. Minsan ay sinabi niya sa akin na sinadya palang sunugin ng kanyang ina ang asukal, hanggang sa dulo kung saan nawawala ang pagiging matamis nito at nagsisimulang maging mas malalim ang lasa. Ang amoy niyon, aniya, ay ang amoy ng pagiging musmos at ligtas sa isang mainit na kusina sa malamig na araw. Ganoon ang ginagawa ko para sa kanya mula noon.</w:t>
+      </w:r>
+    </w:p>
+    <w:p/>
+    <w:p>
+      <w:r>
+        <w:t>Naglagay ako ng basahang may disenyong tsekeng tela sa paligid ng pinggan at idiniin ang mga sulok nito. Pagkatapos ay tiningnan ko si Pip, na pumosisyon sa may pintuan sa likod taglay ang di-mapagkakanulong tindig ng isang nilalang na pinangakuan ng pasyal at buong pusong nagbabalak maningil niyon nang lubusan.</w:t>
       </w:r>
     </w:p>
     <w:p/>
@@ -179,7 +179,7 @@
     <w:p/>
     <w:p>
       <w:r>
-        <w:t xml:space="preserve">Mahal ko ito. Ang mga sapot ng gagamba ay nakasabit na mula pa noong unang malamig na umaga, at nagugol ko na ang napakaraming taon ng aking mahabang buhay sa isang lugar kung saan ang tanging mga kapitbahay ay mga duwende at reindeer, kasabay ng isang asawang humuhuni sa sarili sa loob ng isang pagawaan, kaya hinding-hindi ko mamaliitin ang isang kalye na puno ng mga kalabasa. Inukitan ni Ginoong Kim ang buong hanay ng mga ito sa labas ng talyer ng sasakyan, bawat isa ay nakasuot ng maliit na sumbrero ng mekaniko na gawa sa papel. Ang opisina ng Gazette ay may kalansay sa bintana na nagbabasa ng pahayagan. May isang tao, na pinaghihinalaan ko si Olivia, ang nagniting ng kahel na sumbrero para sa gripo sa labas ng Yarn Tales.</w:t>
+        <w:t xml:space="preserve">Mahal ko ito. Ang mga sapot ng gagamba ay nakasabit na mula pa noong unang malamig na umaga, at nagugol ko na ang napakaraming taon ng aking mahabang buhay sa isang lugar kung saan ang tanging mga kapitbahay ay mga duwende at reindeer, kasabay ng isang asawang humuhuni sa sarili sa loob ng isang pagawaan, kaya hinding-hindi ko mamaliitin ang isang kalye na puno ng mga kalabasa. Inukitan ni Ginoong Kim ang buong hanay ng mga ito sa labas ng talyer ng sasakyan, bawat isa ay nakasuot ng maliit na sumbrero ng mekaniko na gawa sa papel. Ang opisina ng Gazette ay may kalansay sa bintana na nagbabasa ng pahayagan. May isang tao, na pinaghihinalaan ko si Olivia, ang nagniting ng kahel na sumbrero para sa gripo ng bumbero sa labas ng Yarn Tales.</w:t>
       </w:r>
     </w:p>
     <w:p/>
@@ -191,7 +191,7 @@
     <w:p/>
     <w:p>
       <w:r>
-        <w:t>Ang Winter Wonderland Inn ay nakatayo kung saan lumuluwag ang Evergreen Avenue patungo sa liwasan, isang matangkad at may bubong na bahay na pininturahan ng malambot na abuhing-berde ng langit sa taglamig, na may beranda na bumabalot sa dalawang panig nito parang bisig na inihagis sa mga balikat ng isang kaibigan. Para itong doon tumubo sa halip na itinayo lamang. Nagbitay si Fiona ng korona ng bulaklak sa pintuan sa harapan, at huminto ako sa ibaba ng mga baitang upang hangaan ito, tulad ng ginagawa ko sa tuwing dumadaan ako. Isa itong matabang bilog ng luntiang halaman, makapal at madilim, na nilipitan ng malawak na gintong laso at nilagyan ng mga pinecone na siya mismo ang naglagay ng ginto, na may iisang usbong ng mapait-tamis para sa kahel na kulay ng panahon.</w:t>
+        <w:t>Ang Winter Wonderland Inn ay nakatayo kung saan lumuluwag ang Evergreen Avenue patungo sa liwasan, isang matangkad at may bubong na bahay na pininturahan ng malambot na abuhing-berde ng langit sa taglamig, na may beranda na bumabalot sa dalawang panig nito parang bisig na inihagis sa mga balikat ng isang kaibigan. Para itong doon tumubo sa halip na itinayo lamang. Nagsabit si Fiona ng korona ng bulaklak sa pintuan sa harapan, at huminto ako sa ibaba ng mga baitang upang hangaan ito, tulad ng ginagawa ko sa tuwing dumadaan ako. Isa itong matabang bilog ng luntiang halaman, makapal at madilim, na nilipitan ng malawak na gintong laso at nilagyan ng mga pinecone na siya mismo ang naglagay ng ginto, na may iisang usbong ng mapait-tamis para sa kahel na kulay ng panahon.</w:t>
       </w:r>
     </w:p>
     <w:p/>
@@ -215,7 +215,7 @@
     <w:p/>
     <w:p>
       <w:r>
-        <w:t>Ang lobby ay mainit sa mabuti at malalim na init ng apoy na patuloy na naglalagablab mula pa bago mag-umaga. Umamoy ito ng kape at usok ng kahoy na nakapatong sa mas lumang amoy ng mismong bahay—waks ng bubuyog at lumang kahoy. Ang mga bisita ay nakaupo sa mga mabababang silya, isang mag-asawa sa tabi ng bintana na may nakabukang mapa sa pagitan nila, isang matandang babae sa tabi ng apoy na may dalang paperback, at ang silid ay may maginhawang bulong ng isang lugar kung saan komportable ang mga tao. May bagong amoy sa ilalim ng lahat ng iyon ngayong umaga, gayunpaman, matalim at medyo metaliko, na hindi ko matukoy sa una. Nang lumibot ako sa paligid, naintindihan ko iyon. Ang mga gawa sa bakal ni Sam Patel ay naroroon sa bawat paglingon ko. Ginawa niya ang mga lalagyan ng lampara sa kahabaan ng mga pader, ang matangkad na harang ng apoy sa tsiminea at isang hilera ng mga itim na bituin na bakal sa ibabaw ng mantel para sa pagdiriwang, at ang buong silid sa unahan ay nagkaroon ng banayad at malinis na linamnam ng pugon, na humalo sa hangin tulad ng amoy ng tinapay sa isang kusina.</w:t>
+        <w:t>Ang lobby ay mainit sa mabuti at malalim na init ng apoy na patuloy na naglalagablab mula pa bago mag-umaga. Umamoy ito ng kape at usok ng kahoy na nakapatong sa mas lumang amoy ng mismong bahay—waks ng bubuyog at lumang kahoy. Ang mga bisita ay nakaupo sa mga mabababang silya, isang mag-asawa sa tabi ng bintana na may nakabukang mapa sa pagitan nila, isang matandang babae sa tabi ng apoy na may dalang paperback, at ang silid ay may maginhawang bulong ng isang lugar kung saan komportable ang mga tao. May bagong amoy sa ilalim ng lahat ng iyon ngayong umaga, gayunpaman, matalim at medyo metaliko, na hindi ko matukoy sa una. Nang luminga ako sa paligid, naintindihan ko iyon. Ang mga gawa sa bakal ni Sam Patel ay naroroon sa bawat paglingon ko. Ginawa niya ang mga lalagyan ng lampara sa kahabaan ng mga pader, ang matangkad na harang ng apoy sa tsiminea at isang hilera ng mga itim na bituin na bakal sa ibabaw ng mantel para sa pagdiriwang, at ang buong silid sa unahan ay nagkaroon ng banayad at malinis na linamnam ng pugon, na humalo sa hangin tulad ng amoy ng tinapay sa isang kusina.</w:t>
       </w:r>
     </w:p>
     <w:p/>
@@ -257,7 +257,7 @@
     <w:p/>
     <w:p>
       <w:r>
-        <w:t>Bumukas ang pintuan sa harap dahil sa isang bugso ng lamig na nagpayanig sa apoy, at may pumasok na mag-asawa. Lahat tungkol kay Fiona ay nagbago nang sabay-sabay. Tumuwid siya. Inilagay niya ang basket sa mesa. Ang ngiting nahanap niya para sa mga bagong dating ay totoo, o malapit na totoo na tanging ang isang tao lamang na malapit na nagmamatyag ang makakakita sa pagsisikap doon.</w:t>
+        <w:t>Bumukas ang pintuan sa harap kasabay ng isang bugso ng lamig na nagpayanig sa apoy, at may pumasok na mag-asawa. Lahat tungkol kay Fiona ay nagbago nang sabay-sabay. Tumuwid siya. Inilagay niya ang basket sa mesa. Ang ngiting nahanap niya para sa mga bagong dating ay totoo, o malapit na totoo na tanging ang isang tao lamang na malapit na nagmamatyag ang makakakita sa pagsisikap doon.</w:t>
       </w:r>
     </w:p>
     <w:p/>
@@ -353,7 +353,7 @@
     <w:p/>
     <w:p>
       <w:r>
-        <w:t xml:space="preserve">“Magandang gawa, ang gawaing bakal na iyon.” Ang estranghero ay maayos, nagniningning ang mga mata at nasa gitna ng kanyang limampu, maayos ang pananamit sa medyo gusot na paraan ng isang taong naglalakbay. May dala siyang maliit na kuwaderno sa kanyang kamay na hindi niya tinangkang itago. Tumango siya kay Sam. “Lokal na panday? Lagi mong masasabi kung lokal. May kumpiyansa rito. At ang bahay na ito.” Lumingon siya, hindi nagmamadali, upang damhin ang lobby, ang kurbadang hagdan, ang lumang plaster medalyon sa gitna ng kisame. “Ngayon ito ay isang bahay na may kasaysayan. Negosyo ng pamilya, hula ko. Mga henerasyon nito.”</w:t>
+        <w:t xml:space="preserve">“Magandang gawa, ang gawaing bakal na iyon.” Ang estranghero ay maayos, nagniningning ang mga mata at nasa gitna ng kanyang limampu, maayos ang pananamit sa medyo gusot na paraan ng isang taong naglalakbay. May dala siyang maliit na kuwaderno sa kanyang kamay na hindi niya tinangkang itago. Tumango siya kay Sam. “Lokal na panday? Lagi mong masasabi kung lokal. May kumpiyansa rito. At ang bahay na ito.” Lumingon siya, hindi nagmamadali, upang damhin ang lobby, ang kurbadang hagdan, ang lumang plaster medalyon sa gitna ng kisame. “Ito talaga ang bahay na may kasaysayan. Negosyo ng pamilya, hula ko. Mga henerasyon nito.”</w:t>
       </w:r>
     </w:p>
     <w:p/>
@@ -365,7 +365,7 @@
     <w:p/>
     <w:p>
       <w:r>
-        <w:t xml:space="preserve">“Ang kasaysayan ang interesado sa akin. Laging ganoon.” Sinabi niya ito kay Fiona, ngunit ang kanyang mga mata ay lumingon sa akin, at uminit, at iniabot niya ang kanyang kamay. “Patawarin ninyo ako. Neil Carter.”</w:t>
+        <w:t xml:space="preserve">“Sa mga kasaysayan talaga ako interesado. Laging ganoon.” Sinabi niya ito kay Fiona, ngunit ang kanyang mga mata ay lumingon sa akin, at uminit, at iniabot niya ang kanyang kamay. “Patawarin ninyo ako. Neil Carter.”</w:t>
       </w:r>
     </w:p>
     <w:p/>
@@ -377,7 +377,7 @@
     <w:p/>
     <w:p>
       <w:r>
-        <w:t xml:space="preserve">“Claus.” Ngumiti siya, at ito ay isang magandang ngiti, madali at sinanay, ngunit halos wala akong tiwala roon, kasing-liit ng tsansang maihagis ko ang harang ng apoy. “Kung gayon kayo ang sikat na Ginang Claus. Napakagandang tunay. Narinig ko, siyempre, may naririnig ang isa, ngunit hindi ko lubos na pinaniwalaan hanggang ngayon.” Sumandal siya nang kaunti, nagtitiwala. “Sabihin ninyo sa akin. Ang mga lumang pamilya dito, ang mga Blackburn at ang iba pa, narito pa ba ang kanilang mga gamit sa bayan? Mga pamana, muwebles, alahas, ganoong uri ng bagay? Naghahanap ako ng isang piraso, nangyari pa. Isang brotse.”</w:t>
+        <w:t xml:space="preserve">“Claus.” Ngumiti siya, at ito ay isang magandang ngiti, madali at sinanay, ngunit halos wala akong tiwala roon, kasing-liit ng tsansang maihagis ko ang harang ng apoy. “Kung gayon kayo ang sikat na Ginang Claus. Napakaganda talaga. Narinig ko, siyempre, may naririnig ang isa, ngunit hindi ko lubos na pinaniwalaan hanggang ngayon.” Sumandal siya nang kaunti, nagtitiwala. “Sabihin ninyo sa akin. Ang mga lumang pamilya dito, ang mga Blackburn at ang iba pa, narito pa ba ang kanilang mga gamit sa bayan? Mga pamana, muwebles, alahas, ganoong uri ng bagay? Sa katunayan, may hinahanap akong isang piraso. Isang brotse.”</w:t>
       </w:r>
     </w:p>
     <w:p/>
@@ -649,7 +649,7 @@
     <w:p/>
     <w:p>
       <w:r>
-        <w:t xml:space="preserve">“Alam ko kung ano ito.” Umupo siya noon, nang sabay-sabay, bumagsak sa silya sa tapat ko na parang pinutol ang kaniyang mga tali. “Tatlong daang beses ko na itong binasa. Alam na alam ko kung ano ito.” Idiniin niya ang kaniyang mga buko sa kaniyang bibig nang ilang sandali, pinapakalma ang sarili. “Tingnan mo ang litrato. Doon mo maiintindihan ang natitira.”</w:t>
+        <w:t xml:space="preserve">“Alam ko kung ano ito.” Umupo siya noon, bigla, bumagsak sa silya sa tapat ko na parang pinutol ang kaniyang mga tali. “Tatlong daang beses ko na itong binasa. Alam na alam ko kung ano ito.” Idiniin niya ang kaniyang mga buko sa kaniyang bibig nang ilang sandali, pinapakalma ang sarili. “Tingnan mo ang litrato. Doon mo maiintindihan ang natitira.”</w:t>
       </w:r>
     </w:p>
     <w:p/>
@@ -667,7 +667,7 @@
     <w:p/>
     <w:p>
       <w:r>
-        <w:t xml:space="preserve">“Hindi.” Nabitin ang boses ni Fiona. “Hindi, isang Blackburn iyan. Isa sa mga lumang Blackburn, noong panahong nasa kanila ang lahat ng pera sa lalawigan. Hindi ko man lang alam ang pangalan niya.” Hinawakan niya ang kayumangging gilid ng litrato. “Itinago ito ni Constance sa lahat ng mga taong iyon. Sa palagay ko ay ang brotse ang hindi niya binitawan, hindi ang babae. Ngunit ang brotse na suot niya.” Idiniin niya ang kaniyang kamay nang patag sa kaniyang dibdib, na para bang masakit iyon sa kaniya doon. “Amin ang brotse na iyon, Jessica. Iyon ang ginagamit nila laban sa akin. Ang brotseng iyon.”</w:t>
+        <w:t xml:space="preserve">“Hindi.” Nabitin ang boses ni Fiona. “Hindi, isang Blackburn iyan. Isa sa mga lumang Blackburn, noong panahong nasa kanila ang lahat ng pera sa kondado. Hindi ko man lang alam ang pangalan niya.” Hinawakan niya ang kayumangging gilid ng litrato. “Itinago ito ni Constance sa lahat ng mga taong iyon. Sa palagay ko ay ang brotse ang hindi niya binitawan, hindi ang babae. Ngunit ang brotse na suot niya.” Idiniin niya ang kaniyang kamay nang patag sa kaniyang dibdib, na para bang masakit iyon sa kaniya doon. “Amin ang brotse na iyon, Jessica. Iyon ang ginagamit nila laban sa akin. Ang brotseng iyon.”</w:t>
       </w:r>
     </w:p>
     <w:p/>
@@ -709,7 +709,7 @@
     <w:p/>
     <w:p>
       <w:r>
-        <w:t xml:space="preserve">“Mga taon na.” Pinunasan niya ang kaniyang mga mata gamit ang likod ng kaniyang kamay, isang kilos ng bata. “Natagpuan ko ito pagkatapos pumanaw ng aking ina. May isang baul sa atik, isang lumang baul, nakakandado, at ang susi ay nasa mga gamit ng aking ina na may kasamang tag sa sulat-kamay niya na nagsasabing </w:t>
+        <w:t xml:space="preserve">“Ilang taon na.” Pinunasan niya ang kaniyang mga mata gamit ang likod ng kaniyang kamay, isang kilos ng bata. “Natagpuan ko ito pagkatapos pumanaw ng aking ina. May isang baul sa atik, isang lumang baul, nakakandado, at ang susi ay nasa mga gamit ng aking ina na may kasamang tag sa sulat-kamay niya na nagsasabing </w:t>
       </w:r>
       <w:r>
         <w:rPr>
@@ -718,7 +718,7 @@
         <w:t xml:space="preserve">huwag iwala</w:t>
       </w:r>
       <w:r>
-        <w:t xml:space="preserve">. Kaya siyempre binuksan ko ito.” Isang maliit at basag na tawa. “Mga liham. Isang resibo ng sanglaan, ang totoo, mula sa tindahan sa Ridgeline, kasama ang petsa at ang halaga. Ilan pang mga bagay. Ang lahat ng ito ay nakatupi nang maliit at isiniksik sa mga sulok, tulad ng isang bagay na hindi mo kayang itapon at hindi mo rin kayang tingnan. Alam ng aking ina. Alam ng kaniyang ina. At ngayon alam ko na. At ni isa sa amin ay hindi kailanman nagsabi sa kahit kanino.” Tumingala siya sa akin, at ang kaniyang mga mata ay namumula. “Kanino ko sasabihin? Paano mo sasabihin sa sinuman ang isang bagay na tulad nito? Paano nila ako titignan, ang inn, kung nalaman nila?”</w:t>
+        <w:t xml:space="preserve">. Kaya siyempre binuksan ko ito.” Isang maliit at basag na tawa. “Mga liham. Isang resibo ng sanglaan, ang tunay na resibo, mula sa tindahan sa Ridgeline, kasama ang petsa at ang halaga. Ilan pang mga bagay. Ang lahat ng ito ay nakatupi nang maliit at isiniksik sa mga sulok, tulad ng isang bagay na hindi mo kayang itapon at hindi mo rin kayang tingnan. Alam ng aking ina. Alam ng kaniyang ina. At ngayon alam ko na. At ni isa sa amin ay hindi kailanman nagsabi sa kahit kanino.” Tumingala siya sa akin, at ang kaniyang mga mata ay namumula. “Kanino ko sasabihin? Paano mo sasabihin sa sinuman ang isang bagay na tulad nito? Paano nila ako titignan, ang inn, kung nalaman nila?”</w:t>
       </w:r>
     </w:p>
     <w:p/>
@@ -760,7 +760,7 @@
     <w:p/>
     <w:p>
       <w:r>
-        <w:t xml:space="preserve">“Kung gayon ay isipin mo sandali kasama ko,” sabi ko, “dahil mas mahalaga ito kaysa sa anupaman. Sinuman ang sumulat ng notang ito ay alam kung ano ang nasa loob ng nakakandadong baul na iyon. At mayroon lamang dalawang paraan kung paano nalaman ng isang tao ang nasa loob ng isang nakakandadong baul na ikaw lamang ang nagbukas. Maaaring sa kung anong paraan ay nakapasok sila sa iyong baul, na sinabi mo sa akin na imposible.” Itinaas ko ang isang daliri. “O dumating sila sa parehong sikreto mula sa kabilang panig. Ang panig ng mga Blackburn. Dahil ang mga Blackburn ay nawalan ng brotse noong 1924, hindi ba. Ang isang pamilyang tulad nito, isinulat nila iyon. Isang liham, isang talaan ng kabahayan, isang sulat sa taong may hawak ng seguro, isang bagay. Ang kanilang bersyon ng kwento ay umiiral sa isang lugar, hiwalay sa bersyon mo.”</w:t>
+        <w:t xml:space="preserve">“Kung gayon ay isipin mo sandali kasama ko,” sabi ko, “dahil mas mahalaga ito kaysa sa anupaman. Sinuman ang sumulat ng notang ito ay alam kung ano ang nasa loob ng nakakandadong baul na iyon. At mayroon lamang dalawang paraan kung paano nalaman ng isang tao ang nasa loob ng isang nakakandadong baul na ikaw lamang ang nagbukas. Maaaring sa kung anong paraan ay nakapasok sila sa iyong baul, na sinabi mo sa akin na imposible.” Itinaas ko ang isang daliri. “O dumating sila sa parehong sikreto mula sa kabilang panig. Ang panig ng mga Blackburn. Dahil ang mga Blackburn ay nawalan ng brotse noong 1924, hindi ba. Ang isang pamilyang tulad niyon, tiyak na isinulat nila iyon. Isang liham, isang talaan ng kabahayan, isang sulat sa taong may hawak ng seguro, isang bagay. Ang kanilang bersyon ng kwento ay umiiral sa isang lugar, hiwalay sa bersyon mo.”</w:t>
       </w:r>
     </w:p>
     <w:p/>
@@ -772,7 +772,7 @@
     <w:p/>
     <w:p>
       <w:r>
-        <w:t xml:space="preserve">“Saan napupunta ang lumang papel ng bayang ito, Fiona? Sa huli? Kapag ang mga pamilyang nagmamay-ari nito ay wala na o ayaw nang gambalain ito?”</w:t>
+        <w:t xml:space="preserve">“Saan napupunta ang lumang papel ng bayang ito, Fiona? Sa huli? Kapag ang mga pamilyang nagmamay-ari nito ay wala na o ayaw nang makasagabal ito sa kanila?”</w:t>
       </w:r>
     </w:p>
     <w:p/>
@@ -832,7 +832,7 @@
     <w:p/>
     <w:p>
       <w:r>
-        <w:t>Na nag-iwan sa isa pa.</w:t>
+        <w:t>Kaya ang natitira ay ang isa pa.</w:t>
       </w:r>
     </w:p>
     <w:p/>
@@ -855,13 +855,13 @@
     <w:p/>
     <w:p>
       <w:r>
-        <w:t>May niluluto si Nick na sabaw pag-uwi ko, na siyang karaniwan niyang ginagawa tuwing nababalisa ang mundo. Ang ibang lalaki ay naglalakad-lakad nang pabalik-balik, nagpapakintab ng mga bagay, o nananahimik at pumutol ng kahoy. Ang asawa ko ay nagluluto ng sabaw. Sabi niya, mas nagiging maliit tingnan ang problema kapag puno ang mangkok, at sa loob ng ilang dantaon naming pagsasama ay hindi ko pa siya nakitang nagkamali tungkol doon.</w:t>
-      </w:r>
-    </w:p>
-    <w:p/>
-    <w:p>
-      <w:r>
-        <w:t>Nababasa ni Nick ang isip ko kahit nasa kabilang dulo pa ako ng silid. Pumasok ako habang ipinapagpag ang lamig mula sa aking mga bota, at isang tingin lang niya sa mukha ko ay hindi na siya nagtanong kahit minsan. Nilagyan niya ng sabaw na may barley, mga karot, at ang huling mga leek noong taglagas ang dalawang mangkok, inilagay ang mga ito sa mesa sa kusina, at hinila ang upuan ko. Hinintay niya muna akong makatatlong sandok bago man lang siya nagtaas ng kilay.</w:t>
+        <w:t>May niluluto si Nick na sabaw pag-uwi ko, na siyang karaniwan niyang ginagawa tuwing nababalisa ang mundo. Ang ibang lalaki ay naglalakad-lakad nang pabalik-balik, nagpapakintab ng mga bagay, o nananahimik at pumuputol ng kahoy. Ang asawa ko ay nagluluto ng sabaw. Sabi niya, mas nagiging maliit tingnan ang problema kapag puno ang mangkok, at sa loob ng ilang dantaon naming pagsasama ay hindi ko pa siya nakitang nagkamali tungkol doon.</w:t>
+      </w:r>
+    </w:p>
+    <w:p/>
+    <w:p>
+      <w:r>
+        <w:t>Nababasa ni Nick ang isip ko kahit nasa kabilang dulo pa ako ng silid. Pumasok ako habang ipinapagpag ang lamig mula sa aking mga bota, at isang tingin lang niya sa mukha ko ay hindi na siya nagtanong kahit isang tanong. Nilagyan niya ng sabaw na may barley, mga karot, at ang huling mga leek noong taglagas ang dalawang mangkok, inilagay ang mga ito sa mesa sa kusina, at hinila ang upuan ko. Hinintay niya muna akong makatatlong sandok bago man lang siya nagtaas ng kilay.</w:t>
       </w:r>
     </w:p>
     <w:p/>
@@ -915,7 +915,7 @@
     <w:p/>
     <w:p>
       <w:r>
-        <w:t xml:space="preserve">“Si Theo Hussein,” sabi niya, “ay isa sa pinakamabait na tao sa Frost Falls. Alam mo iyon nang kasing-ayos ng alam ko. Halos mapaiyak siya noong pinayagan namin siyang kunan ng litrato ang lumang paragos sa pagawaan para sa kanyang koleksiyon. Nagdadala siya ng kakaw sa oras ng pagbasa ng mga bata tuwing Sabado, ang masarap na kakaw, na may maliliit na marshmallow, mula sa sarili niyang bulsa, dahil sinabi niyang ang mga bata sa Frost Falls ay dapat lumaki na alam kung saan sila nagmula.” Tinitigan niya ako. “Hindi ko sinasabi iyon para makipagtalo sa iyo. Sinabi ko iyon dahil totoo, at dahil kakailanganin mong panatilihing totoo iyon sa buong proseso ng anuman ito, o gagawin mo ito nang hindi maayos.”</w:t>
+        <w:t xml:space="preserve">“Si Theo Hussein,” sabi niya, “ay isa sa pinakamabait na tao sa Frost Falls. Alam mo iyon gaya ng pagkaalam ko. Halos mapaiyak siya noong pinayagan namin siyang kunan ng litrato ang lumang paragos sa pagawaan para sa kanyang koleksiyon. Nagdadala siya ng kakaw sa oras ng pagbasa ng mga bata tuwing Sabado, ang masarap na kakaw, na may maliliit na marshmallow, mula sa sarili niyang bulsa, dahil sinabi niyang ang mga bata sa Frost Falls ay dapat lumaki na alam kung saan sila nagmula.” Tinitigan niya ako. “Hindi ko sinasabi iyon para makipagtalo sa iyo. Sinasabi ko iyon dahil totoo, at dahil kakailanganin mong panatilihing totoo iyon sa buong proseso ng anuman ito, o gagawin mo ito nang hindi maayos.”</w:t>
       </w:r>
     </w:p>
     <w:p/>
@@ -927,7 +927,7 @@
     <w:p/>
     <w:p>
       <w:r>
-        <w:t xml:space="preserve">“Kung gayon, heto ang isa pang bagay na totoo, at baka makatulong ito.” Sumandal siya nang paharap. “Maraming kamay ang humahawakan sa mga kahong iyon, Jess. Sali-salitang nagpupunta ang mga boluntaryo. Nagpapadala ng liham nang maaga ang mga mananaliksik at gumugugol ng isang linggo. Mga mag-aaral sa mga lakbay-aral. Kahit sino na pinapasok ni Theo sa pinto, at pinapasok ni Theo ang lahat sa pinto, dahil kay Theo ang isang interesadong estranghero ay ang pinakamagandang bagay na maaaring mangyari sa isang Martes. Kaya ang pag-alam na ang sikreto ay lumabas mula sa mga papel ng mga Blackburn ay hindi nagsasabi sa iyo na si Theo iyon. Sinasabi lamang nito sa iyo kung saan tatayo. Sinasabi nito sa iyo ang balon na pinag-igiban nito. Ngayon ay kailangan mong malaman kung kaninong timba ang bumaba doon.”</w:t>
+        <w:t xml:space="preserve">“Kung gayon, heto ang isa pang bagay na totoo, at baka makatulong ito.” Sumandal siya nang paharap. “Maraming kamay ang humahawak sa mga kahong iyon, Jess. Sali-salitang nagpupunta ang mga boluntaryo. Nagpapadala ng liham nang maaga ang mga mananaliksik at gumugugol ng isang linggo. Mga mag-aaral sa mga lakbay-aral. Kahit sino na pinapasok ni Theo sa pinto, at pinapasok ni Theo ang lahat sa pinto, dahil kay Theo ang isang interesadong estranghero ay ang pinakamagandang bagay na maaaring mangyari sa isang Martes. Kaya ang pag-alam na ang sikreto ay lumabas mula sa mga papel ng mga Blackburn ay hindi nagsasabi sa iyo na si Theo iyon. Sinasabi lamang nito sa iyo kung saan tatayo. Sinasabi nito sa iyo ang balon na pinag-igiban nito. Ngayon ay kailangan mong malaman kung kaninong timba ang bumaba doon.”</w:t>
       </w:r>
     </w:p>
     <w:p/>
@@ -939,7 +939,7 @@
     <w:p/>
     <w:p>
       <w:r>
-        <w:t xml:space="preserve">“Bukas ang eksibit,” sabi ko. “Ang tungkol sa arkibo. Lahat ng lumang dokumento ay ipapakita, ang mga lumang mapa at ang mga liham at ang mga litrato. Si Theo ay naninirahan na sa Historical Society para maihanda ito, sabi ni Martha ay ilang araw na siyang hindi umuuwi. At kalahati ng bayan ay nandoon para sa pagbubukas.”</w:t>
+        <w:t xml:space="preserve">“Bukas na magbubukas ang eksibit,” sabi ko. “Ang tungkol sa arkibo. Lahat ng lumang dokumento ay ipapakita, ang mga lumang mapa at ang mga liham at ang mga litrato. Si Theo ay naninirahan na sa Historical Society para maihanda ito, sabi ni Martha ay ilang araw na siyang hindi umuuwi. At kalahati ng bayan ay nandoon para sa pagbubukas.”</w:t>
       </w:r>
     </w:p>
     <w:p/>
@@ -1005,7 +1005,7 @@
     <w:p/>
     <w:p>
       <w:r>
-        <w:t>Nang gabing iyon, bago matulog, lumapit ako sa bintana, tulad ng lagi kong ginagawa, upang tingnan ang bayan na naghahanda sa pagtulog para sa gabi. Ang aming maliit na kubo ay medyo malayo sa iba, sa itaas ng daanan, kasama ang pastulan at ang madilim na anyo ng pagawaan sa likod nito, at pagkatapos ay ang bayan sa ibaba. Ang bayan ay may ilaw.</w:t>
+        <w:t>Nang gabing iyon, bago matulog, lumapit ako sa bintana, tulad ng lagi kong ginagawa, upang tingnan ang bayan na naghahanda sa pagtulog para sa gabi. Ang aming maliit na kubo ay medyo malayo sa iba, sa itaas ng daanan, kasama ang kulungan at ang madilim na anyo ng pagawaan sa likod nito, at pagkatapos ay ang bayan sa ibaba. Ang bayan ay may ilaw.</w:t>
       </w:r>
     </w:p>
     <w:p/>
@@ -1065,7 +1065,7 @@
     <w:p/>
     <w:p>
       <w:r>
-        <w:t xml:space="preserve">Tumahimik siya nang saglit, ang aming dalawang paghinga ay nagpapalabo sa malamig na salamin. “Ang lahat ay may kinalaman sa lahat, sa panahong ito ng taon,” sabi niya, na siyang sinabi ni Nick kapag ang tunay na sagot ay oo at hindi pa siya handang sabihin ito nang malakas. Inilibot niya ang kanyang mga braso sa akin mula sa likod. “Hindi ito makakasakit sa sinuman, Jess. Anuman ang ginagawa nito roon sa labas kasama ang mga ilaw. Hindi ito marunong manakit ng sinuman. Kailanman ay hindi. Naghahanap lamang ito ng isang bagay.”</w:t>
+        <w:t xml:space="preserve">Tumahimik siya nang saglit, ang aming dalawang paghinga ay nagpapalabo sa malamig na salamin. “Ang lahat ay may kinalaman sa lahat, sa panahong ito ng taon,” sabi niya, na siyang sinasabi ni Nick kapag ang tunay na sagot ay oo at hindi pa siya handang sabihin ito nang malakas. Inilibot niya ang kanyang mga braso sa akin mula sa likod. “Hindi ito makakasakit sa sinuman, Jess. Anuman ang ginagawa nito roon sa labas kasama ang mga ilaw. Hindi ito marunong manakit ng sinuman. Kailanman ay hindi. Naghahanap lamang ito ng isang bagay.”</w:t>
       </w:r>
     </w:p>
     <w:p/>
@@ -1089,7 +1089,7 @@
     <w:p/>
     <w:p>
       <w:r>
-        <w:t>Tumayo kami roon nang ilang sandali pa, pinapanood ang gintong bayan, at pagkatapos ay umakyat na kami sa itaas upang matulog. Nanatili akong gising nang mahabang sandali sa kadiliman, habang hawak ang dalawang bagay nang sabay. Sa isang dako sa ibaba ng Frost Falls, may isang taong tumayo sa gitna ng mga kahon ng mga Blackburn at nakahanap ng paraan upang isara ang isang kamay sa lalamunan ng isang mabuting babae kapalit ng kalahating milyong dolyar. At sa labas ng pastulan, nagtatayo ang aking asawa ng isang sorpresang hindi niya pinangalanan, habang ang mga ilaw ay naging ginto nang kusa at ang mahika na dinala namin ay naglakbay sa kadiliman upang maghanap ng lugar na mapapaglapagan.</w:t>
+        <w:t>Tumayo kami roon nang ilang sandali pa, pinapanood ang gintong bayan, at pagkatapos ay umakyat na kami sa itaas upang matulog. Nanatili akong gising nang mahabang sandali sa kadiliman, habang hawak ang dalawang bagay nang sabay. Sa isang dako sa ibaba ng Frost Falls, may isang taong tumayo sa gitna ng mga kahon ng mga Blackburn at nakahanap ng paraan upang isara ang isang kamay sa lalamunan ng isang mabuting babae kapalit ng kalahating milyong dolyar. At sa labas ng kulungan, nagtatayo ang aking asawa ng isang sorpresang hindi niya pinangalanan, habang ang mga ilaw ay naging ginto nang kusa at ang mahika na dinala namin ay naglakbay sa kadiliman upang maghanap ng lugar na mapapaglapagan.</w:t>
       </w:r>
     </w:p>
     <w:p/>
@@ -1105,7 +1105,7 @@
     </w:p>
     <w:p>
       <w:r>
-        <w:t xml:space="preserve">Ang Frost Falls Historical Society ay isang makitid na gusaling ladrilyo sa plasa, at sa umagang nagbukas ang eksibit ng mga rekord, mas maraming taong pumapasok at lumalabas doon kaysa sa nakita ko roon kailanman. Ang bangketa sa labas ay tila mabagal na ilog ng mga amerikana. May nagbitbit ng banderola sa ibabaw ng pinto, ginawa sa kamay, </w:t>
+        <w:t xml:space="preserve">Ang Frost Falls Historical Society ay isang makitid na gusaling ladrilyo sa plasa, at sa umagang nagbukas ang eksibit ng mga rekord, mas maraming taong pumapasok at lumalabas doon kaysa sa nakita ko roon kailanman. Ang bangketa sa labas ay tila mabagal na ilog ng mga amerikana. May nagsabit ng banderola sa ibabaw ng pinto, ginawa sa kamay, </w:t>
       </w:r>
       <w:r>
         <w:rPr>
@@ -1124,7 +1124,7 @@
     </w:p>
     <w:p>
       <w:r>
-        <w:t xml:space="preserve">Sa loob, ang bawat pader ay inilaan para sa eksibit. Ang mga pader na karaniwang may luma at kupas na mga mapa at talaan ng riles ng tren noong 1911 ay mayroon na ngayong mga nakabalangkas na liham, litrato, at naninilaw na kasulatan. Ang bawat isa ay may tatak sa maliit, malinis, at pahilis na sulat-kamay na nakilala ko bago ko pa man mabasa ang anuman, dahil nakita ko ito sa mga kard sa oras ng pagbasa ng mga bata at sa maliliit na karatula sa mga lalagyan ng museo. Ang sulat-kamay ni Theo. Lahat ay nilalagyan niya ng tatak. Nilagyan sana niya ng tatak ang katas ng mansanas kung pinayagan lang siya ng sinuman.</w:t>
+        <w:t xml:space="preserve">Sa loob, ang bawat pader ay inilaan para sa eksibit. Ang mga pader na karaniwang may luma at kupas na mga mapa at talaan ng oras ng tren noong 1911 ay mayroon na ngayong mga nakabalangkas na liham, litrato, at naninilaw na titulo. Ang bawat isa ay may tatak sa maliit, malinis, at pahilis na sulat-kamay na nakilala ko bago ko pa man mabasa ang anuman, dahil nakita ko ito sa mga kard sa oras ng pagbasa ng mga bata at sa maliliit na karatula sa mga lalagyan ng museo. Ang sulat-kamay ni Theo. Lahat ay nilalagyan niya ng tatak. Nilagyan sana niya ng tatak ang katas ng mansanas kung pinayagan lang siya ng sinuman.</w:t>
       </w:r>
     </w:p>
     <w:p>
@@ -1134,7 +1134,7 @@
     </w:p>
     <w:p>
       <w:r>
-        <w:t>May ngiti siya para sa bawat taong pumapasok, totoo at nagniningning, minsan ay sabay na ginagamit ang dalawang kamay, at sinasabi niya sa isang matangkad na lalaking naka-parka ang tungkol sa mga kasulatan kaya naman tumatango ang lalaki habang dahan-dahang lumalayo. Ngunit sa pagitan ng bawat pagbati, sa kalahating segundo na akala niya ay walang nakatingin, ang ngiti ay nawala sa kanyang mukha na parang bagay na napakabigat dalhin, at ang nasa ilalim nito ang nagpatigil sa akin sa aking kinatatayuan. Ang kanyang balat ay may kulay-abo na bahid. May mga lila na mantsa sa ilalim ng kanyang mata na kasinglalim ng mga pasa. Ang kanyang kurbata ay nakatali nang lihis nang sangkapat na ikot, at ang kanyang salamin ay may mantsa ng hinlalaki sa isang lente na wala na siyang natitirang atensyon para mapansin, lalo na para linisin. Inayos niya ang kanyang kurbata habang pinapanood ko siya. Inayos niya itong muli makalipas ang isang sandali, sa parehong kilos, na parang nakalimutan niyang ginawa niya lang ito kani-kaina lang.</w:t>
+        <w:t>May ngiti siya para sa bawat taong pumapasok, totoo at nagniningning, minsan ay sabay na ginagamit ang dalawang kamay, at sinasabi niya sa isang matangkad na lalaking naka-parka ang tungkol sa mga titulo kaya naman tumatango ang lalaki habang dahan-dahang lumalayo. Ngunit sa pagitan ng bawat pagbati, sa kalahating segundo na akala niya ay walang nakatingin, ang ngiti ay nawala sa kanyang mukha na parang bagay na napakabigat dalhin, at ang nasa ilalim nito ang nagpatigil sa akin sa aking kinatatayuan. Ang kanyang balat ay may kulay-abo na bahid. May mga lila na mantsa sa ilalim ng kanyang mata na kasinglalim ng mga pasa. Ang kanyang kurbata ay nakatali nang lihis nang sangkapat na ikot, at ang kanyang salamin ay may mantsa ng hinlalaki sa isang lente na wala na siyang natitirang atensyon para mapansin, lalo na para linisin. Inayos niya ang kanyang kurbata habang pinapanood ko siya. Inayos niya itong muli makalipas ang isang sandali, sa parehong kilos, na parang nakalimutan niyang ginawa niya ito kani-kanina lang.</w:t>
       </w:r>
     </w:p>
     <w:p>
@@ -1144,7 +1144,7 @@
     </w:p>
     <w:p>
       <w:r>
-        <w:t xml:space="preserve">“Jessica! Dumating ka.” Lumapit siya sa akin at hinawakan ang pareho kong kamay gamit ang kanyang dalawang kamay. Malamig ang mga ito, at naramdaman ko ang bahagyang panginginig ng mga ito. “Hindi ba't kahanga-hanga? Tingnan mo ito. Dalawang daang taon ng bayang ito, nasa ilalim ng iisang bubong sa wakas. Patuloy akong naglalakad dito at hindi makapaniwalang natapos ko ito.” Lumapit siya nang bahagya, binabaan ang kanyang boses na parang nagtatapat ng isang malaking sikreto. “Pumasok ka, pumasok ka. Sasabihin ko ang ilang salita kapag nagtipon na ang lahat, at pagkatapos ay kailangan mong tingnan ang lahat ng ito. Bawat piraso. Sinasadya ko iyon. Gusto ko na may magbasa talaga sa mga tatak. Ang mga tao ay lumalampas lamang sa mga tatak.”</w:t>
+        <w:t xml:space="preserve">“Jessica! Dumating ka.” Lumapit siya sa akin at hinawakan ang pareho kong kamay gamit ang kanyang dalawang kamay. Malamig ang mga ito, at naramdaman ko ang bahagyang panginginig ng mga ito. “Hindi ba't kahanga-hanga? Tingnan mo ito. Dalawang daang taon ng bayang ito, nasa ilalim ng iisang bubong sa wakas. Patuloy akong naglalakad dito at hindi makapaniwalang natapos ko ito.” Lumapit siya nang bahagya, binabaan ang kanyang boses na parang nagtatapat ng isang malaking sikreto. “Pumasok ka, pumasok ka. Sasabihin ko ang ilang salita kapag nagtipon na ang lahat, at pagkatapos ay kailangan mong tingnan ang lahat ng ito. Bawat piraso. Seryoso ako. Gusto ko na may magbasa talaga sa mga tatak. Ang mga tao ay lumalampas lamang sa mga tatak.”</w:t>
       </w:r>
     </w:p>
     <w:p>
@@ -1184,18 +1184,18 @@
     </w:p>
     <w:p>
       <w:r>
-        <w:t xml:space="preserve">Lumapit ako kay Neil, sapagkat si Neil ay lumapit sa mismong bagay na nais kong makita. Ang eksibit ay isang mahabang lalagyang salamin na may kalahating dosenang lumang liham na nakabuka sa loob nito, naging kayumanggi ang tinta, nanilaw ang papel sa mga gilid, at isang kard sa kamay ni Theo na nagsasabing: </w:t>
+        <w:t xml:space="preserve">Lumapit ako kay Neil, sapagkat si Neil ay lumapit sa mismong bagay na nais kong makita. Ang eksibit ay isang mahabang lalagyang salamin na may kalahating dosenang lumang liham na nakabuka sa loob nito, naging kayumanggi ang tinta, nanilaw ang papel sa mga gilid, at isang kard sa sulat-kamay ni Theo na nagsasabing: </w:t>
       </w:r>
       <w:r>
         <w:rPr>
           <w:i/>
         </w:rPr>
-        <w:t>Mula sa mga Liham ng Pamilyang Blackburn, 1910–1930. Ipinahiram sa mga mamamayan ng Frost Falls.</w:t>
-      </w:r>
-    </w:p>
-    <w:p>
-      <w:r>
-        <w:t xml:space="preserve">“Ginang Claus.” Hindi tumingin si Neil mula sa salamin. “Kahanga-hanga, ang lahat ng ito. Ang inyong Ginoong Hussein ay gumawa ng tunay na paglilingkod sa bayan, alam man ito ng bayan o hindi. Tingnan ninyo ito.” Itinuro niya ang lalagyan, ang isang daliri ay hindi lubos na dumadampi sa salamin. “Isang buong nagpapatuloy na sulatan tungkol sa kabahayan. Sino ang hinire, sino ang pinaalis, ano ang binili, ano ang ibinenta.” Lumingon noon ang kanyang ulo, at dumating ang ngiti. “Ano ang nawala.”</w:t>
+        <w:t>Mula sa mga Papeles ng Pamilyang Blackburn, 1910–1930. Ipinahiram sa mga mamamayan ng Frost Falls.</w:t>
+      </w:r>
+    </w:p>
+    <w:p>
+      <w:r>
+        <w:t xml:space="preserve">“Ginang Claus.” Hindi tumingin si Neil mula sa salamin. “Kahanga-hanga, ang lahat ng ito. Ang inyong Ginoong Hussein ay gumawa ng tunay na paglilingkod sa bayan, alam man ito ng bayan o hindi. Tingnan ninyo ito.” Itinuro niya ang lalagyan, ang isang daliri ay hindi lubos na dumadampi sa salamin. “Isang buong nagpapatuloy na sulatan tungkol sa kabahayan. Sino ang tinanggap sa trabaho, sino ang pinaalis, ano ang binili, ano ang ibinenta.” Lumingon noon ang kanyang ulo, at dumating ang ngiti. “Ano ang nawala.”</w:t>
       </w:r>
     </w:p>
     <w:p>
@@ -1205,7 +1205,7 @@
     </w:p>
     <w:p>
       <w:r>
-        <w:t xml:space="preserve">“Palagi kong hinahabol ang aking brotse. Trabaho iyon.” Tumayo siya nang tuwid at inipit ang kuwaderno sa ilalim ng kanyang braso. “May lumapit sa akin sa mesa ng katas ng mansanas ngayon at sinabi sa akin na ang mga Blackburn ay dating nagmamay-ari ng kalahati ng Maple Street. Alam ba ninyo iyon? Gustong-gusto ng mga tao na sabihin sa iyo kung ano ang pag-aari ng mga mayamang pamilya. Hindi nila masabi sa iyo kung ano ang ginawa ng mga mayamang pamilya sa mga taong nagtrabaho para sa kanila. Ang bahaging iyon ay hindi nakakarating sa mga papeles ng pamilya.” Tumango siya sa salamin. “Nakakatawa, ano. Dalawampung taon ng mga liham at walang isa man sa kanila ang isinulat ng isang kasambahay.”</w:t>
+        <w:t xml:space="preserve">“Palagi kong hinahabol ang aking brotse. Trabaho iyon.” Tumayo siya nang tuwid at inipit ang kuwaderno sa ilalim ng kanyang braso. “May lumapit sa akin sa mesa ng katas ng mansanas ngayon at sinabi sa akin na ang mga Blackburn ay dating nagmamay-ari ng kalahati ng Maple Street. Alam ba ninyo iyon? Gustong-gusto ng mga tao na sabihin sa iyo kung ano ang pag-aari ng mga mayamang pamilya. Hindi nila masabi sa iyo kung ano ang ginawa ng mga mayamang pamilya sa mga taong nagtrabaho para sa kanila. Ang bahaging iyon ay hindi nakakarating sa mga papeles ng pamilya.” Tumango siya sa salamin. “Nakapagtataka, ano. Dalawampung taon ng mga liham at walang isa man sa kanila ang isinulat ng isang kasambahay.”</w:t>
       </w:r>
     </w:p>
     <w:p>
@@ -1215,7 +1215,7 @@
     </w:p>
     <w:p>
       <w:r>
-        <w:t xml:space="preserve">Pagkatapos ay kinalabit ni Theo ang isang kutsara sa isang baso sa harap ng silid. Ang karamihan ay lumingon at tumahimik, at sinabi niya ang kanyang ilang salita, na hindi naman kakaunti. Si Theo ay hindi kailanman nakapagsalita nang maikli tungkol sa nakaraan. Pinasalamatan niya ang kanyang mga boluntaryo sa pamamagitan ng pangalan, silang lahat, kabilang ang isang Ginang Pelletier na lumilitaw na nag-uri ng mga litrato nang tatlong magkakasunod na katapusan ng linggo at namula nang husto nang mabanggit. Pinasalamatan niya ang bayan. Pinasalamatan niya, na may bahid ng luha sa boses, “ang bawat taong nagtago ng liham sa halip na itapon ito, dahil iyon lamang ang kasaysayan, sa huli, ang mga bagay na hindi matiis ng mga tao na itapon.”</w:t>
+        <w:t xml:space="preserve">Pagkatapos ay ikinalansing ni Theo ang isang kutsara sa isang baso sa harap ng silid. Ang karamihan ay lumingon at tumahimik, at sinabi niya ang kanyang ilang salita, na hindi naman kakaunti. Si Theo ay hindi kailanman nakapagsalita nang maikli tungkol sa nakaraan. Pinasalamatan niya ang kanyang mga boluntaryo sa pamamagitan ng pangalan, silang lahat, kabilang ang isang Ginang Pelletier na lumilitaw na nag-uri ng mga litrato nang tatlong magkakasunod na katapusan ng linggo at namula nang husto nang mabanggit. Pinasalamatan niya ang bayan. Pinasalamatan niya, na may bahid ng luha sa boses, “ang bawat taong nagtago ng liham sa halip na itapon ito, dahil iyon lamang ang kasaysayan, sa huli, ang mga bagay na hindi matiis ng mga tao na itapon.”</w:t>
       </w:r>
     </w:p>
     <w:p>
@@ -1225,7 +1225,7 @@
     </w:p>
     <w:p>
       <w:r>
-        <w:t xml:space="preserve">“Aaminin ko ang isang kalungkutan.” Hinaplos niya ang likod ng kanyang leeg, nagsisisi, at ang mga tao ay sumandal nang may pagmamahal. Mahal ng lahat si Theo kapag ganito siya. “Hindi pa kami lubusang kumpleto. Ang ilan sa mga liham ng Blackburn, ilan sa pinakakawili-wili, ang mga pinakagusto kong makita ninyong lahat, ay naligaw sa pag-uuri. Naligaw lang, sigurado ako, hindi nawala, ang mga bagay na tulad nito ay palaging lumilitaw sa araw pagkatapos mong itigil ang paghanap. Ngunit wala sila sa lalagyan, at gusto ko talagang naroon sila, at natatakot akong ang kasalanan ay sa aking sariling mahinang pamamahala.” Inilatag niya ang kanyang mga kamay, at ang kanyang ngiti ay naging mapanlait sa sarili. “Isang istoryador na hindi mahanap ang kanyang sariling mga liham. Naku. Huwag ninyong sabihin sa komite ng grant.”</w:t>
+        <w:t xml:space="preserve">“Aaminin ko ang isang kalungkutan.” Hinaplos niya ang likod ng kanyang leeg, nagsisisi, at ang mga tao ay sumandal nang may pagmamahal. Mahal ng lahat si Theo kapag ganito siya. “Hindi pa kami lubusang kumpleto. Ang ilan sa mga liham ng Blackburn, ilan sa pinakakawili-wili, ang mga pinakagusto kong makita ninyong lahat, ay naligaw sa pag-uuri. Nailagay lang sa maling lugar, sigurado ako, hindi nawala, ang mga bagay na tulad nito ay palaging lumilitaw sa araw pagkatapos mong itigil ang paghanap. Ngunit wala sila sa lalagyan, at gusto ko talagang naroon sila, at natatakot akong ang kasalanan ay sa aking sariling mahinang pamamahala.” Inilatag niya ang kanyang mga kamay, at ang kanyang ngiti ay naging mapanlait sa sarili. “Isang historyador na hindi mahanap ang kanyang sariling mga liham. Naku. Huwag ninyong sabihin sa komite ng grant.”</w:t>
       </w:r>
     </w:p>
     <w:p>
@@ -1245,7 +1245,7 @@
     </w:p>
     <w:p>
       <w:r>
-        <w:t xml:space="preserve">Nilibot ko ang silid pagkatapos noon, dahan-dahan. Hinangaan ko ang mga lumang kasulatan kasama si Dot, na tinawag ang buong bagay na “isang malaking kaguluhan sa koreo ng ibang tao” at nanatili pa rin ng isang oras. Hinayaan ko si Theo na ilibot ako sa tatlong lalagyang salamin, at pinagmasdan ko kung paano niya hinawakan ang mga ito, o sa halip ay hindi, ang kanyang mga daliri ay lumulutang sa itaas ng salamin sa ibabaw ng bawat isa tulad ng kamay na nakahawak sa likod ng natutulog na bata upang maramdaman itong huminga nang hindi ito ginigising. At sa buong panahong iyon ay binantayan ko ang silid.</w:t>
+        <w:t xml:space="preserve">Nilibot ko ang silid pagkatapos noon, dahan-dahan. Hinangaan ko ang mga lumang titulo kasama si Dot, na tinawag ang buong bagay na “isang malaking kaguluhan sa koreo ng ibang tao” at nanatili pa rin ng isang oras. Hinayaan ko si Theo na ilibot ako sa tatlong lalagyang salamin, at pinagmasdan ko kung paano niya hinawakan ang mga ito, o sa halip ay hindi, ang kanyang mga daliri ay lumulutang sa itaas ng salamin sa ibabaw ng bawat isa tulad ng kamay na nakaumang sa ibabaw ng likod ng natutulog na bata upang maramdaman itong huminga nang hindi ito ginigising. At sa buong panahong iyon ay binantayan ko ang silid.</w:t>
       </w:r>
     </w:p>
     <w:p>
@@ -1338,7 +1338,7 @@
     </w:p>
     <w:p>
       <w:r>
-        <w:t xml:space="preserve">“Hindi ito inilipat,” sabi ni Dot, nang hindi tumitingin sa kanyang ginagawa. “Ito ang huling katapusan ng linggo ng Oktubre, pareho noong bago ka pa ipanganak. Mabagal ka lang.”</w:t>
+        <w:t xml:space="preserve">“Hindi ito inilipat,” sabi ni Dot, nang hindi tumitingin sa kanyang ginagawa. “Ito ang huling katapusan ng linggo ng Oktubre, gaya na noon pang bago ka ipanganak. Mabagal ka lang.”</w:t>
       </w:r>
     </w:p>
     <w:p>
@@ -1368,7 +1368,7 @@
     </w:p>
     <w:p>
       <w:r>
-        <w:t>Kinuha ko ang aking ginagawa at hinayaan ang init at ang pag-click ng mga karayom na bumalot sa akin. Pagkalipas ng ilang sandali, lumipat ang usapan, tulad ng inaasahan ko, kay Theo.</w:t>
+        <w:t>Kinuha ko ang aking ginagawa at hinayaan ang init at ang tiktak ng mga karayom na bumalot sa akin. Pagkalipas ng ilang sandali, lumipat ang usapan, tulad ng inaasahan ko, kay Theo.</w:t>
       </w:r>
     </w:p>
     <w:p>
@@ -1403,12 +1403,12 @@
     </w:p>
     <w:p>
       <w:r>
-        <w:t xml:space="preserve">Gumawa ng tunog sa ilong si Dot. “Iniisip ni Alkalde Blackburn na ang kasaysayan ay bagay na nangyari sa ibang tao sa ibang lalawigan. Gugupit siya ng laso sa pista at makikipagkamay kay Theo para sa litrato. Hindi siya magbibigay ng kahit isang sentimo para mapanatili ang mga ilaw sa natitirang bahagi ng taon. Tingnan mo.”</w:t>
-      </w:r>
-    </w:p>
-    <w:p>
-      <w:r>
-        <w:t xml:space="preserve">Nagniting ako at nakinig. Tumimo sa akin ang kabuuan nito, malamig at malinaw, tahi-tahi. Narito ang isang lalaki na nagmahal sa isang bagay sa mundong ito nang higit pa sa kanyang pahinga o hapunan, at ang bagay na iyon ay namamatay sa kawalan ng pera. Pumunta siya sa bawat tapat na pinto na nakita niya at pinanood silang isara isa-isa sa kanyang mukha.</w:t>
+        <w:t xml:space="preserve">Gumawa ng tunog sa ilong si Dot. “Iniisip ni Alkalde Blackburn na ang kasaysayan ay bagay na nangyari sa ibang tao sa ibang kondado. Gugupit siya ng laso sa pista at makikipagkamay kay Theo para sa litrato. Hindi siya magbibigay ng kahit isang sentimo para mapanatili ang mga ilaw sa natitirang bahagi ng taon. Tingnan mo.”</w:t>
+      </w:r>
+    </w:p>
+    <w:p>
+      <w:r>
+        <w:t xml:space="preserve">Nagniting ako at nakinig. Tumimo sa akin ang kabuuan nito, malamig at malinaw, tahi-tahi. Narito ang isang lalaki na nagmamahal sa isang bagay sa mundong ito nang higit pa sa kanyang pahinga o hapunan, at ang bagay na iyon ay namamatay sa kawalan ng pera. Pumunta siya sa bawat tapat na pinto na nakita niya at pinanood silang isara isa-isa sa kanyang mukha.</w:t>
       </w:r>
     </w:p>
     <w:p>
@@ -1448,7 +1448,7 @@
     </w:p>
     <w:p>
       <w:r>
-        <w:t xml:space="preserve">Huminto ang mga karayom ni Claire. Tumingin siya. Sa isang iglap ay nawala ang mukha ng mamamahayag at may lumitaw na mas luma at mas pagod dito. “Hindi naglalabas ng pera ang mga malungkot na kuwento,” sabi niya nang tahimik. “Nakasulat na ako ng sandaan nito. Pinaparamdam lamang nito sa mga tao na may nagawa na sila sa pamamagitan ng pagkalungkot, at pagkatapos ay ibinabalik na nila ang pahina.” Pagkatapos ay iniling niya ito at bumalik ang kasiglahan. “Ngunit isusulat ko siya nang may kabaitan. Nararapat siya roon, anuman ang mangyari.”</w:t>
+        <w:t xml:space="preserve">Huminto ang mga karayom ni Claire. Tumingin siya. Sa isang iglap ay nawala ang mukha ng mamamahayag at may lumitaw na mas luma at mas pagod dito. “Hindi naglalabas ng pera ang mga malungkot na kuwento,” sabi niya nang tahimik. “Nakasulat na ako ng sandaan nito. Pinaparamdam lamang nito sa mga tao na may nagawa na sila sa pamamagitan ng pagkalungkot, at pagkatapos ay binubuklat na nila ang pahina.” Pagkatapos ay pinalis niya iyon at bumalik ang kasiglahan. “Ngunit isusulat ko siya nang may kabaitan. Nararapat siya roon, anuman ang mangyari.”</w:t>
       </w:r>
     </w:p>
     <w:p>
@@ -1483,7 +1483,7 @@
     </w:p>
     <w:p>
       <w:r>
-        <w:t xml:space="preserve">“Salamat,” sabi ko, at kinailangan ko munang lumingon at lumunok. “Tatandaan ko.”</w:t>
+        <w:t xml:space="preserve">“Salamat,” sabi ko, at kinailangan ko munang lumunok. “Tatandaan ko.”</w:t>
       </w:r>
     </w:p>
     <w:p>
@@ -1508,7 +1508,7 @@
     </w:p>
     <w:p>
       <w:r>
-        <w:t>Ngunit matagal na akong nabuhay, at ang pag-asa ay kailanman hindi nagbago sa kung ano ang totoo. Kaya hinawakan ko ang pagnanais na iyon sa isang kamay at ang malamig na aritmetika sa kabilang kamay. Sasabihin ko kay Nick kung ano ang sinabi ng bilog, at pananatilihing bukas ang aking kamao.</w:t>
+        <w:t>Ngunit matagal na akong nabuhay, at ang paghahangad ay kailanman hindi nagbago sa kung ano ang totoo. Kaya hinawakan ko ang pagnanais na iyon sa isang kamay at ang malamig na aritmetika sa kabilang kamay. Sasabihin ko kay Nick kung ano ang sinabi ng bilog, at pananatilihing bukas ang aking kamao.</w:t>
       </w:r>
     </w:p>
     <w:p>
@@ -1525,7 +1525,7 @@
     <w:p/>
     <w:p>
       <w:r>
-        <w:t xml:space="preserve">Nasa liwasan gaganapin ang pista, ang malawak na damuhan sa timog ng Evergreen na bumababa mula sa plasa, kasama ang bantayog ng digmaan malapit sa itaas at ang malaking puno ng elm sa dulo. Nagtipon ang buong bayan para gayakan ito. May mga mesang ilalabas at aayusin nang hilera, isang entablado na itatayo sa hilagang dulo, at parang isang libong maliit na kalabasa na aayusin sa paraang mistulang hindi pinag-isipan. Sa totoo lang, pagtutuunan pa ito ng komite ng pansin nang isang oras. Pumunta lamang ako para ihatid ang unang dosenang guwantes ng bilog sa komite ng pista, at wala pang siyamnapung segundo ng pagdating ko ay sinunggaban na ako ng isang lalaking hindi ko kilala ng isang kahon ng mga kalabasa para sa pie at sinabing, “Ilagay mo nga ang mga iyan sa harap ng entablado, maaari ba? Ingatan mo ang malambot.” Ganoon ang takbo ng mga bagay sa bayang ito, at hindi ko naman ito ikinasama ng loob. Walang mapag-iisipan habang may kargang isang kahon ng mga kalabasa sa aking mga bisig, at sakto iyon sa akin.</w:t>
+        <w:t xml:space="preserve">Nasa liwasan gaganapin ang pista, ang malawak na damuhan sa timog ng Evergreen na bumababa mula sa plasa, kasama ang bantayog ng digmaan malapit sa itaas at ang malaking puno ng elm sa dulo. Nagtipon ang buong bayan para gayakan ito. May mga mesang ilalabas at aayusin nang hilera, isang entablado na itatayo sa hilagang dulo, at parang isang libong maliit na kalabasa na aayusin sa paraang mistulang hindi pinag-isipan. Sa totoo lang, pagtutuunan pa ito ng komite ng pansin nang isang oras. Pumunta lamang ako para ihatid ang unang dosenang guwantes ng bilog sa komite ng pista, at wala pang siyamnapung segundo ng pagdating ko ay inabutan na ako ng isang lalaking hindi ko kilala ng isang kahon ng mga kalabasa para sa pie at sinabing, “Ilagay mo nga ang mga iyan sa harap ng entablado, maaari ba? Ingatan mo ang malambot.” Ganoon ang takbo ng mga bagay sa bayang ito, at hindi ko naman ito ikinasama ng loob. Walang mapag-iisipan habang may kargang isang kahon ng mga kalabasa sa aking mga bisig, at sakto iyon sa akin.</w:t>
       </w:r>
     </w:p>
     <w:p/>
@@ -1537,7 +1537,7 @@
     <w:p/>
     <w:p>
       <w:r>
-        <w:t>Lumingon ako. Nakabaon ang buong ulo ni Pip sa tastas na tuktok ng isang inukit na kalabasa na ginawang parol kani-kanina lang, inilalabas ang mamasa-masang mga buto at inihahagis sa damuhan taglay ang buong-pusong kaligayahan sa anumang ipinagbabawal. Nakatayo sa ibabaw niya, na nahahati sa pagitan ng sindak at tuwa, si Emma Redfern.</w:t>
+        <w:t>Lumingon ako. Nakabaon ang buong ulo ni Pip sa tastas na tuktok ng isang kalabasang-parol na maagang inukit ng kung sino, inilalabas ang mamasa-masang mga buto at inihahagis sa damuhan taglay ang buong-pusong kaligayahan sa anumang ipinagbabawal. Nakatayo sa ibabaw niya, na nahahati sa pagitan ng sindak at tuwa, si Emma Redfern.</w:t>
       </w:r>
     </w:p>
     <w:p/>
@@ -1555,7 +1555,7 @@
     <w:p/>
     <w:p>
       <w:r>
-        <w:t xml:space="preserve">Bumulusok ito mula sa kanya nang may kislap at pagkabigla, isang tunay na tawa, ang uri ng tawang nakakatakas sa isang bata bago pa man niya mapagpasyahan kung hahayaan, at nakabuti ito sa akin nang higit pa sa isang linggong tulog, sapagkat nagkaroon ng mahabang yugto, pagkamatay ng kanyang ina, na si Emma Redfern ay hindi tumawa. Ang karamdaman ni Sarah Redfern ay umabot nang halos isang taon, at pagkatapos ay nagpalutang-lutang si Emma sa isang bayan na hindi alam kung paano siya aabutin, isang munting abong multo ng isang batang babae. Kinuha niya ang maliit na aso ni Martha nitong maaga-aga sa buwang ito, kinuha ito, itinago at inalagaan, mula sa isang pighati na napakalaki para magkasya sa loob ng isang walong-taong-gulang. Nagtipon ang buong bayan upang maghanap. Natagpuan ko silang dalawa sa huli, ang batang babae at ang aso na magkasama sa isang lumang kamalig, at ang pagtatagpo na iyon ang naging simula ng pagbabalik ni Emma sa kanyang sarili. Ipinapasyal na niya ang aso ngayon tatlong hapon sa isang linggo, isang kasunduan na likha ni Martha mula sa wala upang bigyan ang isang nag-iisang bata ng dahilan upang bumangon at isang mainit na nilalang na pananagutan, at gumana ito, sa gilid-gilid, nang walang sinumang nagsasalita nang malakas kung para saan iyon.</w:t>
+        <w:t xml:space="preserve">Bumulusok ito mula sa kanya nang may kislap at pagkabigla, isang tunay na tawa, ang uri ng tawang nakakatakas sa isang bata bago pa man niya mapagpasyahan kung hahayaan, at nakabuti ito sa akin nang higit pa sa isang linggong tulog, sapagkat nagkaroon ng mahabang yugto, pagkamatay ng kanyang ina, na si Emma Redfern ay hindi tumawa. Ang karamdaman ni Sarah Redfern ay umabot nang halos isang taon, at pagkatapos ay nagpalutang-lutang si Emma sa isang bayan na hindi alam kung paano siya aabutin, isang munting abong multo ng isang batang babae. Kinuha niya ang maliit na aso ni Martha nitong maaga-aga sa buwang ito, kinuha ito, itinago at inalagaan, mula sa isang pighati na napakalaki para magkasya sa loob ng isang walong-taong-gulang. Nagtipon ang buong bayan upang maghanap. Natagpuan ko silang dalawa sa huli, ang batang babae at ang aso na magkasama sa isang lumang kamalig, at ang pagtatagpo na iyon ang naging simula ng pagbabalik ni Emma sa kanyang sarili. Ipinapasyal na niya ang aso ngayon tatlong hapon sa isang linggo, isang kasunduan na likha ni Martha mula sa wala upang bigyan ang isang nag-iisang bata ng dahilan upang bumangon at isang mainit na nilalang na pananagutan, at gumana ito, nang hindi tuwiran, nang walang sinumang nagsasalita nang malakas kung para saan iyon.</w:t>
       </w:r>
     </w:p>
     <w:p/>
@@ -1579,13 +1579,13 @@
     <w:p/>
     <w:p>
       <w:r>
-        <w:t>Nagpanalo ito sa akin ng isa pang tawa, at sa likod nito ay dumating si Mark Redfern na may dalang isang bisig ng mga nakatuping upuan. Nang ibaba niya ang mga iyon, tuwirang tumayo at inalis ang buhok sa kanyang noo, nakita ko ang inaasam-asam kong makita sa kanyang mukha: ang ginhawa. Siya ay isang taong hungkag nang una ko siyang nakilala, itinataas ang kanyang sarili at ang kanyang anak na babae gamit ang parehong mga kamay at walang natira pa. May kulay na siya ngayon. Tiningnan niya si Emma na tumatawa sa penguin, at ang kanyang mga balikat, na naninigas sa loob ng isang taon, ay lumuwag.</w:t>
-      </w:r>
-    </w:p>
-    <w:p/>
-    <w:p>
-      <w:r>
-        <w:t xml:space="preserve">“Inuusig niya ako sa loob ng isang linggo upang itanong kung darating ba ang penguin sa pista,” aniya. “Sa tingin ko hangga't kay Emma ang pinag-uusapan, si Pip ang buong pista. Ang natitira ay ang bahagi lamang na kailangang mangyari upang maipakita ang penguin.”</w:t>
+        <w:t>Nakakuha ako ng isa pang tawa dahil doon, at sa likod nito ay dumating si Mark Redfern na may dalang isang bisig ng mga nakatuping upuan. Nang ibaba niya ang mga iyon, tuwirang tumayo at inalis ang buhok sa kanyang noo, nakita ko ang inaasam-asam kong makita sa kanyang mukha: ang ginhawa. Siya ay isang taong hungkag nang una ko siyang nakilala, itinataas ang kanyang sarili at ang kanyang anak na babae gamit ang parehong mga kamay at walang natira pa. May kulay na siya ngayon. Tiningnan niya si Emma na tumatawa sa penguin, at ang kanyang mga balikat, na naninigas sa loob ng isang taon, ay lumuwag.</w:t>
+      </w:r>
+    </w:p>
+    <w:p/>
+    <w:p>
+      <w:r>
+        <w:t xml:space="preserve">“Kinukulit niya ako sa loob ng isang linggo upang itanong kung darating ba ang penguin sa pista,” aniya. “Sa tingin ko hangga't kay Emma ang pinag-uusapan, si Pip ang buong pista. Ang natitira ay ang bahagi lamang na kailangang mangyari upang makasipot ang penguin.”</w:t>
       </w:r>
     </w:p>
     <w:p/>
@@ -1615,19 +1615,19 @@
     <w:p/>
     <w:p>
       <w:r>
-        <w:t xml:space="preserve">“Kumusta ka, Mark?” tanong ko sa kanya nang mahina, sa susunod na dumaan kami, habang si Emma ay nakikipag-ayos ng isang marupok na kapayapaan sa pagitan ni Snowball at ng isang kalabasa na nagpasakit sa kanya.</w:t>
-      </w:r>
-    </w:p>
-    <w:p/>
-    <w:p>
-      <w:r>
-        <w:t xml:space="preserve">“Mas mabuti.” Sinabi niya ito nang maingat, tulad ng isang taong lumalabas sa yelo na hindi pa niya sigurado. “Mas mabuti kami. May mga buong oras ngayon na nakakalimutan ko, at pagkatapos ay naaalala ko, at ang pag-alala ay hindi na nagpapabagsak sa akin sa sahig. Sumasabay lamang ito sa akin sandali at pagkatapos ay lumuluwag itong muli.” Ibinaba niya ang kanyang dulo ng isang bangko. “Ang bayan ang gumawa niyon. Patuloy akong sinusubukang alamin kung paano magpasalamat sa isang buong bayan at walang paraan para gawin iyon. Nagpapakita lamang ang mga tao. Mga kaserol. May kukuha kay Emma para sa isang hapon. Si Martha at ang asong iyon. Ikaw at ang katawa-tawang ibong iyon. Walang nag-ayos ng anuman. Walang makakagawa niyon. Patuloy lamang silang nagpapakita hanggang sa ang pagpapakita ay naging buhay muli, at isang araw tumingin ako sa paligid at nabubuhay na pala kami roon.”</w:t>
-      </w:r>
-    </w:p>
-    <w:p/>
-    <w:p>
-      <w:r>
-        <w:t xml:space="preserve">Alam ko ang ibinigay niyang kahulugan. Nabasa ko ang napakaraming liham mula sa mga tao na nasa pinakamasamang kalagayan. “Iyon ang dahilan kung bakit may bayan, Mark,” sabi ko. “Gagawin mo rin iyon sa susunod.”</w:t>
+        <w:t xml:space="preserve">“Kumusta ka, Mark?” tanong ko sa kanya nang mahina, sa susunod na dumaan kami, habang si Emma ay nakikipag-ayos ng isang marupok na kapayapaan sa pagitan ni Snowball at ng isang kalabasa na nakapikon sa kanya.</w:t>
+      </w:r>
+    </w:p>
+    <w:p/>
+    <w:p>
+      <w:r>
+        <w:t xml:space="preserve">“Mas mabuti.” Sinabi niya ito nang maingat, tulad ng isang taong lumalabas sa yelo na hindi pa niya sigurado. “Mas mabuti kami. May mga buong oras ngayon na nakakalimutan ko, at pagkatapos ay naaalala ko, at ang pag-alala ay hindi na nagpapabagsak sa akin sa sahig. Sumasabay lamang ito sa akin sandali at pagkatapos ay lumuluwag itong muli.” Ibinaba niya ang kanyang dulo ng isang bangko. “Ang bayan ang gumawa niyon. Patuloy kong sinusubukang alamin kung paano magpasalamat sa isang buong bayan at walang paraan para gawin iyon. Nagpapakita lamang ang mga tao. Mga kaserol. May kukuha kay Emma para sa isang hapon. Si Martha at ang asong iyon. Ikaw at ang katawa-tawang ibong iyon. Walang nag-ayos ng anuman. Walang makakagawa niyon. Patuloy lamang silang nagpapakita hanggang sa ang pagpapakita ay naging buhay muli, at isang araw tumingin ako sa paligid at nabubuhay na pala kami roon.”</w:t>
+      </w:r>
+    </w:p>
+    <w:p/>
+    <w:p>
+      <w:r>
+        <w:t xml:space="preserve">Alam ko ang ibig niyang sabihin. Nabasa ko ang napakaraming liham mula sa mga tao na nasa pinakamasamang kalagayan. “Iyon ang dahilan kung bakit may bayan, Mark,” sabi ko. “Gagawin mo rin iyon sa susunod.”</w:t>
       </w:r>
     </w:p>
     <w:p/>
@@ -1645,7 +1645,7 @@
     <w:p/>
     <w:p>
       <w:r>
-        <w:t xml:space="preserve">“Ginang Claus.” Kinuha niya ang mga guwantes, binilang ang mga ito at isinulat ang numero. “Mesa ng gawaan, dulong dulo. Salamat. At ang inyong mga reindeer ay wala sa programa ngayong taon.”</w:t>
+        <w:t xml:space="preserve">“Ginang Claus.” Kinuha niya ang mga guwantes, binilang ang mga ito at isinulat ang numero. “Mesa ng mga gawang-kamay, sa dulong-dulo. Salamat. At ang inyong mga reindeer ay wala sa programa ngayong taon.”</w:t>
       </w:r>
     </w:p>
     <w:p/>
@@ -1657,7 +1657,7 @@
     <w:p/>
     <w:p>
       <w:r>
-        <w:t xml:space="preserve">“Sabihin kay Bram. Sinulatan ko siya ng babala noong nakaraang linggo para kay Comet sa Maple Street, at pinasalamatan niya ako para doon.” Isang sulok ng kanyang bibig ang tumaas. “Walang nagpapasalamat sa akin para sa isang babala.”</w:t>
+        <w:t xml:space="preserve">“Sabihin ninyo kay Bram. Sinulatan ko siya ng babala noong nakaraang linggo para kay Comet sa Maple Street, at pinasalamatan niya ako para doon.” Isang sulok ng kanyang bibig ang tumaas. “Walang nagpapasalamat sa akin para sa isang babala.”</w:t>
       </w:r>
     </w:p>
     <w:p/>
@@ -1681,7 +1681,7 @@
     <w:p/>
     <w:p>
       <w:r>
-        <w:t xml:space="preserve">Lumapit ako at tiningnan. Mula sa mamasa-masang kahel na laman, sa huling linggo ng Oktubre, isang usbong ng holly ang sumibol: tatlong madilim na makintab na dahon, matulis ang gilid at hindi mapagkakamalan, at sa gitna nito ay tatlong pulang berry na bilog na parang mga patak ng dugo, na tumutubo mula sa isang nasirang kalabasa ng Halloween sa loob ng oras pagkatapos itong buksan ni Pip.</w:t>
+        <w:t xml:space="preserve">Lumapit ako at tiningnan. Mula sa mamasa-masang kahel na laman, sa huling linggo ng Oktubre, isang usbong ng holly ang sumibol: tatlong madilim na makintab na dahon, matulis ang gilid at hindi mapagkakamalan, at sa gitna nito ay tatlong pulang berry na bilog na parang mga patak ng dugo, na tumutubo mula sa isang nasirang kalabasa ng Halloween sa loob lamang ng isang oras mula nang buksan ito ni Pip.</w:t>
       </w:r>
     </w:p>
     <w:p/>
@@ -1705,7 +1705,7 @@
     <w:p/>
     <w:p>
       <w:r>
-        <w:t xml:space="preserve">Yumuko si Emma at hinawakan ang isa sa mga pulang berry gamit ang isang maingat na dulo ng daliri. “Maganda ito,” aniya, napakalambot na halos walang laman. Pagkatapos ay lumingon siya sa akin, biglaan at mabagsik. “Huwag po ninyong sabihin kahit kanino. Gusto nilang hukayin ito at ilagay sa isang garapon. Hayaan nating maging atin ito. Atin lamang at kay Pip.”</w:t>
+        <w:t xml:space="preserve">Yumuko si Emma at hinawakan ang isa sa mga pulang berry gamit ang isang maingat na dulo ng daliri. “Maganda ito,” aniya, napakalambot na halos walang laman. Pagkatapos ay lumingon siya sa akin, biglaan at mabagsik. “Huwag po ninyong sabihin kahit kanino. Gugustuhin nilang hukayin ito at ilagay sa isang garapon. Hayaan nating maging atin ito. Atin lamang at kay Pip.”</w:t>
       </w:r>
     </w:p>
     <w:p/>
@@ -1747,7 +1747,7 @@
     <w:p/>
     <w:p>
       <w:r>
-        <w:t>At tinipon ko ang aking walang hiyang ibon na may baba ng kalabasa at umuwi sa gitna ng lumalalang lamig.</w:t>
+        <w:t>At tinipon ko ang aking di-nahihiyang ibon na may baba ng kalabasa at umuwi sa gitna ng lumalalang lamig.</w:t>
       </w:r>
     </w:p>
     <w:p>
@@ -1763,7 +1763,7 @@
     </w:p>
     <w:p>
       <w:r>
-        <w:t>Nagdala ako ng sabaw sa pagkakataong ito, hindi pie: ang sabaw ng barley ni Nick, na nasa magandang tapayang may takip. Naabutan ko si Fiona sa silid-kainan na may dalas-dalang clipboard, binibilang ang mga upuan nang pabulong, at nang makita niya ang tapayan sa aking mga braso ay medyo gumaan ang kanyang mukha.</w:t>
+        <w:t>Nagdala ako ng sabaw sa pagkakataong ito, hindi pie: ang sabaw ng barley ni Nick, na nasa magandang tapayang may takip. Naabutan ko si Fiona sa silid-kainan na may dala-dalang clipboard, binibilang ang mga upuan nang pabulong, at nang makita niya ang tapayan sa aking mga braso ay medyo gumaan ang kanyang mukha.</w:t>
       </w:r>
     </w:p>
     <w:p>
@@ -1783,12 +1783,12 @@
     </w:p>
     <w:p>
       <w:r>
-        <w:t xml:space="preserve">“Patuloy kong iniisip siya,” sabi niya, makalipas ang ilang sandali, habang ibinababa ang kutsara. “Si Constance. Hindi ko naman siya madalas isipin noon. Pangalan lamang siya sa pader, isang seryosong mukha sa loob ng kuwadro. At ngayon siya na lamang ang iniisip ko. Ang batang babaeng iyon, at ang ginawa niya, at kung ano ang nagawa nito sa akin makalipas ang sandaang taon.” Tumawa siya nang bahagya at malungkot. “Nakakatawa, di ba? Inilaan ko ang buong buhay ko sa pagtira sa kanyang bahay at hindi ko man lang sinubukang kilalanin siya. Halika at tingnan mo. May gusto akong ipapakita sa iyo.”</w:t>
-      </w:r>
-    </w:p>
-    <w:p>
-      <w:r>
-        <w:t xml:space="preserve">Inakay niya ako papunta sa bulwagan sa unahan, kung saan ang liwanag sa hapon ay tumatagos nang pahilis sa ibabaw ng pintuan at nakalatag sa isang mahabang gintong guhit sa mga sahig na kahoy. Sa pader malapit sa hagdan, sa isang payak na madilim na kuwadro na ilang beses ko nang nadaanan nang hindi tinitingnan, ay may nakasabit na litrato. Isang babae na may nakataas na kwelyo at maayos na kulot na buhok noong isang siglo pa, ang kanyang baba ay nakataas, ang kanyang mga maitim na mata ay nakatingin sa camera nang kasingtatag ng ginawa ng babaeng Blackburn sa kabilang litrato, na may parehong pigil na tingin, bagaman sa mukhang ito ay mas matigas, mas pagod at mas malapit sa buto. Mas bata kaysa sa inakala ko. Mas bata kaysa sa babae sa litrato ng mangingikil, na isang Blackburn na may kasuotang marangya. Si Constance ito, sa isang murang upuan sa studio na may ipininta na hardin sa kanyang likuran, nakasuot ng kanyang pinakamaganda, na hindi naman ganoon ka-marami.</w:t>
+        <w:t xml:space="preserve">“Patuloy kong iniisip siya,” sabi niya, makalipas ang ilang sandali, habang ibinababa ang kutsara. “Si Constance. Hindi ko naman siya madalas isipin noon. Pangalan lamang siya sa pader, isang seryosong mukha sa loob ng kuwadro. At ngayon siya na lamang ang iniisip ko. Ang batang babaeng iyon, at ang ginawa niya, at kung ano ang nagawa nito sa akin makalipas ang sandaang taon.” Tumawa siya nang bahagya at malungkot. “Nakakatawa, di ba? Inilaan ko ang buong buhay ko sa pagtira sa kanyang bahay at hindi ko man lang sinubukang kilalanin siya. Halika at tingnan mo. May gusto akong ipakita sa iyo.”</w:t>
+      </w:r>
+    </w:p>
+    <w:p>
+      <w:r>
+        <w:t xml:space="preserve">Inakay niya ako papunta sa bulwagan sa unahan, kung saan ang liwanag sa hapon ay tumatagos nang pahilis sa bentanilya sa ibabaw ng pintuan at nakalatag sa isang mahabang gintong guhit sa mga sahig na kahoy. Sa pader malapit sa hagdan, sa isang payak na madilim na kuwadro na ilang beses ko nang nadaanan nang hindi tinitingnan, ay may nakasabit na litrato. Isang babae na may nakataas na kwelyo at maayos na kulot na buhok noong isang siglo pa, ang kanyang baba ay nakataas, ang kanyang mga maitim na mata ay nakatingin sa camera nang kasingtatag ng ginawa ng babaeng Blackburn sa kabilang litrato, na may parehong pigil na tingin, bagaman sa mukhang ito ay mas matigas, mas pagod at mas malapit sa buto. Mas bata kaysa sa inakala ko. Mas bata kaysa sa babae sa litrato ng mangingikil, na isang Blackburn na may kasuotang marangya. Si Constance ito, sa isang murang upuan sa studio na may ipininta na hardin sa kanyang likuran, nakasuot ng kanyang pinakamaganda, na hindi naman ganoon ka-marami.</w:t>
       </w:r>
     </w:p>
     <w:p>
@@ -1883,7 +1883,7 @@
     <w:p/>
     <w:p>
       <w:r>
-        <w:t xml:space="preserve">“Ginang Claus.” Ibinalik niya ang martilyo sa sungay ng palihan at pinunasan ang kanyang mga kamay sa kanyang balat na apron, na nag-iwan ng mga bagong maitim na guhit sa ibabaw ng mga luma. “Nariyan kayo para sa lagayan ng ilaw. Tapos na. Maganda ang kinalabasan, kung ako ang tatanungin.” Halos ngumiti siya, ang seryoso at tipid na halos-ngiti na ibinibigay lamang ni Sam sa isang kostumer, at naglakad patungo sa isang bangko sa may likurang pader.</w:t>
+        <w:t xml:space="preserve">“Ginang Claus.” Ibinalik niya ang martilyo sa sungay ng palihan at pinunasan ang kanyang mga kamay sa kanyang balat na apron, na nag-iwan ng mga bagong maitim na guhit sa ibabaw ng mga luma. “Narito kayo para sa lagayan ng ilaw. Tapos na. Maganda ang kinalabasan, kung ako ang tatanungin.” Halos ngumiti siya, ang seryoso at tipid na halos-ngiti na siyang pinakamarami nang naibibigay ni Sam sa isang kostumer, at naglakad patungo sa isang bangko sa may likurang pader.</w:t>
       </w:r>
     </w:p>
     <w:p/>
@@ -1895,7 +1895,7 @@
     <w:p/>
     <w:p>
       <w:r>
-        <w:t xml:space="preserve">“Pinapanatiling abala ng Pista ang isang panday.” Dinala niya ang lagayan ng ilaw na ipinagawa ko bilang dahilan ko sa pagparito, isang manipis na kurba ng itim na bakal na inilaan upang humawak sa iisang kandila, ang metal ay nakapulupot sa isang mahaba at madaling espiral, tulad ng isang baging. Maganda ito, at sinabi ko sa kanya iyon habang iniikot ko ito sa liwanag. Ang maliit at matapat na pagmamalaki nito ay dumaan sa kanyang mukha at nawala.</w:t>
+        <w:t xml:space="preserve">“Pinapanatiling abala ng pista ang isang panday.” Dinala niya ang lagayan ng ilaw na ipinagawa ko bilang dahilan ko sa pagparito, isang manipis na kurba ng itim na bakal na inilaan upang humawak sa iisang kandila, ang metal ay nakapulupot sa isang mahaba at madaling espiral, tulad ng isang baging. Maganda ito, at sinabi ko sa kanya iyon habang iniikot ko ito sa liwanag. Ang maliit at matapat na pagmamalaki nito ay dumaan sa kanyang mukha at nawala.</w:t>
       </w:r>
     </w:p>
     <w:p/>
@@ -1949,7 +1949,7 @@
     <w:p/>
     <w:p>
       <w:r>
-        <w:t xml:space="preserve">“Lahat ay kapos bawat taon.” Sa wakas ay ibinaba niya ang basahan at tuwirang tiningnan ako. “Hindi ko iniinda ang pautangin ang isang kaibigan na nahihirapan, Ginang Claus. Ang buong bayan ay nagpapakandarapa, alam ko iyon nang kasing-husay ng sinuman, ginagawa ko ang kalahati ng aking trabaho sa tiwala. Kung sinabi lang sana niya, Sam, masikip ang mga bagay-bagay, bigyan mo ako hanggang tagsibol, punit-punitin ko sana ang kuwenta at sinabing huwag mo na itong isipin. Ang hindi pag-tingin sa akin ang hindi ko matagalan. Ang isang babae na kapos lamang sa pera ay hindi kumikilos nang ganoon. Nahihiya siya, o natatakot sa isang bagay, at wala itong kinalaman sa aking dalawampung dolyar, at hindi ako makalapit upang tumulong.” Ikinalat niya ang kanyang mga kamay na may bahid ng uling. “Nasa gulo ba siya? Totoong gulo? Dahil kung oo, mas gusto ko pang malaman ito at tumulong kaysa tumayo rito na naghihimutok sa barya sa bulsa tulad ng isang maliit na tao.”</w:t>
+        <w:t xml:space="preserve">“Lahat ay kapos bawat taon.” Sa wakas ay ibinaba niya ang basahan at tuwirang tiningnan ako. “Hindi ko iniinda ang pautangin ang isang kaibigan na nahihirapan, Ginang Claus. Ang buong bayan ay nagpapakandarapa, alam ko iyon nang kasing-husay ng sinuman, ginagawa ko ang kalahati ng aking trabaho sa tiwala. Kung sinabi lang sana niya, Sam, masikip ang mga bagay-bagay, bigyan mo ako hanggang tagsibol, punit-punitin ko sana ang kuwenta at sinabing huwag mo na itong isipin. Ang hindi pag-tingin sa akin ang hindi ko matagalan. Ang isang babae na kapos lamang sa pera ay hindi kumikilos nang ganoon. Nahihiya siya, o natatakot sa isang bagay, at wala itong kinalaman sa aking dalawampung dolyar, at hindi ako makalapit upang tumulong.” Ikinalat niya ang kanyang mga kamay na may bahid ng uling. “Nasa gulo ba siya? Totoong gulo? Dahil kung oo, mas gusto ko pang malaman ito at tumulong kaysa tumayo rito na naghihimutok sa barya sa bulsa tulad ng isang taong mababaw.”</w:t>
       </w:r>
     </w:p>
     <w:p/>
@@ -1997,7 +1997,7 @@
     <w:p/>
     <w:p>
       <w:r>
-        <w:t xml:space="preserve">Hindi ko sinabi ang alinman dito nang malakas. Ngunit nanatili ito sa isang tanong na mas mahalaga kaysa sa amoy mismo. Ang nota ay umamoy ng pandayan. Ngunit umamoy ba ito ng pandayan dahil si Sam Patel ay yumuko rito na may dalang pluma, o dahil ito ay nasa isang lugar kung saan naroroon ang bakal ni Sam Patel?</w:t>
+        <w:t xml:space="preserve">Hindi ko sinabi ang alinman dito nang malakas. Ngunit nauwi ito sa isang tanong na mas mahalaga kaysa sa amoy mismo. Ang nota ay umamoy ng pandayan. Ngunit umamoy ba ito ng pandayan dahil si Sam Patel ay yumuko rito na may dalang pluma, o dahil ito ay nasa isang lugar kung saan naroroon ang bakal ni Sam Patel?</w:t>
       </w:r>
     </w:p>
     <w:p/>
@@ -2044,13 +2044,13 @@
     <w:p/>
     <w:p>
       <w:r>
-        <w:t xml:space="preserve">Balak kong gugulin ang umaga sa pampublikong aklatihan, nang tahimik, upang magbasa tungkol sa mga Blackburn. Naabutan ko roon si Neil na nauna na sa akin, nakapuwesto sa malaking mesang oak malapit sa matatangkad na bintana na may tatlong kahon ng arkibo ng mga rekord ng bayan na nakabukas sa kaniyang harapan at isang ikaapat na dinala pa ni Ginang Johnson, na ibinaba ito nang may pag-aalinlangang pag-iingat ng isang librarian na nagpasyang magiging abala ang isang patron. May hawak siyang panlaking lente sa isang kamay. Nakatulak paitaas ang kaniyang salamin sa pagbasa sa kaniyang buhok at suot naman ang kaniyang regular na salamin sa kaniyang ilong. Tumingala siya agad pagpasok ko sa pinto, parang naghihintay siya ng isang kaibigan, at pinakawayan niya ako palapit.</w:t>
-      </w:r>
-    </w:p>
-    <w:p/>
-    <w:p>
-      <w:r>
-        <w:t xml:space="preserve">“Ginang Claus! Halikayo at tingnan ninyo ito, magugustuhan ninyo.” Inihilig niya ang isang marupok na pahina ng ledyer patungo sa akin nang lumapit ako. “Labingwalong daan at siyamnapu't isa. Naglagay ang mga Blackburn ng kalahati ng pera para sa simbahan sa gilid ng liwasan. Alam ba ninyo iyon? Kalahati. Mapagbigay, ang mga matatanda, noong angkop sa kanila na mapansin.” Umiling siya nang may bakas ng tunay na paghanga. “Mahilig talaga ako sa isang angkang nagtatag ng bayan. Lahat ng hilaw at matinding ambisyon na iyon sa unang henerasyon, na umasim tungo sa pagiging kagalang-galang pagsapit ng ikatlo, at pagsapit ng ikaapat ay nalimutan na nilang kailanman ay may hinawakan silang anuman. Pareho lang ang kuwento sa bawat maliit na bayang tinapakan ko.”</w:t>
+        <w:t xml:space="preserve">Balak kong gugulin ang umaga sa pampublikong aklatihan, nang tahimik, upang magbasa tungkol sa mga Blackburn. Naabutan ko roon si Neil na nauna na sa akin, nakapuwesto sa malaking mesang oak malapit sa matatangkad na bintana na may tatlong kahon ng arkibo ng mga rekord ng bayan na nakabukas sa kaniyang harapan at isang ikaapat na dinala pa ni Ginang Johnson, na ibinaba ito nang may napipilitang pag-iingat ng isang librarian na nagpasyang magiging abala ang isang patron. May hawak siyang panlaking lente sa isang kamay. Nakatulak paitaas ang kaniyang salamin sa pagbasa sa kaniyang buhok at suot naman ang kaniyang regular na salamin sa kaniyang ilong. Tumingala siya agad pagpasok ko sa pinto, parang naghihintay siya ng isang kaibigan, at pinakawayan niya ako palapit.</w:t>
+      </w:r>
+    </w:p>
+    <w:p/>
+    <w:p>
+      <w:r>
+        <w:t xml:space="preserve">“Ginang Claus! Halikayo at tingnan ninyo ito, magugustuhan ninyo.” Inihilig niya ang isang marupok na pahina ng ledyer patungo sa akin nang lumapit ako. “Labingwalong daan at siyamnapu't isa. Naglagay ang mga Blackburn ng kalahati ng pera para sa simbahan sa gilid ng liwasan. Alam ba ninyo iyon? Kalahati. Mapagbigay, ang mga matatanda, noong angkop sa kanila na mapansin.” Umiling siya nang may bakas ng tunay na paghanga. “Mahilig talaga ako sa isang angkang nagtatag ng bayan. Lahat ng hilaw at matinding ambisyon na iyon sa unang henerasyon, na umasim tungo sa pagiging kagalang-galang pagsapit ng ikatlo, at pagsapit ng ikaapat ay nalimutan na nilang kailanman ay may inagaw silang anuman. Pareho lang ang kuwento sa bawat maliit na bayang tinapakan ko.”</w:t>
       </w:r>
     </w:p>
     <w:p/>
@@ -2062,13 +2062,13 @@
     <w:p/>
     <w:p>
       <w:r>
-        <w:t xml:space="preserve">“Binabayaran ako para maging interesado.” Sinabi niya ito nang may kagalakan, na nagpatigil sa akin, dahil naghanda na ako para sa isang pag-iwas. “Pananaliksik sa ari-arian. Iyon ang aking propesyon, Ginang Claus. Kapag ang huli sa isang lumang angkan ng mayayaman ay namatay, nag-iiwan ito ng gulo sa likod nito, isang buhol-buhol kung sino ang nagmamay-ari ng alin, kung sino ang may utang sa alin, kung saan napunta ang ilang mahalagang bagay, at kailangang umupo ng isang tao sa mga aklatihan at alisin ang buhol na iyon, at ang taong iyon ay ako.” Ibinuka niya ang kaniyang mga kamay sa ibabaw ng mga kahon. “Ngayon lang ay iniaayos ko ang isang gulo ng mga Blackburn. May isang piraso ng alahas sa pamilya, noon. Isang brotse. Isang maganda. May sapiro sa gitna, gawaing ginto sa buong paligid nito, isang tunay na bagay, na nagkakahalaga ng malaki kahit noong panahong iyon at isang maliit na kayamanan ngayon.” Kinuha niya ang panlaking lente at ibinaba itong muli, at mula sa ilalim ng mesa ay tinitigan ng isang mata ni Pip ang tanso nitong gilid. “At nawala ito nang tuluyan sa rekord ng pamilya noong mga 1924. Huminto na lang sa pagiging binanggit. At gustong-gusto talagang malaman ng mga abogado ng pamilya kung saan ito napunta, dahil may isang ari-arian na hindi maayos na maisasara hanggang sa may makasulat kung ano ang nangyari sa brotseng iyon.”</w:t>
-      </w:r>
-    </w:p>
-    <w:p/>
-    <w:p>
-      <w:r>
-        <w:t>Naupo ako kasama niyon nang sandali. Napakalaki ng katapatang inihayag, na ibinigay nang malaya, nang hindi hinihingi, at hindi ko masabi, habang nakaupo roon, kung ito ang payak na katotohanan o ang pinakamatalinong uri ng kasinungalingan.</w:t>
+        <w:t xml:space="preserve">“Binabayaran ako para maging interesado.” Sinabi niya ito nang may kagalakan, na nagpatigil sa akin, dahil naghanda na ako para sa isang pag-iwas. “Pananaliksik sa ari-arian. Iyon ang aking propesyon, Ginang Claus. Kapag ang huli sa isang lumang angkan ng mayayaman ay namatay, nag-iiwan ito ng gulo sa likod nito, isang buhol-buhol kung sino ang nagmamay-ari ng alin, kung sino ang pinagkakautangan ng alin, kung saan napunta ang ilang mahalagang bagay, at kailangang umupo ng isang tao sa mga aklatihan at alisin ang buhol na iyon, at ang taong iyon ay ako.” Ibinuka niya ang kaniyang mga kamay sa ibabaw ng mga kahon. “Ngayon lang ay iniaayos ko ang isang gulo ng mga Blackburn. May isang piraso ng alahas sa pamilya, noon. Isang brotse. Isang maganda. May sapiro sa gitna, gawaing ginto sa buong paligid nito, isang tunay na bagay, na nagkakahalaga ng malaki kahit noong panahong iyon at isang maliit na kayamanan ngayon.” Kinuha niya ang panlaking lente at ibinaba itong muli, at mula sa ilalim ng mesa ay tinitigan ng isang mata ni Pip ang tanso nitong gilid. “At nawala ito nang tuluyan sa rekord ng pamilya noong mga 1924. Bigla na lang hindi na nabanggit. At gustong-gusto talagang malaman ng mga abogado ng pamilya kung saan ito napunta, dahil may isang ari-arian na hindi maayos na maisasara hanggang sa may makasulat kung ano ang nangyari sa brotseng iyon.”</w:t>
+      </w:r>
+    </w:p>
+    <w:p/>
+    <w:p>
+      <w:r>
+        <w:t>Pinag-isipan ko iyon nang sandali. Napakalaki ng katapatang inihayag, na ibinigay nang malaya, nang hindi hinihingi, at hindi ko masabi, habang nakaupo roon, kung ito ang payak na katotohanan o ang pinakamatalinong uri ng kasinungalingan.</w:t>
       </w:r>
     </w:p>
     <w:p/>
@@ -2098,7 +2098,7 @@
     <w:p/>
     <w:p>
       <w:r>
-        <w:t xml:space="preserve">“Takdang-aralin ang lahat ng ito, ang trabahong ito. Wala nang ibang bahagi rito.” Tinanggal niya ang kaniyang regular na salamin at kinuskos ang tulay ng kaniyang ilong, at sa isang saglit ay mukha siyang pagod lamang, isang karaniwang lalaking nasa katanghaliang-gulang na malayo sa tahanan na ginagawa ang isang mapurol na bagay nang may pag-iingat. “Heto. Sana ay binigyan ko kayo ng isa nito noong unang araw.” Iniabot niya sa akin ang isang kard sa ibabaw ng mesa. “Binibigyan ko nito ang lahat. Totoo, lahat. Kapag mas maraming tao sa isang bayan ang nakakaalam kung ano ang aking hinahanap, mas malamang na may lola ang isang tao na maaalala ang isang bagay na sinabi minsan ng kaniyang ina, at ililigtas ako ng isang buwan.”</w:t>
+        <w:t xml:space="preserve">“Takdang-aralin ang lahat ng ito, ang trabahong ito. Wala nang ibang bahagi rito.” Tinanggal niya ang kaniyang regular na salamin at kinuskos ang tulay ng kaniyang ilong, at sa isang saglit ay mukha siyang pagod lamang, isang karaniwang lalaking nasa katanghaliang-gulang na malayo sa tahanan na ginagawa ang isang nakababagot na bagay nang may pag-iingat. “Heto. Sana ay binigyan ko kayo ng isa nito noong unang araw.” Iniabot niya sa akin ang isang kard sa ibabaw ng mesa. “Binibigyan ko nito ang lahat. Totoo, lahat. Kapag mas maraming tao sa isang bayan ang nakakaalam kung ano ang aking hinahanap, mas malamang na may lola ang isang tao na maaalala ang isang bagay na sinabi minsan ng kaniyang ina, at makakatipid ako ng isang buwan.”</w:t>
       </w:r>
     </w:p>
     <w:p/>
@@ -2116,7 +2116,7 @@
     <w:p/>
     <w:p>
       <w:r>
-        <w:t xml:space="preserve">Ang sinumang sumulat ng notang iyon ay nagtrabaho sa dilim. Ang kaniyang buong kapangyarihan, bawat onsa nito, ay nagmula sa hindi pagpapakita. Sumulat siya sa isang sulat-kamay na hindi sa kaniya. Sinabihan niya ang isang babae na magbitay ng pulang laso sa kaniyang korona upang hindi na niya kailangang ipakita ang kaniyang mukha para maningil. At narito, sa kabilang panig ng mesa sa aklatihan sa pinakamaliwanag na silid sa bayan, si Neil Carter, na namimigay ng mga kard na parang isang lalaking tumatakbo sa posisyon, sinasabi sa librarian, sa alkalde, kay Ginang Claus at sinumang mananatiling tahimik na hinahanap niya ang isang brotse ng mga Blackburn na umalis sa bayan sa maling paraan noong 1924.</w:t>
+        <w:t xml:space="preserve">Ang sinumang sumulat ng notang iyon ay nagtrabaho sa dilim. Ang kaniyang buong kapangyarihan, bawat onsa nito, ay nagmula sa hindi pagpapakita. Sumulat siya sa isang sulat-kamay na hindi sa kaniya. Sinabihan niya ang isang babae na magsabit ng pulang laso sa kaniyang korona upang hindi na niya kailangang ipakita ang kaniyang mukha para maningil. At narito, sa kabilang panig ng mesa sa aklatihan sa pinakamaliwanag na silid sa bayan, si Neil Carter, na namimigay ng mga kard na parang isang lalaking tumatakbo sa posisyon, sinasabi sa librarian, sa alkalde, kay Ginang Claus at sinumang titigil para makinig na hinahanap niya ang isang brotse ng mga Blackburn na umalis sa bayan sa maling paraan noong 1924.</w:t>
       </w:r>
     </w:p>
     <w:p/>
@@ -2128,7 +2128,7 @@
     <w:p/>
     <w:p>
       <w:r>
-        <w:t>Maliban na lamang kung ang pag-aanunsyo ang mismong katalinuhan. Pinilit ko ring panindigan ang hugis niyon, baligtarin ito, tingnan ang ilalim nito. Maliban na lamang kung nagtatago siya sa nag-iisang lugar na walang sinumang tumitingin, sa pusod ng liwanag, gumagawa ng napakaraming tapat na ingay tungkol sa brotse upang walang sinuman sa Frost Falls ang mag-isip na paghinalaan ang lalaking pinakamatagal na nagsalita tungkol dito.</w:t>
+        <w:t>Maliban na lamang kung ang pag-aanunsyo ang mismong katalinuhan. Pinilit ko ring panindigan ang hugis niyon, baligtarin ito, tingnan ang ilalim nito. Maliban na lamang kung nagtatago siya sa nag-iisang lugar na walang sinumang tumitingin, sa pusod ng liwanag, gumagawa ng napakaraming tapat na ingay tungkol sa brotse upang walang sinuman sa Frost Falls ang mag-isip na paghinalaan ang lalaking pinakamadalas magsalita tungkol dito.</w:t>
       </w:r>
     </w:p>
     <w:p/>
@@ -2140,7 +2140,7 @@
     <w:p/>
     <w:p>
       <w:r>
-        <w:t xml:space="preserve">Pinag-isipan niya itong mabuti, na ipagkakaloob ko sa kaniya. Hindi siya umabot sa madaling sagot. “Isusulat ko sa aking ulat,” sabi niya sa wakas. “Kung saan napunta ang bagay, at kung paano. Isasara ang ari-arian. Kokolektahin ang aking bayad at aalis.” Nagkibit-balikat siya. “Hindi ako ang batas, Ginang Claus, at hindi ako pari, at tiyak na hindi ako ang konsensiya ng isang batang babae na matagal nang patay sa ngayon. Sinusundan ko kung saan napunta ang mga bagay. Kung ano ang ginawa ng mga tao upang mapunta sila roon, at kung tama ba sila o mali na gawin ito, nasa pagitan nila iyon at anuman ang kanilang pinanagutan, at daang taon na itong malamig bukod pa roon. Wala akong interes na ikahiya ang isang patay na utusan dahil sa pagiging mahirap.” Tumigil siya, at tiningnan ako nang medyo mas matalas sa ibabaw ng mga kahon. “Bakit ninyo iyon itinanong nang ganoon? May alam ba kayong hindi ko alam, Ginang Claus?”</w:t>
+        <w:t xml:space="preserve">Pinag-isipan niya itong mabuti, at kapuri-puri iyon sa kaniya. Hindi siya umabot sa madaling sagot. “Isusulat ko sa aking ulat,” sabi niya sa wakas. “Kung saan napunta ang bagay, at kung paano. Isasara ang ari-arian. Kokolektahin ang aking bayad at aalis.” Nagkibit-balikat siya. “Hindi ako ang batas, Ginang Claus, at hindi ako pari, at tiyak na hindi ako ang konsensiya ng isang batang babae na matagal nang patay sa ngayon. Sinusundan ko kung saan napunta ang mga bagay. Kung ano ang ginawa ng mga tao upang mapunta sila roon, at kung tama ba sila o mali na gawin ito, nasa pagitan nila iyon at anuman ang kanilang pinananagutan, at daang taon na itong malamig bukod pa roon. Wala akong interes na ikahiya ang isang patay na utusan dahil sa pagiging mahirap.” Tumigil siya, at tiningnan ako nang medyo mas matalas sa ibabaw ng mga kahon. “Bakit ninyo iyon itinanong nang ganoon? May alam ba kayong hindi ko alam, Ginang Claus?”</w:t>
       </w:r>
     </w:p>
     <w:p/>
@@ -2158,7 +2158,7 @@
     <w:p/>
     <w:p>
       <w:r>
-        <w:t>Pumunta ako sa aklatihan upang magbasa tungkol sa mga Blackburn at natagpuan sa halip ang isang lalaki na napakalakas ng boses at labis na nag-uusisa tungkol sa brotse kaya halos napawalang-sala niya ang kaniyang sarili sa pamamagitan ng purong laki ng kanyang gana rito. Halos. Hindi ako handang tuluyang ibaba siya. Ngunit habang mas matagal akong nakaupo kasama niya, mas lalong hindi kamukha ni Neil Carter ang isang lalaking nagtatrabaho sa dilim.</w:t>
+        <w:t>Pumunta ako sa aklatihan upang magbasa tungkol sa mga Blackburn at natagpuan sa halip ang isang lalaki na napakalakas ng boses at labis na nag-uusisa tungkol sa brotse kaya halos napawalang-sala niya ang kaniyang sarili sa pamamagitan ng purong laki ng kanyang gana rito. Halos. Hindi pa ako handang tuluyang alisin siya sa mga pinaghihinalaan. Ngunit habang mas matagal akong nakaupo kasama niya, mas lalong hindi kamukha ni Neil Carter ang isang lalaking nagtatrabaho sa dilim.</w:t>
       </w:r>
     </w:p>
     <w:p/>
@@ -2193,13 +2193,13 @@
     <w:p/>
     <w:p>
       <w:r>
-        <w:t xml:space="preserve">“Dahil hindi naman siya basta nakatakas.” Ibinaba niya ang boses. “Ang ibig kong sabihin ay nakatakas nga siya, kitang-kita naman, narito siya sa mga repolyo, may mga mata naman ako sa mukha ko. Pero naisara ang gate pagkatapos. Naisara sa likod niya, galing sa labas, samantalang nakatayo siya sa harap nito. Tatlong beses na akong bumaba rito at natagpuang nakasara nang mahigpit ang gate at nasa maling panig nito ang isang reindeer, at sabihin mo sa akin, Ginang Claus, paano binubuksan ng isang hayop ang trangka mula sa panig na wala naman siya, at sasabihin ko sa iyo ang paulit-ulit kong sinasabi sa batang si Fenn, na may kakaibang nangyayari sa bayang ito, may kakaibang nangyayari.”</w:t>
-      </w:r>
-    </w:p>
-    <w:p/>
-    <w:p>
-      <w:r>
-        <w:t xml:space="preserve">Tama naman siya, siyempre, bagama't hindi ko na sinabi iyon. Lumabas ako sa malamig na hardin at ipinatong ang aking palad sa mainit na balikat ni Dancer. Hinayaan niya ako, at medyo sumandal pa rito. Ayaw niyang magpadaig kahit isang pulgada kay Bram, pero dinala ko siyang pabalik sa kabila ng daan patungo sa kulungan nang walang kahirap-hirap. Bukas at karaniwan lang ang hitsura ng gate. Inakay ko siya papasok at tinrangkahan ko ito. Kaming tatlo ay tumayo at tiningnan ang trangka. Nanatili itong nakasara. Inilagay ni Dancer ang kanyang ilong sa ibabaw ng pinakataas na rehas at bumuga ng mahaba at mainit na hininga kina Bram at sa akin.</w:t>
+        <w:t xml:space="preserve">“Dahil hindi naman siya basta nakatakas.” Ibinaba niya ang boses. “Ang ibig kong sabihin ay nakatakas nga siya, kitang-kita naman, narito siya sa mga repolyo, may mga mata naman ako sa mukha ko. Pero naisara ang gate pagkatapos. Naisara sa likod niya, galing sa labas, samantalang nakatayo siya sa harap nito. Tatlong beses na akong bumaba rito at natagpuang nakasara nang mahigpit ang gate at nasa maling panig nito ang isang reindeer, at sabihin mo sa akin, Ginang Claus, paano naisasara ng isang hayop ang trangka mula sa panig na wala naman siya, at sasabihin ko sa iyo ang paulit-ulit kong sinasabi sa batang si Fenn, na may kakaibang nangyayari sa bayang ito, may kakaibang nangyayari.”</w:t>
+      </w:r>
+    </w:p>
+    <w:p/>
+    <w:p>
+      <w:r>
+        <w:t xml:space="preserve">Tama naman siya, siyempre, bagama't hindi ko na sinabi iyon. Lumabas ako sa malamig na hardin at ipinatong ang aking palad sa mainit na balikat ni Dancer. Hinayaan niya ako, at medyo sumandal pa rito. Ayaw niyang magpaakay kahit isang pulgada kay Bram, pero dinala ko siyang pabalik sa kabila ng daan patungo sa kulungan nang walang kahirap-hirap. Bukas at karaniwan lang ang hitsura ng gate. Inakay ko siya papasok at tinrangkahan ko ito. Kaming tatlo ay tumayo at tiningnan ang trangka. Nanatili itong nakasara. Inilagay ni Dancer ang kanyang ilong sa ibabaw ng pinakataas na rehas at bumuga ng mahaba at mainit na hininga kina Bram at sa akin.</w:t>
       </w:r>
     </w:p>
     <w:p/>
@@ -2223,7 +2223,7 @@
     <w:p/>
     <w:p>
       <w:r>
-        <w:t xml:space="preserve">“Hindi rin ako pinapapasok, kung makakapagpagaan man iyon sa loob ko,” sabi ko sa kanya, at tila gumaan nga ang kanyang loob, ang maliit at makasariling ginhawa ng may karamay sa sama ng loob. Iniwan ko siya para mag-alala nang may kapakinabangan sa gate, na siyang gustong kalagayan ni Bram at walang masamang idinudulot, at pinuntahan ko ang aking asawa.</w:t>
+        <w:t xml:space="preserve">“Hindi rin ako pinapapasok, kung makakapagpagaan man iyon sa loob mo,” sabi ko sa kanya, at tila gumaan nga ang kanyang loob, ang maliit at makasariling ginhawa ng may karamay sa sama ng loob. Iniwan ko siya para mag-alala nang may kapakinabangan sa gate, na siyang gustong kalagayan ni Bram at walang masamang idinudulot, at pinuntahan ko ang aking asawa.</w:t>
       </w:r>
     </w:p>
     <w:p/>
@@ -2247,7 +2247,7 @@
     <w:p/>
     <w:p>
       <w:r>
-        <w:t xml:space="preserve">“Yung trangka,” ulit niya, at ang kasiyahan ay lumabo nang bahagya tungo sa isang bagay na mas seryoso. “Hinihila nito sila. Nararamdaman ng mga reindeer iyon bago pa man natin maramdaman. Noon pa man, mula pa noong una.” Lumabas siya at isinara ang pinto sa likuran niya, at nang lumayo siya rito ay lumabo ang mga gintong siwang. “Maglakad ka kasama ko. Sasabihin ko sa iyo ang kaya ko, na hindi naman marami, dahil hindi ko rin naman masyadong alam ang sa sarili ko. Pero nakuha mo na ang nararapat sa iyo.”</w:t>
+        <w:t xml:space="preserve">“Yung trangka,” ulit niya, at ang kasiyahan ay lumabo nang bahagya tungo sa isang bagay na mas seryoso. “Hinihila nito sila. Nararamdaman ng mga reindeer iyon bago pa man natin maramdaman. Noon pa man, mula pa noong una.” Lumabas siya at isinara ang pinto sa likuran niya, at nang lumayo siya rito ay lumabo ang mga gintong siwang. “Maglakad ka kasama ko. Sasabihin ko sa iyo ang kaya ko, na hindi naman marami, dahil hindi ko pa rin masyadong alam mismo. Pero karapat-dapat mong malaman ang nalalaman ko.”</w:t>
       </w:r>
     </w:p>
     <w:p/>
@@ -2259,7 +2259,7 @@
     <w:p/>
     <w:p>
       <w:r>
-        <w:t xml:space="preserve">“Sumama ito sa atin,” sabi niya. “Ang mahika. Alam mo ang bahaging iyon. Hindi kailanman naging sa Hilagang Polo iyon, ang Polo ay naging lugar lamang na kinaupuan nito. Isang dapugan na kininis nito sa napakahabang panahon, isang lugar upang manatili. At umalis kami, at sumama ito, dahil ito ay atin, o tayo ay sa kanya, hindi ko kailanman natiyak kung saang direksyon iyon tumatakbo. At dito ay wala itong dapugan. Walang kininis na lugar na mapagpapahingahan. Kaya nagkikislap ito.” Tumango siya palabas patungo sa bayan sa ibaba, kung saan ang mga ilaw ng pista ay nagsisimulang sumindi sa malalayong bubong, ginto kung saan dapat ay kulay kahel ang mga ito. “Mga maliliit na bagay, kadalasan. Mga ilaw na nagbabago ng kulay. Isang trangka na kusa ring bumubukas. Isang kalabasa na tinutubuan ng holly. Walang ginagawang masama, Jess. Hindi nito alam kung paano manakit. Para itong aso na nawalan ng amo, na lumilipat mula sa pinto patungo sa pinto sa buong kalye, umaasa sa bawat isa.”</w:t>
+        <w:t xml:space="preserve">“Sumama ito sa atin,” sabi niya. “Ang mahika. Alam mo ang bahaging iyon. Hindi kailanman naging sa Hilagang Polo iyon, ang Polo ay naging lugar lamang na kinaupuan nito. Isang apuyan na kininis nito sa napakahabang panahon, isang lugar upang manatili. At umalis kami, at sumama ito, dahil ito ay atin, o tayo ay sa kanya, hindi ko kailanman natiyak kung saang direksyon iyon tumatakbo. At dito ay wala itong apuyan. Walang kininis na lugar na mapagpapahingahan. Kaya nagkikislap ito.” Tumango siya palabas patungo sa bayan sa ibaba, kung saan ang mga ilaw ng pista ay nagsisimulang sumindi sa malalayong bubong, ginto kung saan dapat ay kulay kahel ang mga ito. “Mga maliliit na bagay, kadalasan. Mga ilaw na nagbabago ng kulay. Isang trangka na kusang nagsasara. Isang kalabasa na tinutubuan ng holly. Walang ginagawang masama, Jess. Hindi nito alam kung paano manakit. Para itong aso na nawalan ng amo, na lumilipat mula sa pinto patungo sa pinto sa buong kalye, umaasa sa bawat isa.”</w:t>
       </w:r>
     </w:p>
     <w:p/>
@@ -2283,7 +2283,7 @@
     <w:p/>
     <w:p>
       <w:r>
-        <w:t xml:space="preserve">Tumahimik siya sandali, ang aming hininga ay lumilikha ng usok sa dapit-hapon. “Isang lugar ito para maupuan nito,” sabi niya sa wakas, mahina. “Iyon lang ang sasabihin ko, at kahit iyon ay higit pa sa dapat kong sabihin, dahil hindi pa ito tapos, at hindi ko alam kung tatagal ito. Sinusubukan kong itayo ang bagay na hinahanap nito, Jess. Isang dapugan. Para tumigil na ito sa pag-ikot mula sa pinto hanggang sa pinto sa dilim at umuwi at humiga.” Pinisil niya ang aking kamay. “Huwag mong sabihin kahit kanino. Hindi dahil sikreto ito na dapat itago. Dahil ayaw kong sabihin ito nang malakas bago ko malaman na gagana ito.”</w:t>
+        <w:t xml:space="preserve">Tumahimik siya sandali, ang aming hininga ay lumilikha ng usok sa dapit-hapon. “Isang lugar ito para maupuan nito,” sabi niya sa wakas, mahina. “Iyon lang ang sasabihin ko, at kahit iyon ay higit pa sa dapat kong sabihin, dahil hindi pa ito tapos, at hindi ko alam kung tatagal ito. Sinusubukan kong itayo ang bagay na hinahanap nito, Jess. Isang apuyan. Para tumigil na ito sa pag-ikot mula sa pinto hanggang sa pinto sa dilim at umuwi at humiga.” Pinisil niya ang aking kamay. “Huwag mong sabihin kahit kanino. Hindi dahil sikreto ito na dapat itago. Dahil ayaw kong sabihin ito nang malakas bago ko malaman na gagana ito.”</w:t>
       </w:r>
     </w:p>
     <w:p/>
@@ -2307,7 +2307,7 @@
     <w:p/>
     <w:p>
       <w:r>
-        <w:t xml:space="preserve">“Sinusundan niya ang amoy,” sabi ko nang mabagal, pinapanood siyang nakaupo roon sa tabi ng nag-iisang kagamitan ng pandayan sa bahay. “Ang nota ay amoy pandayan, at pumunta siya at natagpuan ang nag-iisang bagay na pandayan sa kusinang ito, at sinasabi niya sa akin na pinag-ugnay niya ang mga ito. Hindi siya sumusundan ng tao, Nick. Hinding-hindi pa niya ginawa iyon. Isang lugar ang sinusundan niya. Saanman napunta ang notang iyon, iyon ang alam ng kanyang ilong.” Tiningnan ko ang aking matalinong ibon. “Pip. Ibinibigay mo sa akin ang sagot mula pa noong unang gabi, at hindi ako nakikinig.”</w:t>
+        <w:t xml:space="preserve">“Sinusundan niya ang amoy,” sabi ko nang mabagal, pinapanood siyang nakaupo roon sa tabi ng nag-iisang kagamitan ng pandayan sa bahay. “Ang nota ay amoy pandayan, at pumunta siya at natagpuan ang nag-iisang bagay na pandayan sa kusinang ito, at sinasabi niya sa akin na pinag-ugnay niya ang mga ito. Hindi siya sumusunod sa tao, Nick. Hinding-hindi pa niya ginawa iyon. Isang lugar ang sinusundan niya. Saanman napunta ang notang iyon, iyon ang alam ng kanyang ilong.” Tiningnan ko ang aking matalinong ibon. “Pip. Ibinibigay mo sa akin ang sagot mula pa noong unang gabi, at hindi ako nakikinig.”</w:t>
       </w:r>
     </w:p>
     <w:p/>
@@ -2319,7 +2319,7 @@
     <w:p/>
     <w:p>
       <w:r>
-        <w:t>Nagniningning ang mga ilaw na kulay ginto sa ibabaw ng Frost Falls, at sa labas ng kulungan ay nagtatayo ang aking asawa ng isang dapugan para sa isang mahikang walang tahanan. Tumayo ako nang kaunti pa sa aking mainit na kusina habang pasan ang bigat ng aking mahabang buhay. Pagkatapos ay bumalik ako sa trabaho.</w:t>
+        <w:t>Nagniningning ang mga ilaw na kulay ginto sa ibabaw ng Frost Falls, at sa labas ng kulungan ay nagtatayo ang aking asawa ng isang apuyan para sa isang mahikang walang tahanan. Tumayo ako nang kaunti pa sa aking mainit na kusina habang pasan ang bigat ng aking mahabang buhay. Pagkatapos ay bumalik ako sa trabaho.</w:t>
       </w:r>
     </w:p>
     <w:p>
@@ -2330,7 +2330,7 @@
     <w:p/>
     <w:p>
       <w:r>
-        <w:t xml:space="preserve">Ang Gusaling Panlungsod ay isang maarteng gusaling ladrilyo sa dulo ng liwasan, na may tore ng orasan na apat na minuto ang bilis simula pa noong maalaala ng sinuman. Pumunta ako roon noong Lunes kasama si Pip, para sa dalawang sadya, ang isa ay totoo at ang isa naman ay hindi masyadong totoo. Ang tunay na sadya ay upang idagdag ang pangalan ng bilog sa talaan ng mga katulong sa pagdiriwang, at upang itanong, nang walang ibang kinakatawan kundi ang bayan, kung ang Frost Falls ay makakahanap ng kaunting pondo para sa Historical Society bago tuluyang bumagsak ang bubong nito. Ang hindi gaanong totoong sadya ay ang tingnan, nang maayos at malapitan, si Vera Reed.</w:t>
+        <w:t xml:space="preserve">Ang Gusaling Pambayan ay isang maarteng gusaling ladrilyo sa dulo ng liwasan, na may tore ng orasan na apat na minuto ang bilis simula pa noong maalaala ng sinuman. Pumunta ako roon noong Lunes kasama si Pip, para sa dalawang sadya, ang isa ay totoo at ang isa naman ay hindi masyadong totoo. Ang tunay na sadya ay upang idagdag ang pangalan ng bilog sa talaan ng mga katulong sa pagdiriwang, at upang itanong, nang walang ibang kinakatawan kundi ang bayan, kung ang Frost Falls ay makakahanap ng kaunting pondo para sa Historical Society bago tuluyang bumagsak ang bubong nito. Ang hindi gaanong totoong sadya ay ang tingnan, nang maayos at malapitan, si Vera Reed.</w:t>
       </w:r>
     </w:p>
     <w:p/>
@@ -2372,7 +2372,7 @@
     <w:p/>
     <w:p>
       <w:r>
-        <w:t xml:space="preserve">“Isang marangal na layunin iyon,” sabi niya, nang matapos ako. “Magaling ang ginagawa ni Theo, sa sarili niyang paraan. Ngunit ang badyet ng bayan ay badyet ng bayan, Ginang Claus, at ang kasaysayan, patawarin ninyo ako sa pagsasabi nito, ay hindi nag-aararo ng mga daan sa Pebrero o nagpapanatili ng ningas ng mga ilaw sa lansangan. Ang Historical Society ay laging nagpapatakbo sa sarili nitong lakas. Sigurado akong makakahanap sila ng paraan para makatayo sa sarili nilang mga paa, palagi naman nilang ginagawa iyon.” Nagpakita siya ng ngiti, ang ngiti ng isang lalaking nagpasyang naging mapagbigay siya sa pamamagitan lamang ng pakikinig. “Siguro ang inyong pagdiriwang ay magiging isang magandang munting pondo para sa kanila. Nagiging emosyonal talaga ang mga tao sa ganitong panahon ng taon.”</w:t>
+        <w:t xml:space="preserve">“Isang marangal na layunin iyon,” sabi niya, nang matapos ako. “Magaling ang ginagawa ni Theo, sa sarili niyang paraan. Ngunit ang badyet ng bayan ay badyet ng bayan, Ginang Claus, at ang kasaysayan, patawarin ninyo ako sa pagsasabi nito, ay hindi nag-aararo ng mga daan sa Pebrero o nagpapanatili ng ningas ng mga ilaw sa lansangan. Ang Historical Society ay laging nagpapatakbo sa sarili nitong lakas. Sigurado akong makakahanap sila ng paraan para makatayo sa sarili nilang mga paa, palagi naman nilang ginagawa iyon.” Nagpakita siya ng ngiti, ang ngiti ng isang lalaking nagpasyang naging mapagbigay siya sa pamamagitan lamang ng pakikinig. “Siguro ang inyong pagdiriwang ay magiging isang magandang munting pangangalap ng pondo para sa kanila. Nagiging emosyonal talaga ang mga tao sa ganitong panahon ng taon.”</w:t>
       </w:r>
     </w:p>
     <w:p/>
@@ -2396,10 +2396,10 @@
         <w:rPr>
           <w:i/>
         </w:rPr>
-        <w:t xml:space="preserve">MGA KASULATAN. MGA PERMISO. MGA TALAAN NG BUWIS. MGA REKORD NG ARI-ARIAN, 1900–1950.</w:t>
-      </w:r>
-      <w:r>
-        <w:t xml:space="preserve"> Ang buong alaala ng papel kung sino ang nagmamay-ari ng ano sa Frost Falls, isang siglo nito, na nakatayo sa likod ng pagod na babaeng ito, at ang mga susi sa lahat ng iyon ay nasa singsing sa kaniyang balakang.</w:t>
+        <w:t xml:space="preserve">MGA TITULO. MGA PERMISO. MGA TALAAN NG BUWIS. MGA REKORD NG ARI-ARIAN, 1900–1950.</w:t>
+      </w:r>
+      <w:r>
+        <w:t xml:space="preserve"> Ang buong alaala ng papel kung sino ang nagmamay-ari ng ano sa Frost Falls, isang siglo nito, na nakatayo sa likod ng pagod na babaeng ito, at ang mga susi sa lahat ng iyon ay nasa susian sa kaniyang balakang.</w:t>
       </w:r>
     </w:p>
     <w:p/>
@@ -2435,7 +2435,7 @@
     <w:p/>
     <w:p>
       <w:r>
-        <w:t xml:space="preserve">Tumingin siya sa akin, at sa isang sandaling walang depensa, ang kaniyang pormal at pagod na mukha ay naging iba, nag-iingat, halos naipit sa sulok, bago niya naibalik ang kaniyang kapormalan na parang takip sa ibabaw ng palayok. “Wala akong alam tungkol sa mga Blackburn,” sabi niya, na isang kakaibang bagay na sabihin habang may isang Blackburn na nakaupo anim na talampakan ang layo sa likod ng kaniyang bukas na pinto at ang mga kasulatan ng mga Blackburn ay pumupuno sa mga drawer sa likod niya. “Kagawaran iyon ni Theo. Ang Historical Society. Itinatago ko lamang ang mga rekord. Hindi ko binabasa ang mga ito.” Inusod niya ang talaan ng pagdiriwang sa ibabaw ng patungan patungo sa akin. “Ayan. Naidagdag na ang bilog. Mayroon pa bang iba?”</w:t>
+        <w:t xml:space="preserve">Tumingin siya sa akin, at sa isang sandaling walang depensa, ang kaniyang pormal at pagod na mukha ay naging iba, nag-iingat, halos naipit sa sulok, bago niya naibalik ang kaniyang kapormalan na parang takip sa ibabaw ng palayok. “Wala akong alam tungkol sa mga Blackburn,” sabi niya, na isang kakaibang bagay na sabihin habang may isang Blackburn na nakaupo anim na talampakan ang layo sa likod ng kaniyang bukas na pinto at ang mga titulo ng mga Blackburn ay pumupuno sa mga drawer sa likod niya. “Kagawaran iyon ni Theo. Ang Historical Society. Itinatago ko lamang ang mga rekord. Hindi ko binabasa ang mga ito.” Inusod niya ang talaan ng pagdiriwang sa ibabaw ng patungan patungo sa akin. “Ayan. Naidagdag na ang bilog. Mayroon pa bang iba?”</w:t>
       </w:r>
     </w:p>
     <w:p/>
@@ -2459,7 +2459,7 @@
     <w:p/>
     <w:p>
       <w:r>
-        <w:t xml:space="preserve">Umabot sa kaniya ang kabaitan kung saan hindi umabot ang tanong. Bumaba nang kaunti ang kaniyang mga balikat, at nag-alinlangan ang kaniyang mukha na tila maluluha bago niya ito napigilan. “Ganito talaga sa panahong ito,” sabi niya. “At nagbabayad ang alkalde ng sahod para sa bayan na katumbas ng trabaho ng isang lungsod, at hindi kailanman sapat ang katapusan ng buwan. Hindi para sa sinuman ngayong taon. Ang mga bayarin ay hindi nagbabayad sa sarili nila.” Naglabas siya ng maliit at gasgas na tawa na walang halong saya. “Walang mga bayarin ng sinuman ang nagbabayad sa sarili ngayong taon, hindi ba, Ginang Claus.”</w:t>
+        <w:t xml:space="preserve">Umabot sa kaniya ang kabaitan kung saan hindi umabot ang tanong. Bumaba nang kaunti ang kaniyang mga balikat, at nag-alinlangan ang kaniyang mukha na tila maluluha bago niya ito napigilan. “Ganito talaga sa panahong ito,” sabi niya. “At nagbabayad ang alkalde ng sahod na pang-maliit na bayan para sa trabahong pang-lungsod, at hindi kailanman sapat pagsapit ng katapusan ng buwan. Hindi para sa sinuman ngayong taon. Ang mga bayarin ay hindi nagbabayad sa sarili nila.” Naglabas siya ng maliit at gasgas na tawa na walang halong saya. “Walang mga bayarin ng sinuman ang nagbabayad sa sarili ngayong taon, hindi ba, Ginang Claus.”</w:t>
       </w:r>
     </w:p>
     <w:p/>
@@ -2477,13 +2477,13 @@
     <w:p/>
     <w:p>
       <w:r>
-        <w:t xml:space="preserve">Isang babaeng may problema sa pera na bumabagabag sa kaniya. Isang babaeng may hawak ng mga susi sa sandaang taon ng kung sinong nagmamay-ari ng ano, ang kasulatan para sa Winter Wonderland Inn sa isang dako ng mismong mga drawer na iyon, at kung ano man ang itinala ng bayan noong 1924 nang mawala ang isang brotse mula sa isang dakilang bahay, kung mayroon mang itinala. Isang babaeng tumigas ang katawan sa mga salitang rekord ng ari-arian at naging madaldal sa pagsasalita nang sandaling sabihin ko ang pangalang Blackburn, pagkatapos ay sinabi sa akin, habang nakatayo ang mga rekord sa kaniyang likuran, na hindi niya kailanman binabasa ang mga ito.</w:t>
-      </w:r>
-    </w:p>
-    <w:p/>
-    <w:p>
-      <w:r>
-        <w:t xml:space="preserve">Hindi ko alam kung ano ang ibig sabihin noon. Maaaring wala itong ibig sabihin kundi isang pagod na babae na ayaw sa mga mapang-usisang tanong sa isang mahabang araw. Ngunit ang aking apela para sa Historical Society ay nabigo, eksakto tulad ng sinabi ni Dot na mangyayari, at ang Historical Society ay patuloy na nawawalan ng liwanag. At ngayon ay may dalawang tao sa Frost Falls na hindi ko marinig ang pangalang Blackburn nang hindi naiisip. Ang isa sa kanila ay nagpapatakbo ng arkibo kung saan nawala ang mga liham.</w:t>
+        <w:t xml:space="preserve">Isang babaeng may problema sa pera na bumabagabag sa kaniya. Isang babaeng may hawak ng mga susi sa sandaang taon ng kung sinong nagmamay-ari ng ano, ang titulo ng Winter Wonderland Inn sa isang dako ng mismong mga drawer na iyon, at kung ano man ang itinala ng bayan noong 1924 nang mawala ang isang brotse mula sa isang dakilang bahay, kung mayroon mang itinala. Isang babaeng tumigas ang katawan sa mga salitang rekord ng ari-arian at naging madaldal sa pagsasalita nang sandaling sabihin ko ang pangalang Blackburn, pagkatapos ay sinabi sa akin, habang nakatayo ang mga rekord sa kaniyang likuran, na hindi niya kailanman binabasa ang mga ito.</w:t>
+      </w:r>
+    </w:p>
+    <w:p/>
+    <w:p>
+      <w:r>
+        <w:t xml:space="preserve">Hindi ko alam kung ano ang ibig sabihin noon. Maaaring wala itong ibig sabihin kundi isang pagod na babae na ayaw sa mga mapang-usisang tanong sa isang mahabang araw. Ngunit ang aking apela para sa Historical Society ay nabigo, eksakto tulad ng sinabi ni Dot na mangyayari, at ang Historical Society ay patuloy na nawawalan ng liwanag. At ngayon ay may dalawang tao sa Frost Falls na hindi ko marinig ang pangalang Blackburn nang hindi sila naiisip. Ang isa sa kanila ay nagpapatakbo ng arkibo kung saan nawala ang mga liham.</w:t>
       </w:r>
     </w:p>
     <w:p/>
@@ -2500,7 +2500,7 @@
     <w:p/>
     <w:p>
       <w:r>
-        <w:t>Nagpulong ang lupon ng Historical Society nang Lunes ng gabi, sa malamig na silid sa likod sa ilalim ng sirang bubong. Hiniling sa akin ni Claire na sumama sa kanya, kalahati dahil nais ng Gazette na magkaroon ng pamilyar na mukha sa silid at kalahati, hinala ko, dahil nahulaan na niya ang higit pa sa kanyang sinabi tungkol sa aking dinala, at nais niyang makita ko mismo kung gaano ito kalala.</w:t>
+        <w:t>Nagpulong ang lupon ng Historical Society nang Lunes ng gabi, sa malamig na silid sa likod sa ilalim ng sirang bubong. Hiniling sa akin ni Claire na sumama sa kanya, kalahati dahil nais ng Gazette na magkaroon ng pamilyar na mukha sa silid at kalahati, hinala ko, dahil nahulaan na niya ang higit pa sa kanyang sinabi tungkol sa aking dinadala, at nais niyang makita ko mismo kung gaano ito kalala.</w:t>
       </w:r>
     </w:p>
     <w:p>
@@ -2525,7 +2525,7 @@
     </w:p>
     <w:p>
       <w:r>
-        <w:t xml:space="preserve">Ang grant mula sa bayan, binawasan ng sangkatlo. Ang bubong, na tinatayang may halagang nagpakilabot sa isa sa mga matatandang lalaki. Ang boiler, na kinondena ng lalaking pumunta upang suriin ito—na sinabi raw, ayon kay Theo, na nagulat siya na umabot pa ito noong nakaraang taglamig. Ang pondong pangmatagalan, sa kaunting natitira nito, ay kinuha sa loob ng dalawang sunod-sunod na taon upang panatilihing nakaandap ang mga ilaw, at halos ubos na. Ang mga bayarin sa pagiging miyembro, na sinabi ni Theo habang nakatingin sa kanyang pahina at hindi sa silid, ay sumasaklaw sa “humigit-kumulang sa halaga ng kape.”</w:t>
+        <w:t xml:space="preserve">Ang grant mula sa bayan, binawasan ng sangkatlo. Ang bubong, na tinatayang may halagang nagpakilabot sa isa sa mga matatandang lalaki. Ang boiler, na kinondena ng lalaking pumunta upang suriin ito—na sinabi raw, ayon kay Theo, na nagulat siya na umabot pa ito noong nakaraang taglamig. Ang pondong pangmatagalan, sa kaunting natitira nito, ay kinuha sa loob ng dalawang sunod-sunod na taon upang panatilihing nakasindi ang mga ilaw, at halos ubos na. Ang mga bayarin sa pagiging miyembro, na sinabi ni Theo habang nakatingin sa kanyang pahina at hindi sa silid, ay sumasaklaw sa “humigit-kumulang sa halaga ng kape.”</w:t>
       </w:r>
     </w:p>
     <w:p>
@@ -2535,12 +2535,12 @@
     </w:p>
     <w:p>
       <w:r>
-        <w:t xml:space="preserve">“Iyon ang sinasabi ng aritmetika.” Inalis ni Theo ang kanyang salamin at idiniin ang kanyang mga daliri sa tulay ng kanyang ilong, at sa isang saglit ay nanginig ang maingat na boses. “Nag-aplay ako sa lahat ng dako. Nais kong malaman ninyong lahat iyon. Bawat grant, bawat pundasyon, bawat pondo sa tatlong estado. Mayroon akong isang folder ng mga pagtanggi. Maaari kong mapapelan ang silid na ito ng mga iyon, at kahit papaano ay tuyo sana ang silid.” Ang ilan sa kanila ay tumawa, ang malungkot at walang magawang pagtawa ng mga taong nasa dulo na ng kanilang mga pagpipilian. “Hindi tutulong ang bayan. Pumunta ako mismo sa alkalde noong nakaraang tagsibol, at si Ginang Claus dito ay muling pumunta kaninang umaga, at sinabi niya ang parehong bagay na palagi niyang sinasabi. Ang kasaysayan ay hindi nag-aararo ng mga kalsada.” Ibinaba niya ang kanyang salamin sa kanyang mga papel. “Hindi ko na alam ang iba pang susubukan. Sinubukan kong maging makatwiran. Sinubukan kong maging kahabag-habag. Hindi ako masyadong mapagmataas upang sabihin sa inyo na sinubukan kong maging kahabag-habag, sa pamamagitan ng pagsulat, sa isang pundasyon sa lungsod, at nagpadala sila pabalik ng isang napakabait na liham na nagsasabing hindi.”</w:t>
-      </w:r>
-    </w:p>
-    <w:p>
-      <w:r>
-        <w:t xml:space="preserve">Pinagmasdan ko siya habang sinasabi niya iyon. Nakakita ako ng isang lalaking nalulunod nang lantaran, sa isang malamig na silid, sa harap ng mga taong nagmamahal sa bagay na mahal niya, at sinasabi ito nang malakas, habang ang tubig ay nasa baba na niya. Pumunta ako sa pagpupulong na iyon na kalahati pa ring umaasa na ang lalaking pinaghihinalaan ko ay mapapatunayan, sa paanong paraan, na ibang tao kaysa sa isang ito. Hindi. Siya nga talaga ang taong ito. Isang mabuting lalaki sa pinakadulo ng kanyang pasensya, na pinapanood ang Historical Society na inialay niya ang kanyang buhay na bumagsak dahil sa kakulangan ng pera, habang ang mantsa ay kumakalat sa kisame at sinasalo ng timbang lata ang ulan.</w:t>
+        <w:t xml:space="preserve">“Iyon ang sinasabi ng aritmetika.” Inalis ni Theo ang kanyang salamin at idiniin ang kanyang mga daliri sa tulay ng kanyang ilong, at sa isang saglit ay nanginig ang maingat na boses. “Nag-aplay ako sa lahat ng dako. Nais kong malaman ninyong lahat iyon. Bawat grant, bawat pundasyon, bawat pondo sa tatlong estado. Mayroon akong isang folder ng mga pagtanggi. Maaari kong idikit ang mga iyon sa buong dingding ng silid na ito, at kahit papaano ay tuyo sana ang silid.” Ang ilan sa kanila ay tumawa, ang malungkot at walang magawang pagtawa ng mga taong nasa dulo na ng kanilang mga pagpipilian. “Hindi tutulong ang bayan. Pumunta ako mismo sa alkalde noong nakaraang tagsibol, at si Ginang Claus dito ay muling pumunta kaninang umaga, at sinabi niya ang parehong bagay na palagi niyang sinasabi. Ang kasaysayan ay hindi nag-aararo ng mga kalsada.” Ibinaba niya ang kanyang salamin sa kanyang mga papel. “Hindi ko na alam ang iba pang susubukan. Sinubukan kong maging makatwiran. Sinubukan kong maging kahabag-habag. Hindi ako masyadong mapagmataas upang sabihin sa inyo na sinubukan kong maging kahabag-habag, sa pamamagitan ng pagsulat, sa isang pundasyon sa lungsod, at nagpadala sila pabalik ng isang napakabait na liham na nagsasabing hindi.”</w:t>
+      </w:r>
+    </w:p>
+    <w:p>
+      <w:r>
+        <w:t xml:space="preserve">Pinagmasdan ko siya habang sinasabi niya iyon. Nakakita ako ng isang lalaking nalulunod nang lantaran, sa isang malamig na silid, sa harap ng mga taong nagmamahal sa bagay na mahal niya, at sinasabi ito nang malakas, habang ang tubig ay nasa baba na niya. Pumunta ako sa pagpupulong na iyon na kalahati pa ring umaasa na ang lalaking pinaghihinalaan ko ay mapapatunayan, sa paanong paraan, na ibang tao kaysa sa isang ito. Hindi. Siya nga talaga ang taong ito. Isang mabuting lalaki na wala nang makapitan, na pinapanood ang Historical Society na inialay niya ang kanyang buhay na bumagsak dahil sa kakulangan ng pera, habang ang mantsa ay kumakalat sa kisame at sinasalo ng timbang lata ang ulan.</w:t>
       </w:r>
     </w:p>
     <w:p>
@@ -2550,17 +2550,17 @@
     </w:p>
     <w:p>
       <w:r>
-        <w:t>Naroon din si Vera, sa sulok, na kumukuha ng mga minuting pulong. Nagpadala ang opisina ng alkalde ng isang tao upang itala ang mga pagpupulong ng mga katawan na pinondohan nito, at ang taong iyon ay si Vera, kasama ang kanyang steno pad at ang kanyang nakabotones na kardigan, isinusulat ang lahat ng ito sa kanyang malinis at mabilis na kamay. Pinagmasdan ko rin siya, nang magawa ko ito nang hindi napapansin. Isinulat niya ang mga numero nang walang ekspresyon. Ngunit nang sabihin ni Theo ang bahagi tungkol sa pagiging kahabag-habag, tungkol sa mabait na liham na nagsabi ng hindi, huminto ang kanyang pluma sandali. Humigpit ang kanyang panga. Tumingin siya sa kayumangging mantsa sa kisame, at ang dumaan sa kanyang mukha ay malapit sa panaghoy, o takot, o pareho nang sabay. Hindi ko maisip kung ano ang maaaring ipalungkot o ikatakot ng isang babae sa isang pagpupulong ng lupon kung saan nandoon lamang siya upang kumuha ng mga minuting pulong.</w:t>
-      </w:r>
-    </w:p>
-    <w:p>
-      <w:r>
-        <w:t xml:space="preserve">Nag-usap ang lupon nang paikot-ikot sa loob ng isang oras, nagmumungkahi ng mga pagbebenta ng tinapay at isang kampanya sa pagsulat ng liham, ang bawat ideya ay mas maliit kaysa sa butas na nilalayon nitong punan. Alam ito ng buong silid at sinabi pa rin ang mga maliliit na may pag-asang bagay, dahil ang pananahimik ay mas masahol pa. Sa wakas ay bumoto sila upang panatilihing bukas ang mga pinto sa buong bagong taon at upang “galugarin ang lahat ng mga opsyon.” Nagtapos ang pulong at lumabas sila sa lamig. Ang urn ng kape ay sumagitsit at tumahimik, at nanatili si Theo sa likod upang iligpit ang mga natitiklop na upuan nang mag-isa.</w:t>
-      </w:r>
-    </w:p>
-    <w:p>
-      <w:r>
-        <w:t xml:space="preserve">Umalis si Claire upang isulat ang kanyang mabait at malungkot na kuwento na hindi magpapatinag ng anuman. Nanatili ako upang tulungan si Theo, at nagpatong-patong ng mga upuan kasama ang lalaking nagsimula ko nang paghinalaan na nangingikil sa aking kaibigan. Nagpasalamat siya sa akin para doon nang tatlong beses. Pagkatapos ay ikinuwento niya sa akin ang tungkol sa panahon noong 1936 kung kailan ang isang baha ay halos kumuha sa mga orihinal na talaan ng bayan, at isang dosenang mamamayan ang bumuo ng isang kadena upang dalhin ang mga kahon sa mataas na lupa. Iyon ang bayan sa pinakamahusay nito, aniya, ang mga taong dinala ang nakaraan sa kaligtasan gamit ang kanilang mga kamay, at naisip niya ito sa mga masasamang gabi.</w:t>
+        <w:t>Naroon din si Vera, sa sulok, na kumukuha ng katitikan ng pulong. Nagpadala ang opisina ng alkalde ng isang tao upang itala ang mga pagpupulong ng mga samahang pinopondohan nito, at ang taong iyon ay si Vera, kasama ang kanyang steno pad at ang kanyang nakabotones na kardigan, isinusulat ang lahat ng ito sa kanyang malinis at mabilis na sulat-kamay. Pinagmasdan ko rin siya, nang magawa ko ito nang hindi napapansin. Isinulat niya ang mga numero nang walang ekspresyon. Ngunit nang sabihin ni Theo ang bahagi tungkol sa pagiging kahabag-habag, tungkol sa mabait na liham na nagsabi ng hindi, huminto ang kanyang pluma sandali. Humigpit ang kanyang panga. Tumingin siya sa kayumangging mantsa sa kisame, at ang dumaan sa kanyang mukha ay malapit sa panaghoy, o takot, o pareho nang sabay. Hindi ko maisip kung ano ang maaaring ipalungkot o ikatakot ng isang babae sa isang pagpupulong ng lupon kung saan nandoon lamang siya upang kumuha ng katitikan ng pulong.</w:t>
+      </w:r>
+    </w:p>
+    <w:p>
+      <w:r>
+        <w:t xml:space="preserve">Nag-usap ang lupon nang paikot-ikot sa loob ng isang oras, nagmumungkahi ng mga pagbebenta ng tinapay at isang kampanya sa pagsulat ng liham, ang bawat ideya ay mas maliit kaysa sa butas na nilalayon nitong punan. Alam ito ng buong silid at sinabi pa rin ang mga maliliit na may pag-asang bagay, dahil ang pananahimik ay mas masahol pa. Sa wakas ay bumoto sila upang panatilihing bukas ang mga pinto hanggang sa bagong taon at upang “galugarin ang lahat ng mga opsyon.” Nagtapos ang pulong at lumabas sila sa lamig. Ang urn ng kape ay sumagitsit at tumahimik, at nanatili si Theo sa likod upang iligpit ang mga natitiklop na upuan nang mag-isa.</w:t>
+      </w:r>
+    </w:p>
+    <w:p>
+      <w:r>
+        <w:t xml:space="preserve">Umalis si Claire upang isulat ang kanyang mabait at malungkot na kuwento na hindi magpapatinag ng anuman. Nanatili ako upang tulungan si Theo, at nagpatong-patong ng mga upuan kasama ang lalaking nagsimula ko nang paghinalaan na nangingikil sa aking kaibigan. Nagpasalamat siya sa akin para doon nang tatlong beses. Pagkatapos ay ikinuwento niya sa akin ang tungkol sa panahon noong 1936 kung kailan ang isang baha ay halos kumuha sa mga orihinal na talaan ng bayan, at isang dosenang mamamayan ang bumuo ng isang kadena upang dalhin ang mga kahon sa mataas na lupa. Iyon ang bayan sa pinakamahusay nito, aniya, ang mga taong dinala ang nakaraan sa kaligtasan gamit ang kanilang mga kamay, at iniisip niya ito tuwing masasamang gabi.</w:t>
       </w:r>
     </w:p>
     <w:p>
@@ -2581,7 +2581,7 @@
     <w:p/>
     <w:p>
       <w:r>
-        <w:t xml:space="preserve">Ang Frost Fitness ang pinakabagong negosyo sa Evergreen Avenue, pawang salamin at makinang at matigas na liwanag, na may kaluskos ng malinis na goma sa ilalim ng mga paa. Ibinaon ni Jamal Washington ang sarili sa pista, tulad ng ginagawa niya sa lahat ng bagay. Nagbitay siya ng mga pilak na papel na snowflake mula sa kisame at naglagay ng mga puting ilaw sa bawat salamin, kaya ang buong lugar ay kumikinang tulad ng loob ng isang inalog na bola ng niyebe. May tumutugtog na sound system sa isang dako na may kumpas na naramdaman mo sa sahig. Siya ay nasa mesa sa harap nang pumasok ako, at ang kanyang mukha ay bumukas sa malaki at mainit na ngiti na kalahati ng dahilan kung bakit naging matagumpay ang lugar.</w:t>
+        <w:t xml:space="preserve">Ang Frost Fitness ang pinakabagong negosyo sa Evergreen Avenue, pawang salamin at makinang at matigas na liwanag, na may kaluskos ng malinis na goma sa ilalim ng mga paa. Ibinaon ni Jamal Washington ang sarili sa pista, tulad ng ginagawa niya sa lahat ng bagay. Nagsabit siya ng mga pilak na papel na hugis-butil ng niyebe mula sa kisame at naglagay ng mga puting ilaw sa bawat salamin, kaya ang buong lugar ay kumikinang tulad ng loob ng isang inalog na bola ng niyebe. May tumutugtog na sound system sa isang dako na may kumpas na nararamdaman mo sa sahig. Siya ay nasa mesa sa harap nang pumasok ako, at ang kanyang mukha ay bumukas sa malaki at mainit na ngiti na kalahati ng dahilan kung bakit naging matagumpay ang lugar.</w:t>
       </w:r>
     </w:p>
     <w:p/>
@@ -2623,7 +2623,7 @@
     <w:p/>
     <w:p>
       <w:r>
-        <w:t xml:space="preserve">Nanatili ang ngiti, ngunit may kapalit iyon sa kanya. “Mabagal,” pag-amin niya. “Nakatengga ang bangko sa utang. Pangatlong buwan na ngayon. Sa tuwing iniisip kong naroon na tayo, gusto nila ng isa pang pormularyo, isa pang numero, isa pang buwan ng mga pahayag.” Tumingin siya sa iba, sa ibabaw ng maliwanag na bagong sahig. “Hindi ako magsisinungaling sa inyo, Ginang Claus, mahirap. Inilagay ko ang lahat sa lugar na ito. Lahat ng mayroon ako at higit pa sa wala ako. May mga gabi na ginagawa ko ang matematika at pagkatapos ay nahihiga ako roon at hindi natutulog.”</w:t>
+        <w:t xml:space="preserve">Nanatili ang ngiti, ngunit may kapalit iyon sa kanya. “Mabagal,” pag-amin niya. “Nakatengga ang bangko sa utang. Pangatlong buwan na ngayon. Sa tuwing iniisip kong naroon na tayo, gusto nila ng isa pang pormularyo, isa pang numero, isa pang buwan ng mga pahayag.” Iniwas niya ang kanyang tingin, sa ibabaw ng maliwanag na bagong sahig. “Hindi ako magsisinungaling sa inyo, Ginang Claus, mahirap. Inilagay ko ang lahat sa lugar na ito. Lahat ng mayroon ako at marami pang wala naman sa akin. May mga gabi na ginagawa ko ang matematika at pagkatapos ay nahihiga ako roon at hindi natutulog.”</w:t>
       </w:r>
     </w:p>
     <w:p/>
@@ -2635,19 +2635,19 @@
     <w:p/>
     <w:p>
       <w:r>
-        <w:t xml:space="preserve">“Oo nga.” Huminga siya nang malalim, at pagkatapos, dahil sa malamang na pinalaki siya ng kanyang ina na huwag magreklamo nang walang nakakabit na plano, itinayo niya ang kanyang mga balikat. “Ngunit narito ang ginagawa ko tungkol dito, yamang nagtanong kayo, at mas gusto kong sabihin sa inyo nang tapat kaysa mag-alala kayo. Kinuha ko ang kontrata sa seguridad ng pista. Magdamag, buong katapusan ng linggo, binabantayan ang mga tolda at ang entablado at ang kagamitan upang walang mawala sa dilim. At idinagdag ko ang mga maagang klase, alas-singko medya ng boot camp, bago pa man magsimula ang regular na araw.” Nagkibit-balikat siya, at ang ngiti ay bumalik nang mas totoo sa pagkakataong ito. “Hindi mo inaayos ang problema sa pera sa pamamagitan ng pag-asa lamang, Ginang Claus. Inaayos mo ito sa pamamagitan ng pagtrabaho nang mas maraming oras kaysa sa taglay ng problema. Ito lamang ang paraang alam ko at hindi pa ako binigo nito, mabagal lamang ito at masakit.”</w:t>
-      </w:r>
-    </w:p>
-    <w:p/>
-    <w:p>
-      <w:r>
-        <w:t xml:space="preserve">Umupo ako roon kasama niyon tulad ng pag-upo ko sa dalawampung dolyar ni Sam. Narito ang isang lalaking baon sa utang, na may bawat dahilan sa mundo at bawat pagkakataon bukod pa rito. Ang tugon niya rito ay ang magbantay sa pista ng bayan buong magdamag para sa isang bayad at turuan ang mga lola na gumawa ng mga lunge sa alas-singko medya ng umaga. Si Jamal ay nagtatrabaho ng tatlong trabaho upang makaahon sa kanyang hukay sa tapat, nakakapagod, pulgada-pulgadang paraan, at hindi iyon kasya sa isang nota ng pangingikil na humihingi ng kalahating milyong dolyar. Ang matematika ay hindi nagtugma. Kung si Jamal Washington ay may anumang paraan upang makalikha ng ganitong uri ng pera mula sa isang lihim, hindi sana niya itatakda ang kanyang alarma sa alas-singko.</w:t>
-      </w:r>
-    </w:p>
-    <w:p/>
-    <w:p>
-      <w:r>
-        <w:t>Ngunit nilayon ko siyang paghinalaan nang patas, at nangahulugan iyon ng pagsusuri kahit pagkatapos na halos magpasya ang aking puso. Kaya tinanong ko ang huling bagay na pinunta ko upang itanong, magaan, tulad ng walang kuwentang usapan.</w:t>
+        <w:t xml:space="preserve">“Oo nga.” Huminga siya nang malalim, at pagkatapos, dahil sa malamang na pinalaki siya ng kanyang ina na huwag magreklamo nang walang nakakabit na plano, itinuwid niya ang kanyang mga balikat. “Ngunit narito ang ginagawa ko tungkol dito, yamang nagtanong kayo, at mas gusto kong sabihin sa inyo nang tapat kaysa mag-alala kayo. Kinuha ko ang kontrata sa seguridad ng pista. Magdamag, buong katapusan ng linggo, binabantayan ang mga tolda at ang entablado at ang kagamitan upang walang mawala sa dilim. At idinagdag ko ang mga maagang klase, alas-singko medya ng boot camp, bago pa man magsimula ang regular na araw.” Nagkibit-balikat siya, at ang ngiti ay bumalik nang mas totoo sa pagkakataong ito. “Hindi mo inaayos ang problema sa pera sa pamamagitan ng pag-asa lamang, Ginang Claus. Inaayos mo ito sa pamamagitan ng pagtrabaho nang mas maraming oras kaysa sa taglay ng problema. Ito lamang ang paraang alam ko at hindi pa ako binigo nito, mabagal lamang ito at masakit.”</w:t>
+      </w:r>
+    </w:p>
+    <w:p/>
+    <w:p>
+      <w:r>
+        <w:t xml:space="preserve">Pinag-isipan ko iyon tulad ng pagninilay ko sa dalawampung dolyar ni Sam. Narito ang isang lalaking baon sa utang, na may bawat dahilan sa mundo at bawat pagkakataon bukod pa rito. Ang tugon niya rito ay ang magbantay sa pista ng bayan buong magdamag para sa isang bayad at turuan ang mga lola na gumawa ng mga lunge sa alas-singko medya ng umaga. Si Jamal ay nagtatrabaho ng tatlong trabaho upang makaahon sa kanyang hukay sa tapat, nakakapagod, pulgada-pulgadang paraan, at hindi iyon kasya sa isang nota ng pangingikil na humihingi ng kalahating milyong dolyar. Ang matematika ay hindi nagtugma. Kung si Jamal Washington ay may anumang paraan upang makalikha ng ganitong uri ng pera mula sa isang lihim, hindi sana niya itatakda ang kanyang alarma sa alas-singko.</w:t>
+      </w:r>
+    </w:p>
+    <w:p/>
+    <w:p>
+      <w:r>
+        <w:t>Ngunit nilayon ko siyang paghinalaan nang patas, at nangahulugan iyon ng pagsusuri kahit pagkatapos na halos magpasya ang aking puso. Kaya tinanong ko ang huling bagay na pinunta ko upang itanong, magaan, tulad ng karaniwang kuwentuhan.</w:t>
       </w:r>
     </w:p>
     <w:p/>
@@ -2665,7 +2665,7 @@
     <w:p/>
     <w:p>
       <w:r>
-        <w:t xml:space="preserve">Sinabi niya ito nang magaan, walang kamalay-malay na may ibinigay siya sa akin, at pinanatili ko ang aking mukha na kalmado sa maliit at malinis na pag-click na ginawa nito sa loob ko. Hindi niya binasa ang mga liham. Dinala niya ang mga kahon habang nakatutok ang kanyang mga mata sa kanyang mga paa. Anuman ang nabasa ng mangingikil sa mga papel ng Blackburn, ang brotse, ang bato, ang sanglaan, kailanman ay hindi iyon nailagay ni Jamal sa harap ng kanyang mga mata. Hawak niya ito sa kanyang mga bisig, nakakulong sa isang kahon, at hindi kailanman tumingin sa loob.</w:t>
+        <w:t xml:space="preserve">Sinabi niya ito nang magaan, walang kamalay-malay na may ibinigay siya sa akin, at pinanatili ko ang aking mukha na kalmado sa maliit at malinis na lagitik na ginawa nito sa loob ko. Hindi niya binasa ang mga liham. Dinala niya ang mga kahon habang nakatutok ang kanyang mga mata sa kanyang mga paa. Anuman ang nabasa ng mangingikil sa mga papel ng Blackburn, ang brotse, ang bato, ang sanglaan, kailanman ay hindi iyon nailagay ni Jamal sa harap ng kanyang mga mata. Hawak niya ito sa kanyang mga bisig, nakakulong sa isang kahon, at hindi kailanman tumingin sa loob.</w:t>
       </w:r>
     </w:p>
     <w:p/>
@@ -2677,7 +2677,7 @@
     <w:p/>
     <w:p>
       <w:r>
-        <w:t xml:space="preserve">“Mabuti siyang tao.” Lumambot ang ngiti. “Nag-aalala nang husto sa lugar na iyon, gayunpaman, sa buong panahon. Makikita mo iyon sa kanya. Parang ang gusali ay isang may sakit na kamag-anak na binabantayan niya. Titigil siya sa kalagitnaan ng pagsasabi sa akin kung saan ilalagay ang isang lalagyan at tititigan na lamang ang mantsa ng tubig sa kisame ng silid sa likod na parang personal siyang pinapatay nito.” Umiling siya. “Sana may tumulong sa kanya. Bibigyan ko siya ng pera nang mag-isa kung mayroon ako, ngunit ako ang pinakawalang-lugar na tao sa bayang ito na hingan ng pera ngayong taon.”</w:t>
+        <w:t xml:space="preserve">“Mabuti siyang tao.” Lumambot ang ngiti. “Nag-aalala nang husto sa lugar na iyon, gayunpaman, sa buong panahon. Makikita mo iyon sa kanya. Parang ang gusali ay isang may sakit na kamag-anak na binabantayan niya. Titigil siya sa kalagitnaan ng pagsasabi sa akin kung saan ilalagay ang isang lalagyan at tititigan na lamang ang mantsa ng tubig sa kisame ng silid sa likod na parang personal siyang pinapatay nito.” Umiling siya. “Sana may tumulong sa kanya. Ako mismo ang magbibigay sa kanya ng pera kung mayroon ako, ngunit ako ang huling tao sa bayang ito na dapat hingan ng pera ngayong taon.”</w:t>
       </w:r>
     </w:p>
     <w:p/>
@@ -2689,19 +2689,19 @@
     <w:p/>
     <w:p>
       <w:r>
-        <w:t>Iniwan ko siya sa kanyang kumikinang na gym at sa kanyang pintuang may plastik na silyo. Kami ni Pip ay lumabas sa lamig. Sa isang lugar sa pagitan ng pinto at ng kanto, inalis ko si Jamal Washington sa listahan sa aking ulo, nang mahinahon, tulad ng pagbaba mo ng isang bagay na masaya kang natapos nang dalhin. Tatlong trabaho at walang mga lihim sa kanya. Ang problema sa pera ay hinarap nang harapan sa sikat ng araw kung saan makikita ng lahat.</w:t>
-      </w:r>
-    </w:p>
-    <w:p/>
-    <w:p>
-      <w:r>
-        <w:t>Malinis siya. Ang katiyakan nito ay nanirahan sa akin nang malinis, at dalawang bagay ang ginawa nito nang sabay. Pinagaan nito ang loob ko, dahil gusto ko si Jamal at ayaw kong siya iyon.</w:t>
-      </w:r>
-    </w:p>
-    <w:p/>
-    <w:p>
-      <w:r>
-        <w:t>At inalala ako nito, dahil ang bawat pangalan na inilagay ko ay nagpapaikli sa listahan. Sa paglakad pauwi sa gintong-liwanag na lamig, malinaw kong nakita kung saan nagsisimulang ituro ang maikling listahan, at hindi ko nagustuhan ang direksyon kahit kaunti.</w:t>
+        <w:t>Iniwan ko siya sa kanyang kumikinang na gym at sa kanyang pintuang tinakpan ng plastik. Kami ni Pip ay lumabas sa lamig. Sa isang lugar sa pagitan ng pinto at ng kanto, inalis ko si Jamal Washington sa listahan sa aking ulo, nang mahinahon, tulad ng pagbaba mo ng isang bagay na masaya kang natapos nang dalhin. Tatlong trabaho at walang mga lihim sa kanya. Ang problema sa pera ay hinarap nang harapan sa sikat ng araw kung saan makikita ng lahat.</w:t>
+      </w:r>
+    </w:p>
+    <w:p/>
+    <w:p>
+      <w:r>
+        <w:t>Malinis siya. Ang katiyakan nito ay tumimo sa akin nang malinis, at dalawang bagay ang ginawa nito nang sabay. Pinagaan nito ang loob ko, dahil gusto ko si Jamal at ayaw kong siya iyon.</w:t>
+      </w:r>
+    </w:p>
+    <w:p/>
+    <w:p>
+      <w:r>
+        <w:t>At pinag-alala ako nito, dahil ang bawat pangalan na inilagay ko ay nagpapaikli sa listahan. Sa paglakad pauwi sa gintong-liwanag na lamig, malinaw kong nakita kung saan nagsisimulang ituro ang maikling listahan, at hindi ko nagustuhan ang direksyon kahit kaunti.</w:t>
       </w:r>
     </w:p>
     <w:p>
@@ -2724,7 +2724,7 @@
     <w:p/>
     <w:p>
       <w:r>
-        <w:t xml:space="preserve">Nag-iingat si Greta ng isang malaking salaming bola ng niyebe sa counter ng Holly Jolly Bakery, isang gamit para sa mga turista na mayroong maliit na seramikong Frost Falls sa loob, kasama ang liwasan at ang Gusaling Panlungsod at lahat na. Nang umagang iyon, nang dumaan ako para sa mga cinnamon roll ni Nick, ang niyebe sa loob nito ay ayaw tumigil sa pag-ikot. Umiikot ito nang walang humpay kahit walang humahawak, isang maliit na bagyo na paikot-ikot sa likod ng salamin. Naglagay si Greta ng pamunas sa kalahati nito, na para bang makatutulong iyon, at nagtitinda siya ng mga rolyo sa tabi nito nang may puspusang sigla ng isang babaeng nagpasya na huwag nang pag-usapan ang bola ng niyebe.</w:t>
+        <w:t xml:space="preserve">Nag-iingat si Greta ng isang malaking salaming bola ng niyebe sa counter ng Holly Jolly Bakery, isang gamit para sa mga turista na mayroong maliit na seramikong Frost Falls sa loob, kasama ang liwasan at ang Gusaling Pambayan at lahat na. Nang umagang iyon, nang dumaan ako para sa mga rolyong may kanela ni Nick, ang niyebe sa loob nito ay ayaw tumigil sa pag-ikot. Umiikot ito nang walang humpay kahit walang humahawak, isang maliit na bagyo na paikot-ikot sa likod ng salamin. Naglagay si Greta ng pamunas sa kalahati nito, na para bang makatutulong iyon, at nagtitinda siya ng mga rolyo sa tabi nito nang may puspusang sigla ng isang babaeng nagpasya na huwag nang pag-usapan ang bola ng niyebe.</w:t>
       </w:r>
       <w:r>
         <w:t xml:space="preserve"/>
@@ -2766,7 +2766,7 @@
     <w:p/>
     <w:p>
       <w:r>
-        <w:t>Nagpasya siya sa mixer, at hinayaan ko na siya.</w:t>
+        <w:t>Mixer ang napagpasyahan niyang dahilan, at hinayaan ko na siya.</w:t>
       </w:r>
     </w:p>
     <w:p/>
@@ -2784,7 +2784,7 @@
     <w:p/>
     <w:p>
       <w:r>
-        <w:t>Nasa loob ng palanggana si Bram kasama siya, at hinila ang pang-ulo nito.</w:t>
+        <w:t>Nasa loob ng palanggana si Bram kasama siya, at hinihila ang kabestro nito.</w:t>
       </w:r>
     </w:p>
     <w:p/>
@@ -2820,7 +2820,7 @@
     <w:p/>
     <w:p>
       <w:r>
-        <w:t xml:space="preserve">Itinaas niya ang kaniyang ulo at tiningnan ako. Sa mahabang sandali pagkatapos noon ay tumingin siya pataas sa daan patungo sa kubo at sa pagawaan sa likod nito, tulad ng ginagawa ng isang nilalang kapag nasinghot nito ang isang bagay na mas maganda kaysa sa nasa harapan niya. Humakbang siya palabas sa gilid ng fuwente, nagabog ng mga dahon sa ibabaw ng mga bota ni Bram, at umani ng sigawan mula sa mga bata. Pagkatapos ay nagsimula siyang maglakad pataas sa daan sa isang hindi nagmamadaling hakbang, patungo sa tahanan, marangal, at pinanood naming lahat ang kaniyang pag-alis.</w:t>
+        <w:t xml:space="preserve">Itinaas niya ang kaniyang ulo at tiningnan ako. Sa mahabang sandali pagkatapos noon ay tumingin siya pataas sa daan patungo sa kubo at sa pagawaan sa likod nito, tulad ng ginagawa ng isang nilalang kapag nasinghot nito ang isang bagay na mas maganda kaysa sa nasa harapan niya. Humakbang siya palabas sa gilid ng fuwente, ikinakalat ang mga dahon sa ibabaw ng mga bota ni Bram, at umani ng sigawan mula sa mga bata. Pagkatapos ay nagsimula siyang maglakad pataas sa daan sa isang hindi nagmamadaling hakbang, patungo sa tahanan, marangal, at pinanood naming lahat ang kaniyang pag-alis.</w:t>
       </w:r>
     </w:p>
     <w:p/>
@@ -2838,25 +2838,25 @@
     <w:p/>
     <w:p>
       <w:r>
-        <w:t xml:space="preserve">Si Bram, na may mga dahon sa kaniyang mga tuhod at dalawang daang taon na sa trabahong hindi kailanman nasangkot ang isang reindeer sa loob ng isang fuwente, ay tumingin sa daan pagkatapos niya, at ang kaniyang mukhang galit na patatas ay lumambot.</w:t>
-      </w:r>
-    </w:p>
-    <w:p/>
-    <w:p>
-      <w:r>
-        <w:t xml:space="preserve">“Tinawag pauwi,” sabi niya. “Buweno. Hindi naman iyon ang pinakamasamang bagay na ginagawa ng isang hayop, sa palagay ko. O ng isang duwende.” Buntong-hininga niya. “Pupuntahan ko si Vixen sa simbahan bago pa niya kainin ang mga pigura ng kapanganakan.” Naglakad siyang mabigat, habang bumubulong-bulong. Nagkawatak-watak ang mga tao, ang mga bata ay patuloy na tumuturo sa daan, at tiniklop ni Ginoong Kim ang kaniyang upuan, lubos na nasiyahan.</w:t>
-      </w:r>
-    </w:p>
-    <w:p/>
-    <w:p>
-      <w:r>
-        <w:t xml:space="preserve">Naglakad ako pauwi sa likod ng mga yapak ng isang reindeer, kasama si Pip sa aking tabi. Anuman ang ginawa ng mahika ngayon, humihila ito patungo sa isang dapugan na walang sinuman sa bayan ang nakakaalam na umiiral. Ito ang ibig sabihin ni Nick. Hindi alam ng mahika kung paano manakit. Ang alam lamang nito ay kung paano umuwi, at lumalapit ito nang kaunti araw-araw, nag-iiwan ng maliliit at imposibleng mga bagay sa likod nito: niyebe sa isang bola na ayaw tumigil, isang reindeer na naglalakad pauwi sa isang dapugan na hindi pa niya kailanman nakita.</w:t>
-      </w:r>
-    </w:p>
-    <w:p/>
-    <w:p>
-      <w:r>
-        <w:t xml:space="preserve">Dapat ay mas ikinabahala ko ito kaysa sa nangyari. May mangingikil sa bayan at isang kaibigan na pinipiga para sa kalahating milyong dolyar. Ngunit isang reindeer lamang ang kakalabas pa lamang mula sa fuwente dahil sinabi ko sa kaniya na mayroong isang bagay na mas mainit sa itaas ng daan. Pumalakpak ang mga bata sa kaniya hanggang sa kanto. Ang aking puso, sa kabila ng lahat ng ebidensya, ay pumapailanlang tulad ng saranggola.</w:t>
+        <w:t xml:space="preserve">Si Bram, na may mga dahon sa kaniyang mga tuhod at dalawang daang taon na sa trabahong hindi kailanman nasangkot ang isang reindeer sa loob ng isang fuwente, ay tumanaw sa daang nilakaran niya, at ang kaniyang mukhang galit na patatas ay lumambot.</w:t>
+      </w:r>
+    </w:p>
+    <w:p/>
+    <w:p>
+      <w:r>
+        <w:t xml:space="preserve">“Tinawag pauwi,” sabi niya. “Buweno. Hindi naman iyon ang pinakamasamang bagay na magagawa ng isang hayop, sa palagay ko. O ng isang duwende.” Buntong-hininga niya. “Pupuntahan ko si Vixen sa simbahan bago pa niya kainin ang mga pigura ng belen.” Naglakad siyang mabigat, habang bumubulong-bulong. Nagkawatak-watak ang mga tao, ang mga bata ay patuloy na tumuturo sa daan, at tiniklop ni Ginoong Kim ang kaniyang upuan, lubos na nasiyahan.</w:t>
+      </w:r>
+    </w:p>
+    <w:p/>
+    <w:p>
+      <w:r>
+        <w:t xml:space="preserve">Naglakad ako pauwi sa likod ng mga yapak ng isang reindeer, kasama si Pip sa aking tabi. Anuman ang ginagawa ng mahika ngayon, humihila ito patungo sa isang apuyan na walang sinuman sa bayan ang nakakaalam na umiiral. Ito ang ibig sabihin ni Nick. Hindi alam ng mahika kung paano manakit. Ang alam lamang nito ay kung paano umuwi, at lumalapit ito nang kaunti araw-araw, nag-iiwan ng maliliit at imposibleng mga bagay sa likod nito: niyebe sa isang bola na ayaw tumigil, isang reindeer na naglalakad pauwi sa isang apuyan na hindi pa niya kailanman nakita.</w:t>
+      </w:r>
+    </w:p>
+    <w:p/>
+    <w:p>
+      <w:r>
+        <w:t xml:space="preserve">Dapat ay mas ikinabahala ko ito kaysa sa nangyari. May mangingikil sa bayan at isang kaibigan na pinipiga para sa kalahating milyong dolyar. Ngunit kalalabas lamang ng isang reindeer mula sa fuwente dahil sinabi ko sa kaniya na mayroong isang bagay na mas mainit sa itaas ng daan. Pumalakpak ang mga bata sa kaniya hanggang sa kanto. Ang aking puso, sa kabila ng lahat ng ebidensya, ay pumapailanlang tulad ng saranggola.</w:t>
       </w:r>
     </w:p>
     <w:p>
@@ -2867,12 +2867,12 @@
     <w:p/>
     <w:p>
       <w:r>
-        <w:t xml:space="preserve">Tumawag si Olivia ng dagdag na sesyon para sa pagniniting ng mga guwantes nang hapon na iyon. May tatlumpu't isang pares pa ang kailangang tapusin at tatlong araw na lang para gawin iyon. Iyon ang sinabi ni Olivia sa telepono sa tinig na inilalaan niya para sa mga emerhensiya at mga bentahan ng tinapay.</w:t>
-      </w:r>
-    </w:p>
-    <w:p>
-      <w:r>
-        <w:t xml:space="preserve">Si Pip at ako ang huling dumating. Hinila ng bilog ang kanilang mga upuan palapit sa kalan na de-kahoy, habang ang mga basket ng berdeng sinulid na lana para sa eskuwela ay nakalagay sa sahig sa pagitan nila. Ang mga natapos na guwantes ay nakasabit nang magkapares sa kahabaan ng isang pisi sa ibabaw ng counter, tulad ng mga sinampay. Dumiretso si Pip sa garapon ng butones sa mababang estante malapit sa rehistro, at inilipat ito ni Olivia sa itaas ng counter nang hindi ibinababa ang isang tusok man lang.</w:t>
+        <w:t xml:space="preserve">Nagpatawag si Olivia ng dagdag na sesyon para sa pagniniting ng mga guwantes nang hapon na iyon. May tatlumpu't isang pares pa ang kailangang tapusin at tatlong araw na lang para gawin iyon. Iyon ang sinabi ni Olivia sa telepono sa tinig na inilalaan niya para sa mga emerhensiya at mga bentahan ng tinapay.</w:t>
+      </w:r>
+    </w:p>
+    <w:p>
+      <w:r>
+        <w:t xml:space="preserve">Si Pip at ako ang huling dumating. Hinila ng bilog ang kanilang mga upuan palapit sa kalan na de-kahoy, habang ang mga basket ng berdeng sinulid na lana para sa eskuwela ay nakalagay sa sahig sa pagitan nila. Ang mga natapos na guwantes ay nakasabit nang magkapares sa kahabaan ng isang pisi sa ibabaw ng counter, tulad ng mga sinampay. Dumiretso si Pip sa garapon ng butones sa mababang estante malapit sa rehistro, at inilipat ito ni Olivia sa itaas ng counter nang hindi nakakalaglag ni isang tahi.</w:t>
       </w:r>
     </w:p>
     <w:p>
@@ -2887,7 +2887,7 @@
     </w:p>
     <w:p>
       <w:r>
-        <w:t xml:space="preserve">Ikinuwento ni Ivy ang tungkol sa fuwente. Nakuha niya ito kay Ginoong Kim, na nanood sa buong pangyayari mula sa kanyang luklukan. Sa bersyon ni Ivy, si Prancer ay nasa fuwente mula pa madaling-araw, at sumunod si Bram sa kanya hanggang sa kanyang mga kilikili.</w:t>
+        <w:t xml:space="preserve">Ikinukuwento ni Ivy ang tungkol sa fuwente. Nakuha niya ito kay Ginoong Kim, na nanood sa buong pangyayari mula sa kanyang upuang tiklop. Sa bersyon ni Ivy, si Prancer ay nasa fuwente mula pa madaling-araw, at sumunod si Bram sa kanya hanggang sa kanyang mga kilikili.</w:t>
       </w:r>
     </w:p>
     <w:p>
@@ -2922,7 +2922,7 @@
     </w:p>
     <w:p>
       <w:r>
-        <w:t xml:space="preserve">“Kung pag-uusapan ang Historical Society,” sabi ni Ivy, “may nakasalamuha ba sa inyo ng lalaki mula sa aklatan?”</w:t>
+        <w:t xml:space="preserve">“Kung pag-uusapan ang Historical Society,” sabi ni Ivy, “may iba pa bang nilapitan ng lalaki mula sa aklatan?”</w:t>
       </w:r>
     </w:p>
     <w:p>
@@ -2937,7 +2937,7 @@
     </w:p>
     <w:p>
       <w:r>
-        <w:t xml:space="preserve">“Itinanong din niya sa akin ang parehong bagay sa tanggapan ng koreo,” sabi ni Ellie. “Masyado siyang magalang tungkol doon.”</w:t>
+        <w:t xml:space="preserve">“Itinanong din niya sa akin ang parehong bagay sa tanggapan ng koreo,” sabi ni Ellie. “Napakagalang niya tungkol doon.”</w:t>
       </w:r>
     </w:p>
     <w:p>
@@ -3017,7 +3017,7 @@
     </w:p>
     <w:p>
       <w:r>
-        <w:t xml:space="preserve">Nagtrabaho kami hanggang sa lumubog ang liwanag. Bandang alas-singko, ang pisi sa ibabaw ng counter ay lumubog sa gitna, at may natitirang siyam na pares sa mga basket. Kinuha ni Ellie ang tatlong pares pauwi at si Ivy naman ang dalawa. Ang huling cuff sa aking mga karayom ay may nakasulat na MAXIMILIAN sa berde at puti, at kinailangan kong ihiga ito nang patag sa aking tuhod upang maabot ang bawat titik sa paligid.</w:t>
+        <w:t xml:space="preserve">Nagtrabaho kami hanggang sa lumubog ang liwanag. Bandang alas-singko, ang pisi sa ibabaw ng counter ay lumubog sa gitna, at may natitirang siyam na pares sa mga basket. Kinuha ni Ellie ang tatlong pares pauwi at si Ivy naman ang dalawa. Ang huling cuff sa aking mga karayom ay may nakasulat na MAXIMILIAN sa berde at puti, at kinailangan kong ihiga ito nang patag sa aking tuhod upang magkasya ang bawat titik paikot.</w:t>
       </w:r>
     </w:p>
     <w:p>
@@ -3080,7 +3080,7 @@
     <w:p/>
     <w:p>
       <w:r>
-        <w:t xml:space="preserve">“Walang-wala talagang pagkakataon si Sam. Hindi pa siya kailanman tumuntong sa arkibo, sinabi niyang pinababahing siya ng alikabok, at naniniwala rin ako doon. Sinabi niya sa akin na ang mga lumang pamilya ay sakop ni Theo, at seryoso siya roon.” Tinapik ko ang pahina. “Ang amoy ng pugon ang naglagay sa kaniya sa listahan, at sa palagay ko ang amoy ng pugon din ang mismong magtatanggal sa kaniya rito, dahil sinasabi sa akin ni Pip mula pa noong unang gabi na ang nota ay amoy kung saan naroon ang bakal ni Sam, hindi kay Sam. At ang bakal ni Sam ay nasa buong lobby ni Fiona. Anumang iwan sa lobby na iyon ay aalis na dala ang amoy ng kaniyang apoy. Anuman.”</w:t>
+        <w:t xml:space="preserve">“Walang-wala talagang pagkakataon si Sam. Hindi pa siya kailanman tumuntong sa arkibo, sinabi niyang pinababahing siya ng alikabok, at naniniwala rin ako doon. Sinabi niya sa akin na ang mga lumang pamilya ay sakop ni Theo, at seryoso siya roon.” Tinapik ko ang pahina. “Ang amoy ng pugon ang naglagay sa kaniya sa listahan, at sa palagay ko ang amoy ng pugon din ang mismong magtatanggal sa kaniya rito, dahil sinasabi sa akin ni Pip mula pa noong unang gabi na ang nota ay amoy kung saan naroon ang bakal ni Sam, hindi amoy ni Sam. At ang bakal ni Sam ay nasa buong lobby ni Fiona. Anumang iwan sa lobby na iyon ay aalis na dala ang amoy ng kaniyang apoy. Anuman.”</w:t>
       </w:r>
     </w:p>
     <w:p/>
@@ -3092,7 +3092,7 @@
     <w:p/>
     <w:p>
       <w:r>
-        <w:t xml:space="preserve">Hindi ko kinansela si Sam, hindi lubos, hindi pa sa ngayon. “Gusto kong patunayan iyon bago ko tuluyang linisin ang pangalan niya,” sabi ko. “Ngunit ipupusta ko ang bahay na hindi siya iyon. Ang amoy ay tumuturo sa inn, hindi sa tao.”</w:t>
+        <w:t xml:space="preserve">Hindi ko pa ginuhitan ang pangalan ni Sam, hindi lubos, hindi pa sa ngayon. “Gusto kong patunayan iyon bago ko tuluyang linisin ang pangalan niya,” sabi ko. “Ngunit ipupusta ko ang bahay na hindi siya iyon. Ang amoy ay tumuturo sa inn, hindi sa tao.”</w:t>
       </w:r>
     </w:p>
     <w:p/>
@@ -3104,7 +3104,7 @@
     <w:p/>
     <w:p>
       <w:r>
-        <w:t xml:space="preserve">Sumimangot ako sa kaniyang pangalan sa pahina. “Iyan ang hindi ko maayos. Alam niya ang lahat ng alam ng mangingikil. Ang brotse, ang nag-iisang bato, ang Ridgeline, lahat ng ito. Nilapitan niya ito mula sa panig ng mga Blackburn, sa panig ng mga abogado ng ari-arian, at sinundan niya ito halos hanggang sa pintuan ng tahanan ni Constance.” Pinaikot ko ang aking tasa nang dahan-dahan sa mesa. “Ngunit sinasabi niya sa lahat. Namimigay siya ng mga kard. Umupo siya sa pampublikong aklatan at sinabi sa akin ang buong kuwento bago pa man ako makapagtanong. Ang isang mangingikil ay nagtatago, Nick. Ang buong kapangyarihan niya ay nasa pagtatago. At si Neil Carter ay gumagawa ng eksaktong kabaligtaran ng pagtatago, bawat oras ng araw. Kaya alinman sa hindi siya ang ating tao, o siya ang pinakamatalino sa lahat, gumagawa ng napakaraming tapat na ingay tungkol sa brotse upang walang sinuman sa bayan ang mag-isip nang dalawang beses sa lalaking pinakamatagal na nagsasalita tungkol dito.” Nag-iwan ako ng tandang pananong sa tabi ni Neil. “Hindi pa ako handang iisantabi siya. Ngunit sabihin ko na ito. Alam niya ang sikreto, at nakuha niya ito sa tamang paraan, at kailanman ay hindi siya lumapit kay Fiona para hingan ng kahit isang sentimo. Lumapit siya sa kaniya para humingi ng mga sagot, sa liwanag ng araw, na may dalang kuwaderno sa kaniyang kamay.”</w:t>
+        <w:t xml:space="preserve">Sumimangot ako sa kaniyang pangalan sa pahina. “Iyan ang hindi ko matantiya. Alam niya ang lahat ng alam ng mangingikil. Ang brotse, ang nag-iisang bato, ang Ridgeline, lahat ng ito. Nilapitan niya ito mula sa panig ng mga Blackburn, sa panig ng mga abogado ng ari-arian, at sinundan niya ito halos hanggang sa pintuan ng tahanan ni Constance.” Pinaikot ko ang aking tasa nang dahan-dahan sa mesa. “Ngunit sinasabi niya sa lahat. Namimigay siya ng mga kard. Umupo siya sa pampublikong aklatan at sinabi sa akin ang buong kuwento bago pa man ako makapagtanong. Ang isang mangingikil ay nagtatago, Nick. Ang buong kapangyarihan niya ay nasa pagtatago. At si Neil Carter ay gumagawa ng eksaktong kabaligtaran ng pagtatago, bawat oras ng araw. Kaya alinman sa hindi siya ang ating tao, o siya ang pinakamatalino sa lahat, gumagawa ng napakaraming tapat na ingay tungkol sa brotse upang walang sinuman sa bayan ang mag-isip nang dalawang beses sa lalaking pinakamadalas magsalita tungkol dito.” Nag-iwan ako ng tandang pananong sa tabi ni Neil. “Hindi pa ako handang iisantabi siya. Ngunit sabihin ko na ito. Alam niya ang sikreto, at nakuha niya ito sa tamang paraan, at kailanman ay hindi siya lumapit kay Fiona para hingan ng kahit isang sentimo. Lumapit siya sa kaniya para humingi ng mga sagot, sa liwanag ng araw, na may dalang kuwaderno sa kaniyang kamay.”</w:t>
       </w:r>
     </w:p>
     <w:p/>
@@ -3116,7 +3116,7 @@
     <w:p/>
     <w:p>
       <w:r>
-        <w:t xml:space="preserve">“Dalawa na lang.” Tiningnan ko ang pahina at ayaw ko sanang gawin. Vera. Theo. Ang dalawang pangalan na wala akong mahatak na linya para ikansela. “At ito ang kinatatakutan ko. Sa lahat ng nasa pahinang ito, ang tanging dalawa na hindi ko malinis ay ang dalawang may hawak ng mga susi sa mga lumang dokumento ng bayan. Si Vera ang nag-iingat ng mga titulo at rekord ng ari-arian, isang siglo ng kung sino ang nagmay-ari ng ano, ang titulo ng inn ay nasa isang dako roon. Tumigas siya na parang kahoy at sinabi sa akin na hindi kailanman niya binabasa ang mga dokumentong nakatayo sa kaniyang likuran. At si Theo.” Pinilit ko ang aking sarili na sabihin ito nang dahan-dahan. “Si Theo ay nakatira sa arkibo. Ang mga liham ng mga Blackburn ay nasa kaniyang pangangalaga, sa kaniyang mga kamay. At ang pinakakawiwilihan sa kanila, ang mismong mga magsasabing nawawala ang isang brotse at kung saan ito napunta, ay ang mga inihayag niya, nakatayo sa harap ng buong bayan, na nawawala.”</w:t>
+        <w:t xml:space="preserve">“Dalawa na lang.” Tiningnan ko ang pahina at ayaw ko sanang gawin. Vera. Theo. Ang dalawang pangalan na wala akong mahatak na linya para ikansela. “At ito ang kinatatakutan ko. Sa lahat ng nasa pahinang ito, ang tanging dalawa na hindi ko malinis ay ang dalawang may hawak ng mga susi sa mga lumang dokumento ng bayan. Si Vera ang nag-iingat ng mga titulo at rekord ng ari-arian, isang siglo ng kung sino ang nagmay-ari ng ano, ang titulo ng inn ay nasa isang dako roon. Tumigas siya na parang kahoy at sinabi sa akin na hindi kailanman niya binabasa ang mga dokumentong nakatayo sa kaniyang likuran. At si Theo.” Pinilit ko ang aking sarili na sabihin ito nang dahan-dahan. “Si Theo ay nakatira sa arkibo. Ang mga liham ng mga Blackburn ay nasa kaniyang pangangalaga, sa kaniyang mga kamay. At ang pinakakawili-wili sa kanila, ang mismong mga magsasabing nawawala ang isang brotse at kung saan ito napunta, ay ang mga inihayag niya, nakatayo sa harap ng buong bayan, na nawawala.”</w:t>
       </w:r>
     </w:p>
     <w:p/>
@@ -3134,13 +3134,13 @@
     <w:p/>
     <w:p>
       <w:r>
-        <w:t xml:space="preserve">“Ayaw kong maging sino man ito.” Idinikit ko ang aking mga kamay nang patag sa mesa sa magkabilang panig ng pahina. “Gusto kong nabasa ko nang mali ang buong bagay. Gusto kong si Neil ay maging isang matalinong kontrabida para maging isang estranghero na biglang sumulpot sa bayan, at hindi isang kaibigan na nanirahan dito sa loob ng tatlong dekada. Ngunit ang kagustuhan ay hindi ebidensya, Nick, kailanman ay hindi naging ganoon, at bawat katotohanan na nahuhukay ko ay bumubuo ng parehong hugis, at ang hugis na iyon ay may pangalan ni Theo sa gitna. Lumabas ang mga liham mula sa arkibo. Ang nota ay isinulat sa sariling papel ng arkibo. At ang lalaking nagpapatakbo ng arkibo ay desperado. Kumatok siya sa bawat tapat na pinto na naroroon at natagpuan silang lahat na nakasara sa kaniyang mukha.” Umiling ako. “Isang nakakatakot na hugis. Patuloy akong umasa na ang susunod na katotohanan ay bubuwag dito. At ang susunod na katotohanan ay patuloy na naglalagay ng isa pang bato sa halip.”</w:t>
-      </w:r>
-    </w:p>
-    <w:p/>
-    <w:p>
-      <w:r>
-        <w:t xml:space="preserve">“Kung gayon ay subukan mo ito,” sabi ni Nick, “sa halip na maupo rito sa kusina at katakutan ito, na kailanman ay hindi nakalutas ng anuman at kailanman ay hindi mangyayari. Pumunta ka at tingnan ang nag-iisang bagay na hindi mo pa tinitingnan nang maayos. Ang mga liham mismo, o ang lugar kung saan dapat naroroon ang mga ito.” Inabot niya ang mesa at idinikit ang kaniyang mainit na kamay sa ibabaw ng aking nanlalamig na kamay. “Maaaring kailanganin ni Theo ang tulong ng ibang tao sa pag-aayos ng arkibong iyon. Pumunta ka at ialok ito. At habang tumutulong ka, alamin ang isang bagay. Kung ang mga salita sa notang iyon ay tumutugma sa mga salita sa mga liham na nawala. Dahil kung tumutugma, Jess, kung gayon ang sinumang sumulat ng nota ay hindi lamang nagbasa ng mga papel ng Blackburn sa pangkalahatan. Hawak nila ang mga eksaktong liham na iyon. At napakaliit ng listahan ng mga tao sa Frost Falls na makapagsasabi nito.”</w:t>
+        <w:t xml:space="preserve">“Ayaw kong maging sino man ito.” Idinikit ko ang aking mga kamay nang patag sa mesa sa magkabilang panig ng pahina. “Gusto kong nabasa ko nang mali ang buong bagay. Gusto kong si Neil ay maging isang matalinong kontrabida para maging isang estranghero na biglang sumulpot sa bayan, at hindi isang kaibigan na nanirahan dito sa loob ng tatlong dekada. Ngunit ang kagustuhan ay hindi ebidensya, Nick, kailanman ay hindi naging ganoon, at bawat katotohanan na nahuhukay ko ay bumubuo ng parehong hugis, at ang hugis na iyon ay may pangalan ni Theo sa gitna. Lumabas ang mga liham mula sa arkibo. Ang nota ay isinulat sa sariling papel ng arkibo. At ang lalaking nagpapatakbo ng arkibo ay desperado. Kumatok siya sa bawat tapat na pinto na naroroon at natagpuan silang lahat na nakasara sa kaniyang mukha.” Umiling ako. “Isang nakakatakot na hugis. Patuloy akong umaasa na ang susunod na katotohanan ay bubuwag dito. At ang susunod na katotohanan ay patuloy na naglalagay ng isa pang bato sa halip.”</w:t>
+      </w:r>
+    </w:p>
+    <w:p/>
+    <w:p>
+      <w:r>
+        <w:t xml:space="preserve">“Kung gayon ay subukan mo ito,” sabi ni Nick, “sa halip na maupo rito sa kusina at katakutan ito, na kailanman ay hindi nakalutas ng anuman at hindi kailanman makalulutas. Pumunta ka at tingnan ang nag-iisang bagay na hindi mo pa tinitingnan nang maayos. Ang mga liham mismo, o ang lugar kung saan dapat naroroon ang mga ito.” Inabot niya ang mesa at idinikit ang kaniyang mainit na kamay sa ibabaw ng aking nanlalamig na kamay. “Maaaring kailanganin ni Theo ang tulong ng ibang tao sa pag-aayos ng arkibong iyon. Pumunta ka at ialok ito. At habang tumutulong ka, alamin ang isang bagay. Kung ang mga salita sa notang iyon ay tumutugma sa mga salita sa mga liham na nawala. Dahil kung tumutugma, Jess, kung gayon ang sinumang sumulat ng nota ay hindi lamang nagbasa ng mga papel ng Blackburn sa pangkalahatan. Hawak nila ang mga eksaktong liham na iyon. At napakaliit ng listahan ng mga tao sa Frost Falls na makapagsasabi nito.”</w:t>
       </w:r>
     </w:p>
     <w:p/>
@@ -3164,7 +3164,7 @@
     <w:p/>
     <w:p>
       <w:r>
-        <w:t>Hinawakan ko nang mahigpit iyon, habang umaakyat sa hagdan patungo sa silid-tulugan, at tinanggap ito bilang kabaitan na ito. Masama ang tulog ko, at nanaginip ako ng mga naka-lock na drawer na hindi ko mahanap ang mga susi.</w:t>
+        <w:t>Hinawakan ko nang mahigpit iyon, habang umaakyat sa hagdan patungo sa silid-tulugan, at tinanggap ito bilang kabaitang tunay nga ito. Masama ang tulog ko, at nanaginip ako ng mga naka-lock na drawer na hindi ko mahanap ang mga susi.</w:t>
       </w:r>
     </w:p>
     <w:p>
@@ -3175,7 +3175,7 @@
     <w:p/>
     <w:p>
       <w:r>
-        <w:t>Bumalik ako sa pandayan kinabukasan, ngunit hindi upang tingnan si Sam sa pagkakataong ito. Pumunta ako roon upang luminaw ang hangin, na ibang pakay at mas mabuti. Utang ko iyon sa kaniya mula pa noong sandaling hayaan ko ang sarili kong paghinalaan siya.</w:t>
+        <w:t>Bumalik ako sa pandayan kinabukasan, ngunit hindi upang tingnan si Sam sa pagkakataong ito. Pumunta ako roon upang ayusin ang aming pagkakaunawaan, na ibang pakay at mas mabuti. Utang ko iyon sa kaniya mula pa noong sandaling hayaan ko ang sarili kong paghinalaan siya.</w:t>
       </w:r>
     </w:p>
     <w:p/>
@@ -3193,7 +3193,7 @@
     <w:p/>
     <w:p>
       <w:r>
-        <w:t xml:space="preserve">“Sam, may utang ako sa inyo.” Pinag-isipan ko kung paano ito gagawin sa buong paglakad ko rito, at nagpasyang sabihin ang totoo, o ang bahagi niyon na akin upang ibigay. Pinaghihinalaan ko ang mabuting taong ito, at ang tanging matapat na paraan upang itama iyon ay ang magtiwala sa kaniya sa pamamagitan ng pagbibigay ng isang bahagi ng bagay na iyon bilang kapalit. “Maaari ba tayong maglakad sandali? Malayo sa mga bintana.”</w:t>
+        <w:t xml:space="preserve">“Sam, may utang ako sa inyo.” Pinag-isipan ko kung paano ito gagawin sa buong paglakad ko rito, at nagpasyang sabihin ang totoo, o ang bahagi niyon na akin upang ibigay. Pinaghinalaan ko ang mabuting taong ito, at ang tanging matapat na paraan upang itama iyon ay ang magtiwala sa kaniya sa pamamagitan ng pagbibigay ng isang bahagi ng bagay na iyon bilang kapalit. “Maaari ba tayong maglakad sandali? Malayo sa mga bintana.”</w:t>
       </w:r>
     </w:p>
     <w:p/>
@@ -3253,13 +3253,13 @@
     <w:p/>
     <w:p>
       <w:r>
-        <w:t xml:space="preserve">“Magagawa ko iyan.” Hinawakan niya ang aking kamay, magaspang na bakal ngunit mainit. “At Ginang Claus. Anuman ang gastos nito upang maitama ito. Kung nauwi sa pera, kung kailangan niya ng pera upang maging ligtas, sabihin ninyo sa kaniya na ang mga panday sa tatlong lalawigan ay may utang na loob sa akin at tatawagin ko ang bawat isa sa kanila nang hindi nag-iisip nang dalawang beses. Sabihin din ninyo sa kaniya iyan, kapag sinabi ninyo sa kaniya ang tungkol sa dalawampung dolyar.”</w:t>
-      </w:r>
-    </w:p>
-    <w:p/>
-    <w:p>
-      <w:r>
-        <w:t xml:space="preserve">Ipinangako ko na gagawin ko, pareho, at iniwan ko siya sa kaniyang mga braket. Isinuko ni Pip ang mga turnilyo nang may kaunting pag-aatubili, at kami ay naglakad pabalik sa maliwanag at malamig na kalye. Sa isang dako sa pagitan ng inn at ng kanto ay kinansela ko si Sam Patel sa listahan sa aking ulo, at natuwa ako roon. Isa pang pangalan ang nabura. Isa pang mabuting tao na, sa sandaling pinagkatiwalaan ko siya, ay nagmula sa pagiging bitak sa pader sa paligid ni Fiona patungo sa pagiging isa pang bato nito.</w:t>
+        <w:t xml:space="preserve">“Magagawa ko iyan.” Hinawakan niya ang aking kamay, magaspang na bakal ngunit mainit. “At Ginang Claus. Anuman ang gastos nito upang maitama ito. Kung nauwi sa pera, kung kailangan niya ng pera upang maging ligtas, sabihin ninyo sa kaniya na ang mga panday sa tatlong kondado ay may utang na loob sa akin at tatawagin ko ang bawat isa sa kanila nang hindi nag-iisip nang dalawang beses. Sabihin din ninyo sa kaniya iyan, kapag sinabi ninyo sa kaniya ang tungkol sa dalawampung dolyar.”</w:t>
+      </w:r>
+    </w:p>
+    <w:p/>
+    <w:p>
+      <w:r>
+        <w:t xml:space="preserve">Ipinangako ko na gagawin ko, pareho, at iniwan ko siya sa kaniyang mga braket. Isinuko ni Pip ang mga turnilyo nang may kaunting pag-aatubili, at kami ay naglakad pabalik sa maliwanag at malamig na kalye. Sa isang dako sa pagitan ng inn at ng kanto ay ginuhitan ko ang pangalan ni Sam Patel sa listahan sa aking ulo, at natuwa ako roon. Isa pang pangalan ang nabura. Isa pang mabuting tao na, sa sandaling pinagkatiwalaan ko siya, ay nagmula sa pagiging bitak sa pader sa paligid ni Fiona patungo sa pagiging isa pang bato nito.</w:t>
       </w:r>
     </w:p>
     <w:p/>
@@ -3282,7 +3282,7 @@
     <w:p/>
     <w:p>
       <w:r>
-        <w:t xml:space="preserve">“Isang tunay na kompanya,” sabi niya, bago pa man ako makapag-hello. “Matandang opisina, dalawang estado ang layo, ginagawa ang mga ipinagagawa ng lalaki mo—mga usaping </w:t>
+        <w:t xml:space="preserve">“Isang tunay na kompanya,” sabi niya, bago pa man ako makapag-hello. “Matandang opisina, dalawang estado ang layo, ginagawa nga ang sinasabi ng lalaking tinutukoy mo—mga usaping </w:t>
       </w:r>
       <w:r>
         <w:rPr>
@@ -3327,13 +3327,13 @@
     <w:p/>
     <w:p>
       <w:r>
-        <w:t>Pinagmasdan ko ang mukha niya sa buong sandali ng pagsasabi ko nito. Ang lumitaw sa mukha ni Neil Carter ay ang hayag, matindi, at medyo nasindak na pagkaakit ng isang lalaking ginugol ang buong karera sa pagtugis sa malamig na bakas ng mga lumang dokumentong sandaang taong gulang, at sinabihan lamang ngayon, sa ibabaw ng mesa sa aklat-bayan, na ang bakas ay mainit pa ring sapat para sumunog ng buhay na tao.</w:t>
-      </w:r>
-    </w:p>
-    <w:p/>
-    <w:p>
-      <w:r>
-        <w:t xml:space="preserve">“Kalahating milyon.” Sumandal siya at nagpakawala ng mahinang sipol. “Diyos ko. May sumasakal sa inapo. Tungkol sa isang bagay na hindi na kayang galawin ng batas.” Dahan-dahan niyang iniling ang kanyang ulo, at may pandidiri roon, totoong pandidiri. “Malupit iyon, Ginang Claus, at hangal. Walang kasong maaaring isampa sinuman tungkol sa brotseng iyon ngayon. Ang ari-arian ng mga Blackburn ay ayaw sa pera ng inyong kaibigan at lalong ayaw nitong mapahiya siya. Ang gusto lamang nila ay isang linya sa ledyer na nagsasabi kung saan napunta ang alahas, para maisara ng mga abogado ang talaksan at tumigil na sa paniningil sa isa't isa. Kung sino man ang nagpapadugo sa inyong kaibigan ay nagbebenta sa kanya ng takot na hindi na totoo. Ang hiya na lang ang natitirang sandata roon. Walang natitirang kasong legal, hindi pagkatapos ng sandaang taon.”</w:t>
+        <w:t>Pinagmasdan ko ang mukha niya sa buong sandali ng pagsasabi ko nito. Ang lumitaw sa mukha ni Neil Carter ay ang hayag, matindi, at medyo nasindak na pagkaakit ng isang lalaking ginugol ang buong karera sa pagtugis sa malamig na bakas ng mga lumang dokumentong sandaang taong gulang, at sinabihan lamang ngayon, sa ibabaw ng mesa sa aklatan, na ang bakas ay mainit pa ring sapat para sumunog ng buhay na tao.</w:t>
+      </w:r>
+    </w:p>
+    <w:p/>
+    <w:p>
+      <w:r>
+        <w:t xml:space="preserve">“Kalahating milyon.” Sumandal siya at nagpakawala ng mahinang sipol. “Diyos ko. May sumasakal sa inapo. Tungkol sa isang bagay na hindi na kayang galawin ng batas.” Dahan-dahan niyang iniling ang kanyang ulo, at may pandidiri roon, totoong pandidiri. “Malupit iyon, Ginang Claus, at hangal. Walang kasong maaaring isampa sinuman tungkol sa brotseng iyon ngayon. Ang ari-arian ng mga Blackburn ay ayaw sa pera ng inyong kaibigan at lalong hindi nito hangad na parusahan siya. Ang gusto lamang nila ay isang linya sa ledyer na nagsasabi kung saan napunta ang alahas, para maisara ng mga abogado ang talaksan at tumigil na sa paniningil sa isa't isa. Kung sino man ang nagpapadugo sa inyong kaibigan ay nagbebenta sa kanya ng takot na hindi na totoo. Ang hiya na lang ang natitirang sandata roon. Walang natitirang kasong legal, hindi pagkatapos ng sandaang taon.”</w:t>
       </w:r>
     </w:p>
     <w:p/>
@@ -3351,7 +3351,7 @@
     <w:p/>
     <w:p>
       <w:r>
-        <w:t xml:space="preserve">“Sinabi ko na sa inyo noong unang araw. Tinutunton ko kung saan napunta ang mga bagay. Ang natitira ay nasa pagitan ng mga tao at kung ano man ang pinaniniwalaan nila.” Humila siya ng isang makapal na talaksan mula sa kanyang tumpok at, pagkatapos ng sandaling pag-iisip, itinulak ito sa ibabaw ng mesa patungo sa akin. “Narito. Mabuting mapasainyo na ito, ngayong nagiging tapat tayo sa isa't isa, at yamang ang ilang maliit na magnanakaw sa magandang bayan ninyo ay ginagamit ang pinakamasamang bahagi nito upang pahirapan ang isang mabuting babae. Narito ang lahat ng natuklasan ko tungkol sa katulong. Si Constance Okafor.”</w:t>
+        <w:t xml:space="preserve">“Sinabi ko na sa inyo noong unang araw. Tinutunton ko kung saan napunta ang mga bagay. Ang natitira ay nasa pagitan ng mga tao at kung ano man ang kanilang pinananagutan.” Humila siya ng isang makapal na talaksan mula sa kanyang tumpok at, pagkatapos ng sandaling pag-iisip, itinulak ito sa ibabaw ng mesa patungo sa akin. “Narito. Mabuting mapasainyo na ito, ngayong nagiging tapat tayo sa isa't isa, at yamang ang isang hamak na magnanakaw sa magandang bayan ninyo ay ginagamit ang pinakamasamang bahagi nito upang pahirapan ang isang mabuting babae. Narito ang lahat ng natuklasan ko tungkol sa katulong. Si Constance Okafor.”</w:t>
       </w:r>
     </w:p>
     <w:p/>
@@ -3410,7 +3410,7 @@
     <w:p/>
     <w:p>
       <w:r>
-        <w:t xml:space="preserve">Ang arkibo ay ang mahabang silid sa likod ng bulwagan ng eksibisyon, na may mga kahon ng bangko mula sa sahig hanggang kisame, at ito ay, tulad ng ipinagtapat ni Theo sa buong bayan sa pagbubukas, isang marangal na pagkalubog ng barko. Sinalubong niya ako roon na may kulay-abo at mapagpasalamat na mukha, suot ang parehong tabingi na kurbata, at pinag-ayos ako ng isang serye ng mga dokumentong pambahay sa mesa habang nagtatrabaho siya sa kabilang bahagi ng silid. Sa halos isang oras ay nagtrabaho kami sa maginhawang katahimikan ng dalawang taong kapwa mahilig sa kaayusan at kapwa rin, sa sarili nating paraan, ay napapanatag sa paggawa nito. Si Pip ay pumuwesto sa isang mababang salansan ng mga kahon sa tabi ko at mahigpit na binantayan ang mga tansong paper clip sa aking tray. Hinayaan ko ang aking sarili, sa loob ng oras na iyon, na halos makalimutan ang ipinunta ko rito.</w:t>
+        <w:t xml:space="preserve">Ang arkibo ay ang mahabang silid sa likod ng bulwagan ng eksibisyon, na may mga kahong pang-arkibo mula sa sahig hanggang kisame, at ito ay, tulad ng ipinagtapat ni Theo sa buong bayan sa pagbubukas, isang marangal na pagkalubog ng barko. Sinalubong niya ako roon na may kulay-abo at mapagpasalamat na mukha, suot ang parehong tabingi na kurbata, at pinag-ayos ako ng isang serye ng mga dokumentong pambahay sa mesa habang nagtatrabaho siya sa kabilang bahagi ng silid. Sa halos isang oras ay nagtrabaho kami sa maginhawang katahimikan ng dalawang taong kapwa mahilig sa kaayusan at kapwa rin, sa sarili naming paraan, ay napapanatag sa paggawa nito. Si Pip ay pumuwesto sa isang mababang salansan ng mga kahon sa tabi ko at mahigpit na binantayan ang mga tansong paper clip sa aking tray. Hinayaan ko ang aking sarili, sa loob ng oras na iyon, na halos makalimutan ang ipinunta ko rito.</w:t>
       </w:r>
     </w:p>
     <w:p/>
@@ -3422,7 +3422,7 @@
     <w:p/>
     <w:p>
       <w:r>
-        <w:t xml:space="preserve">Nag-iingat si Theo ng isang indeks, gaya ng nararapat sa isang mahusay na arkibero, isang mahabang mababang kahon ng mga kard, isang kard para sa bawat hawak sa lugar, ang bawat isa ay isang maikling buod sa kanyang maliit at nakahilis na sulat-kamay kung ano ang naglalaman ng isang ibinigay na folder. Inalok ko ang aking sarili na muling isalansan ang isang tumpok ng mga kard na nawala sa ayos. Inaayos ko ang mga B, Bayarin ng Panaderya, Bandstand (mga Subskripsyon), nang marating ko ang mga kard para sa mga papeles ng pamilya Blackburn, at natagpuan sa gitna nito ang tatlong may marka sa itaas sa pulang lapis: </w:t>
+        <w:t xml:space="preserve">Nag-iingat si Theo ng isang indeks, gaya ng nararapat sa isang mahusay na arkibero, isang mahabang mababang kahon ng mga kard, isang kard para sa bawat hawak sa lugar, ang bawat isa ay isang maikling buod sa kanyang maliit at nakahilis na sulat-kamay kung ano ang laman ng isang partikular na folder. Inalok ko ang aking sarili na muling isalansan ang isang tumpok ng mga kard na nawala sa ayos. Inaayos ko ang mga B, Bayarin ng Panaderya, Bandstand (mga Subskripsyon), nang marating ko ang mga kard para sa mga papeles ng pamilya Blackburn, at natagpuan sa gitna nito ang tatlong may marka sa itaas sa pulang lapis: </w:t>
       </w:r>
       <w:r>
         <w:rPr>
@@ -3476,13 +3476,13 @@
     <w:p/>
     <w:p>
       <w:r>
-        <w:t xml:space="preserve">Pinilit ko ang aking sarili na huminga. Pinilit ko ang aking sarili na ibaba ang tatlong kard na may markang pulang lapis kasama ng iba pa at magpatuloy sa pag-uuri, B, B, Bridge (Paligsahan), Banderitas, Sobra, na parang ang sahig ng silid ay hindi pa lamang tahimik na bumukas sa ilalim ng aking upuan. Sa kabilang bahagi ng silid ay humuhuni si Theo sa kanyang sarili, inilipat ang isang kahon at nagsabi ng isang bagay tungkol sa boiler na sinagot ko nang hindi ko naririnig ang aking sarili. Ang lalaki sa kabilang silid, ang pinakamabait na lalaki sa Frost Falls, ang lalaking bumili ng masarap na tsokolate na may maliliit na marshmallow mula sa kanyang sariling bulsa upang ang mga bata ay hindi lumaki nang hindi nalalaman ang mga kuwento ng kanilang bayan, ay sumulat ng mga notang nagpapasindak kay Fiona. O ang kanyang pag-aalaga sa mga liham na iyon ay nagpahintulot sa ibang tao na isulat ang mga ito, isang tao mula sa isang listahan na napakaikli kaya't ang kanyang pangalan ay nasa itaas nito, sa kanyang maingat na panulat.</w:t>
-      </w:r>
-    </w:p>
-    <w:p/>
-    <w:p>
-      <w:r>
-        <w:t>Umakyat ako sa mga baitang nang umagang iyon na buong-pusong umaasang linisin siya. Ibinigay sa akin ng arkibo ang eksaktong kabaligtaran, sa kanyang sariling kamay, sa pulang lapis.</w:t>
+        <w:t xml:space="preserve">Pinilit ko ang aking sarili na huminga. Pinilit ko ang aking sarili na ibaba ang tatlong kard na may markang pulang lapis kasama ng iba pa at magpatuloy sa pag-uuri, B, B, Bridge (Paligsahan), Banderitas, Sobra, na parang ang sahig ng silid ay hindi pa lamang tahimik na bumukas sa ilalim ng aking upuan. Sa kabilang bahagi ng silid ay humuhuni si Theo sa kanyang sarili, inilipat ang isang kahon at nagsabi ng isang bagay tungkol sa boiler na sinagot ko nang hindi ko naririnig ang aking sarili. Ang lalaki sa kabilang silid, ang pinakamabait na lalaki sa Frost Falls, ang lalaking bumibili ng masarap na tsokolate na may maliliit na marshmallow mula sa kanyang sariling bulsa upang ang mga bata ay hindi lumaki nang hindi nalalaman ang mga kuwento ng kanilang bayan, ay sumulat ng mga notang nagpapasindak kay Fiona. O ang kanyang pag-aalaga sa mga liham na iyon ay nagpahintulot sa ibang tao na isulat ang mga ito, isang tao mula sa isang listahan na napakaikli kaya't ang kanyang pangalan ay nasa itaas nito, sa kanyang maingat na sulat-kamay.</w:t>
+      </w:r>
+    </w:p>
+    <w:p/>
+    <w:p>
+      <w:r>
+        <w:t>Umakyat ako sa mga baitang nang umagang iyon na buong-pusong umaasang linisin siya. Ibinigay sa akin ng arkibo ang eksaktong kabaligtaran, sa kanyang sariling sulat-kamay, sa pulang lapis.</w:t>
       </w:r>
     </w:p>
     <w:p/>
@@ -3530,13 +3530,13 @@
     <w:p/>
     <w:p>
       <w:r>
-        <w:t xml:space="preserve">“Sa parehong paraan kung paano ginagawa ng sinuman ang isang kakila-kilabot na bagay,” sabi ni Nick. “Sa pamamagitan ng pagsasabi sa sarili na ito ay para sa isang mabuting layunin, at paulit-ulit niya itong ibinubulong sa sarili, hanggang sa wala na siyang makita kundi ang kabutihang patuloy niyang ipinangangatuwiran sa kanyang isip, habang ang pinsala ay lumiit na at napunta na sa pinakadulo ng kanyang paningin. Ang pagmamahal ang nagpapahintulot sa kanyang gawin ito, Jess. Iyan ang malupit na bahagi nito. Hinding-hindi magnanakaw si Theo kahit isang sentimos para sa kanyang sarili. Ngunit para sa Historical Society, nakumbinsi niya ang kanyang sarili sa halos anumang bagay.”</w:t>
-      </w:r>
-    </w:p>
-    <w:p/>
-    <w:p>
-      <w:r>
-        <w:t xml:space="preserve">Kinuha ko iyon sa aking isip. Totoo iyon, at hindi nakatulong. Alam ni Nick na hindi iyon makatutulong, at hinayaan niya pa rin akong maramdaman ito.</w:t>
+        <w:t xml:space="preserve">“Sa parehong paraan kung paano ginagawa ng sinuman ang isang kakila-kilabot na bagay,” sabi ni Nick. “Sa pamamagitan ng pagsasabi sa sarili na ito ay para sa isang mabuting layunin, at paulit-ulit niya itong ibinubulong sa sarili, hanggang sa wala na siyang makita kundi ang kabutihang patuloy niyang ipinangangatuwiran sa kanyang isip, habang ang pinsala ay lumiit na at napunta na sa pinakadulo ng kanyang paningin. Ang pagmamahal ang nagpapahintulot sa kanyang gawin ito, Jess. Iyan ang malupit na bahagi nito. Hinding-hindi magnanakaw si Theo kahit isang sentimo para sa kanyang sarili. Ngunit para sa Historical Society, nakumbinsi niya ang kanyang sarili sa halos anumang bagay.”</w:t>
+      </w:r>
+    </w:p>
+    <w:p/>
+    <w:p>
+      <w:r>
+        <w:t xml:space="preserve">Pinagnilayan ko iyon. Totoo iyon, at hindi nakatulong. Alam ni Nick na hindi iyon makatutulong, at hinayaan niya pa rin akong maramdaman ito.</w:t>
       </w:r>
     </w:p>
     <w:p/>
@@ -3548,7 +3548,7 @@
     <w:p/>
     <w:p>
       <w:r>
-        <w:t xml:space="preserve">Umilaw itong ginto sa mga bintana, nang biglaan, bagamat ganap na madilim sa labas at ganoon na nga sa loob ng isang oras. Mainit at gumagalaw, bumuhos ito mula sa labas ng pastulan, mula sa pagawaan, sapat ang liwanag upang iitsa ang mga anino ng mga balangkas ng bintana sa sahig ng kusina sa mahabang gintong mga guhit. Tumayo si Pip mula sa tapat ng apuyan. Mula sa labas, mahina at malinaw, dumating ang tunog na parang napakaraming kampana sa malayo, o isang malaking apoy na sabay-sabay na humuhupa.</w:t>
+        <w:t xml:space="preserve">Umilaw itong ginto sa mga bintana, nang biglaan, bagamat ganap na madilim sa labas at ganoon na nga sa loob ng isang oras. Mainit at gumagalaw, bumuhos ito mula sa labas ng kulungan, mula sa pagawaan, sapat ang liwanag upang iitsa ang mga anino ng mga balangkas ng bintana sa sahig ng kusina sa mahabang gintong mga guhit. Tumayo si Pip mula sa tapat ng apuyan. Mula sa labas, mahina at malinaw, dumating ang tunog na parang napakaraming kampana sa malayo, o isang malaking apoy na sabay-sabay na humuhupa.</w:t>
       </w:r>
     </w:p>
     <w:p/>
@@ -3566,19 +3566,19 @@
     <w:p/>
     <w:p>
       <w:r>
-        <w:t xml:space="preserve">“Halika,” ang sabi niya, at iniabot ang kaniyang kamay. “Malapit na itong matapos ngayon. At sa tingin ko ay kailangan mong makita ito ngayong gabi, sa lahat ng gabing naroroon. Sa tingin ko ay kailangan mong makita kung para saan tayo, ikaw at ako, bago ka pa lalong lumubog sa ginawa nila.”</w:t>
-      </w:r>
-    </w:p>
-    <w:p/>
-    <w:p>
-      <w:r>
-        <w:t>Kinuha ko ang kaniyang kamay, at lumabas kami sa malamig at pilak na bakuran habang ang ginto ay mas lalong sumasabog sa bawat hakbang at si Pip ay nagmamadaling naglalakad sa aming harapan. Inilagay ni Nick ang kaniyang kamay sa pinto ng pagawaan at binuksan ito.</w:t>
-      </w:r>
-    </w:p>
-    <w:p/>
-    <w:p>
-      <w:r>
-        <w:t xml:space="preserve">Sa gitna ng silid, kung saan naroroon sana ang lumang apuyan ng Polo, nagtayo siya ng isang malaking apuyang yari sa mga batong bukid, mga pabilog na bato sa ilog na pinagpatong-patong ng kamay. Walang apoy sa loob nito. Malamig at walang laman ang rehas, gayunma'y nagliliwanag ito. Ang mainit na ginto ay ibinuhos mula sa mismong hubad na bato. Ang walang tahanang mahika na nag-ikot mula sa isang pinto patungo sa isa pa sa buong Frost Falls ay dumating, ang ilan dito, dito, at dahan-dahang umiikot sa mainit na hangin sa ibabaw ng walang lamang apuyan, tulad ng isang pagod na nilalang na sa wakas ay nakatagpo ng isang lugar na balang araw ay maaaring pahintulutan itong humiga.</w:t>
+        <w:t xml:space="preserve">“Halika,” ang sabi niya, at iniabot ang kaniyang kamay. “Malapit na itong matapos ngayon. At sa tingin ko ay kailangan mong makita ito ngayong gabi, sa dinami-dami ng gabi. Sa tingin ko ay kailangan mong makita kung para saan tayo, ikaw at ako, bago ka pa lalong lumubog sa ginawa nila.”</w:t>
+      </w:r>
+    </w:p>
+    <w:p/>
+    <w:p>
+      <w:r>
+        <w:t>Kinuha ko ang kaniyang kamay, at lumabas kami sa malamig at pilak na bakuran habang ang ginto ay mas lalong sumasabog sa bawat hakbang at si Pip ay pakendeng-kendeng sa aming harapan. Inilagay ni Nick ang kaniyang kamay sa pinto ng pagawaan at binuksan ito.</w:t>
+      </w:r>
+    </w:p>
+    <w:p/>
+    <w:p>
+      <w:r>
+        <w:t xml:space="preserve">Sa gitna ng silid, kung saan naroroon sana ang lumang apuyan ng Polo, nagtayo siya ng isang malaking apuyang yari sa mga batong bukid, mga pabilog na bato sa ilog na pinagpatong-patong ng kamay. Walang apoy sa loob nito. Malamig at walang laman ang rehas, gayunma'y nagliliwanag ito. Ang mainit na ginto ay bumubuhos mula sa mismong hubad na bato. Ang walang tahanang mahika na nag-ikot mula sa isang pinto patungo sa isa pa sa buong Frost Falls ay dumating dito, ang ilang bahagi nito, at dahan-dahang umiikot sa mainit na hangin sa ibabaw ng walang lamang rehas, tulad ng isang pagod na nilalang na sa wakas ay nakatagpo ng isang lugar na balang araw ay maaaring pahintulutan itong humiga.</w:t>
       </w:r>
     </w:p>
     <w:p/>
@@ -3596,13 +3596,13 @@
     <w:p/>
     <w:p>
       <w:r>
-        <w:t>Tumayo ako sa liwanag ng hindi sinindihang apoy at hinayaan ang aking sarili na umiyak, sa wakas, nang kaunti, para kay Theo, para kay Fiona at para sa buong kakila-kilabot at magulong gulo nito. Hinawakan ako ni Nick. Sa itaas, ang mahika ay umikot sa mabagal nitong gintong mga bilog, naghahanap ng tahanan, at ngayon lamang nagsisimulang mahanap ito.</w:t>
-      </w:r>
-    </w:p>
-    <w:p/>
-    <w:p>
-      <w:r>
-        <w:t xml:space="preserve">Pagkatapos ay pinunasan ko ang aking mukha sa kumot, dahil mayroon akong kaibigan na sinasakal sa kabilang panig ng madilim na bayan at isang pagod na mabuting lalaki na gumawa ng kakila-kilabot na bagay. May parating na pagpipilian sa akin na naramdaman ko ngayon tulad ng pagbabago sa panahon. Bumalik sa akin ang mga salita ni Nick mula sa gabi ng listahan. Ang paghahanap ay kalahati lamang. Ang natitira, kung paano ito magtatapos, ay akin pa rin.</w:t>
+        <w:t>Tumayo ako sa liwanag ng hindi sinindihang apoy at hinayaan ang aking sarili na umiyak, sa wakas, nang kaunti, para kay Theo, para kay Fiona at para sa buong kakila-kilabot at magulong gulo nito. Niyakap ako ni Nick. Sa itaas, ang mahika ay umiikot sa mabagal nitong gintong mga bilog, naghahanap ng tahanan, at ngayon lamang nagsisimulang mahanap ito.</w:t>
+      </w:r>
+    </w:p>
+    <w:p/>
+    <w:p>
+      <w:r>
+        <w:t xml:space="preserve">Pagkatapos ay pinunasan ko ang aking mukha sa kumot, dahil mayroon akong kaibigan na sinasakal sa kabilang panig ng madilim na bayan at isang pagod na mabuting lalaki na gumawa ng kakila-kilabot na bagay. May parating na pagpipilian sa akin na nararamdaman ko na ngayon tulad ng pagbabago sa panahon. Bumalik sa akin ang mga salita ni Nick mula sa gabi ng listahan. Ang paghahanap ay kalahati lamang. Ang natitira, kung paano ito magtatapos, ay akin pa rin.</w:t>
       </w:r>
     </w:p>
     <w:p/>
@@ -3654,7 +3654,7 @@
     <w:p/>
     <w:p>
       <w:r>
-        <w:t xml:space="preserve">Nagpatuloy siya sa paglakad patungo sa Gusaling Panlungsod sa kanyang mabilis at pantay na hakbang. Dalawang lalaking nagdadala ng mesa ang tumabi para sa kanya nang hindi tumitingin. Pumasok ako.</w:t>
+        <w:t xml:space="preserve">Nagpatuloy siya sa paglakad patungo sa Gusaling Pambayan sa kanyang mabilis at pantay na hakbang. Dalawang lalaking nagdadala ng mesa ang tumabi para sa kanya nang hindi tumitingin. Pumasok ako.</w:t>
       </w:r>
     </w:p>
     <w:p/>
@@ -3702,7 +3702,7 @@
     <w:p/>
     <w:p>
       <w:r>
-        <w:t>May hitsura ako. Palagi naman akong may hitsura, lumalabas. At kilala ko nga, o malapit na malapit na kaya ang hindi gaanong nalalayo ay usapin lamang ng kung paano at kung mag-isa. Pero hindi pa ako handang sabihin ang pangalan niya nang malakas sa maliit na silid na iyon. Ang pagsasabi ng pangalan ni Theo Hussein nang malakas kay Fiona ay magpapatakbo ng isang bagay pababa sa burol na hindi ko na maibabalik paitaas, at gusto kong maging sigurado sa lahat ng paraan, at sigurado kung paano gagawin iyon nang mahinahon, bago ko ito hayaang gumulong.</w:t>
+        <w:t>May hitsura ako. Palagi naman daw akong may ganoong hitsura. At kilala ko nga, o malapit na malapit na kaya ang kulang na lamang ay kung paano at kung nag-iisa ba siya. Pero hindi pa ako handang sabihin ang pangalan niya nang malakas sa maliit na silid na iyon. Ang pagsasabi ng pangalan ni Theo Hussein nang malakas kay Fiona ay magpapagulong ng isang bagay pababa sa burol na hindi ko na maibabalik paitaas, at gusto kong maging sigurado sa lahat ng paraan, at sigurado kung paano gagawin iyon nang mahinahon, bago ko ito hayaang gumulong.</w:t>
       </w:r>
     </w:p>
     <w:p/>
@@ -3759,19 +3759,19 @@
     <w:p/>
     <w:p>
       <w:r>
-        <w:t xml:space="preserve">Pero may makakagawa. Isang taong dumaan sa bayang ito nang napaka-ordinaryo kaya walang mata ang hihinto sa kanila, na maaaring dumaan sa inn kasama ang mga tao sa pagdiriwang, maglagay ng isang bagay, magpatuloy at walang iwanang anumang alon. Hindi ko makita kung sino iyon. Ngunit may dalawang nota sa aking kamay, nakuha ko ang unang pahiwatig na ang kamay na sumulat ng mga ito at ang kamay na nagdala sa kanila sa lobby ay maaaring hindi iisang kamay.</w:t>
-      </w:r>
-    </w:p>
-    <w:p/>
-    <w:p>
-      <w:r>
-        <w:t xml:space="preserve">“Tatlong araw,” sabi ulit ni Fiona, sa katahimikan, kalahating sa sarili.</w:t>
-      </w:r>
-    </w:p>
-    <w:p/>
-    <w:p>
-      <w:r>
-        <w:t xml:space="preserve">“Tatlong araw,” sumang-ayon ako, at itinabi ang nota kasama ang una. “At aayusin ko ito bago mawala ang huli sa kanila. Ipinangako ko sa iyo iyon.”</w:t>
+        <w:t xml:space="preserve">Pero may makakagawa. Isang taong dumaraan sa bayang ito nang napaka-ordinaryo kaya walang mata ang hihinto sa kanila, na maaaring dumaan sa inn kasama ang mga tao sa pagdiriwang, maglagay ng isang bagay, magpatuloy at walang iwanang anumang alon. Hindi ko makita kung sino iyon. Ngunit may dalawang nota sa aking kamay, nakuha ko ang unang pahiwatig na ang kamay na sumulat ng mga ito at ang kamay na nagdala sa kanila sa lobby ay maaaring hindi iisang kamay.</w:t>
+      </w:r>
+    </w:p>
+    <w:p/>
+    <w:p>
+      <w:r>
+        <w:t xml:space="preserve">“Tatlong araw,” sabi ulit ni Fiona, sa katahimikan, kalahati'y sa sarili.</w:t>
+      </w:r>
+    </w:p>
+    <w:p/>
+    <w:p>
+      <w:r>
+        <w:t xml:space="preserve">“Tatlong araw,” sumang-ayon ako, at itinabi ang nota kasama ang una. “At aayusin ko ito bago mawala ang huli sa kanila. Ipinapangako ko sa iyo iyon.”</w:t>
       </w:r>
     </w:p>
     <w:p/>
@@ -3797,7 +3797,7 @@
     </w:p>
     <w:p>
       <w:r>
-        <w:t xml:space="preserve">Isang malaking sensasyon si Pip. Alam ko nang mangyayari iyon. Naghanda si Fiona ng isang sulok sa beranda ng inn para gawing pook-larawan—isang upuan, isang pininturahang tanawin ng taglamig sa likuran, at isang basket ng mga niniting na bandana—at sa halagang isang dolyar para sa Historical Society ay maaari kang magpalitrato kasama ang tunay na penguin ng Hilagang Polo. Buong hapon ay umabot hanggang sa dulo ng beranda at pababa sa mga baitang ang pila. Si Pip ay nakasuot ng iba't ibang bandana sa bawat litrato at tinanggap ang pagsamba bilang kanyang sinaunang karapatan. Tinanggihan niya, nang may matinding dignidad, ang bawat piraso ng shortbread na sinubukang isubo sa kanya ng mga bata sa ilalim ng mesa. Naipon sa garapon ang mga dolyar na papel, at ito ang unang perang nakuha ng Historical Society mula noong kaha de yero ni Olivia. Hindi nito sila masasalba. Ang isang garapon ng mga dolyar na papel ay hindi makapagsasalba ng isang gusali. Ngunit may naabot din ito, at may init itong dalang pakiramdam. Tumayo si Fiona sa tabi ng tolda, kumukuha ng mga dolyar at ngumiti nang totoo, at sa loob ng isang hapon ay tila bumalik ang kanyang dating sarili.</w:t>
+        <w:t xml:space="preserve">Isang malaking sensasyon si Pip. Alam ko nang mangyayari iyon. Naghanda si Fiona ng isang sulok sa beranda ng inn para gawing pook-larawan—isang upuan, isang pininturahang tanawin ng taglamig sa likuran, at isang basket ng mga niniting na bandana—at sa halagang isang dolyar para sa Historical Society ay maaari kang magpalitrato kasama ang tunay na penguin ng Hilagang Polo. Buong hapon ay umabot hanggang sa dulo ng beranda at pababa sa mga baitang ang pila. Si Pip ay nakasuot ng iba't ibang bandana sa bawat litrato at tinanggap ang pagsamba bilang kanyang sinaunang karapatan. Tinanggihan niya, nang may matinding dignidad, ang bawat piraso ng biskwit na mantikilya na sinubukang isubo sa kanya ng mga bata sa ilalim ng mesa. Naipon sa garapon ang mga dolyar na papel, at ito ang unang perang nakuha ng Historical Society mula noong kaha de yero ni Olivia. Hindi nito sila masasalba. Ang isang garapon ng mga dolyar na papel ay hindi makapagsasalba ng isang gusali. Ngunit may naabot din ito, at may init itong dalang pakiramdam. Tumayo si Fiona sa tabi ng pook-larawan, kumukuha ng mga dolyar at ngumiti nang totoo, at sa loob ng isang hapon ay tila bumalik ang kanyang dating sarili.</w:t>
       </w:r>
     </w:p>
     <w:p>
@@ -3852,7 +3852,7 @@
     </w:p>
     <w:p>
       <w:r>
-        <w:t xml:space="preserve">Tumango siya, tila para bang sagot iyon na madalas niyang marinig. “Alam ninyo kung nasaan ang istasyon. Pangit ang kape, pero bukas ang pinto. Pati Linggo.” Itinuon niya ang kanyang tasa sa dako ng beranda ng inn, kung saan si Pip ay nakaposisyon at nakasuot ng pulang bandana para sa isang pamilyang may limang miyembro. “Mas malaki ang kinita ng penguin ninyo para sa Historical Society ngayon kaysa sa ibinigay ng alkalde sa buong taon.”</w:t>
+        <w:t xml:space="preserve">Tumango siya, tila para bang sagot iyon na madalas niyang marinig. “Alam ninyo kung nasaan ang istasyon. Pangit ang kape, pero bukas ang pinto. Pati Linggo.” Itinuro niya ang kanyang tasa sa dako ng beranda ng inn, kung saan si Pip ay nakaposisyon at nakasuot ng pulang bandana para sa isang pamilyang may limang miyembro. “Mas malaki ang kinita ng penguin ninyo para sa Historical Society ngayon kaysa sa ibinigay ng alkalde sa buong taon.”</w:t>
       </w:r>
     </w:p>
     <w:p>
@@ -3887,7 +3887,7 @@
     </w:p>
     <w:p>
       <w:r>
-        <w:t>Hindi niya itinanong kung ano ang ibig kong sabihin sa bukas. Sa palagay ko, noon pa man, nagsimula na siyang manghula. Tumayo pa kami nang ilang saglit sa niyebe, kaming tatlo at ang penguin sa gitna ng buong maningning na bayan, at hinayaang maging kung ano ang nararapat sa araw na iyon.</w:t>
+        <w:t>Hindi niya itinanong kung ano ang ibig kong sabihin sa bukas. Sa palagay ko, nang mga sandaling iyon, nagsimula na siyang maghinala. Tumayo pa kami nang ilang saglit sa niyebe, kaming tatlo at ang penguin sa gitna ng buong maningning na bayan, at hinayaang maging kung ano ang nararapat sa araw na iyon.</w:t>
       </w:r>
     </w:p>
     <w:p>
@@ -3908,7 +3908,7 @@
     </w:p>
     <w:p>
       <w:r>
-        <w:t xml:space="preserve">Inilatag ko ang lahat ng ito sa mesa sa kusina nang gabing iyon, bawat bahagi nito: ang dalawang nota, ang sipi na ginawa ko mula sa talaan sa katalogo ni Theo, at ang makapal na folder na ibinigay sa akin ni Neil. Pagkatapos ay pinilit ko ang sarili kong umupo at titigan ito nang hindi umiiwas. Sumuko na sa akin si Pip at natulog sa basahan sa tapat ng pugon.</w:t>
+        <w:t xml:space="preserve">Inilatag ko ang lahat ng ito sa mesa sa kusina nang gabing iyon, bawat bahagi nito: ang dalawang nota, ang sipi na ginawa ko mula sa kard sa katalogo ni Theo, at ang makapal na folder na ibinigay sa akin ni Neil. Pagkatapos ay pinilit ko ang sarili kong umupo at titigan ito nang hindi umiiwas. Sumuko na sa akin si Pip at natulog sa alpombra sa tapat ng apuyan.</w:t>
       </w:r>
     </w:p>
     <w:p>
@@ -3937,7 +3937,7 @@
     </w:p>
     <w:p>
       <w:r>
-        <w:t xml:space="preserve">Sumandal ako at hinayaan itong maging totoo, sa wakas, sa buong paraan, ang bagay na pinipigilan ko gamit ang parehong mga kamay sa loob ng ilang araw. Si Theo Hussein ang mangingikil. Ang pinakamabait na tao sa Frost Falls. Ang lalaking humawak sa aking mga kamay sa pinto ng eksibisyon habang nagniningning ang kanyang pagod na mga mata sa ibabaw ng apatnapung bagong miyembro. Natagpuan niya ang kuwento ng brotse sa kanyang arkibo at nakita roon ang kalahating milyong dolyar na maaaring sumagip sa nag-iisang bagay na mas minahal niya kaysa sa kanyang sariling kapahingahan. Kinuha niya ang kanyang dalamhati sa isang nag-aagaw-buhay na Historical Society at ibinunton ito sa isang kaibigan.</w:t>
+        <w:t xml:space="preserve">Sumandal ako at hinayaan itong maging totoo, sa wakas, sa buong paraan, ang bagay na pinipigilan ko gamit ang parehong mga kamay sa loob ng ilang araw. Si Theo Hussein ang mangingikil. Ang pinakamabait na tao sa Frost Falls. Ang lalaking humawak sa aking mga kamay sa pinto ng eksibisyon habang nagniningning ang kanyang pagod na mga mata sa ibabaw ng apatnapung bagong miyembro. Natagpuan niya ang kuwento ng brotse sa kanyang arkibo at nakita roon ang kalahating milyong dolyar na maaaring sumagip sa nag-iisang bagay na mas minamahal niya kaysa sa kanyang sariling kapahingahan. Kinuha niya ang kanyang dalamhati sa isang nag-aagaw-buhay na Historical Society at ibinunton ito sa isang kaibigan.</w:t>
       </w:r>
     </w:p>
     <w:p>
@@ -3952,7 +3952,7 @@
     </w:p>
     <w:p>
       <w:r>
-        <w:t xml:space="preserve">At mayroon pang iba, nang mahawakan ko ang sinulid na iyon at hinila. Hindi lamang alam ng nota na nanakaw ang brotse. Alam nito na binili ang inn gamit ang pera. </w:t>
+        <w:t xml:space="preserve">At mayroon pang iba, nang mahawakan ko ang sinulid na iyon at hinila. Hindi lamang alam ng nota na ninakaw ang brotse. Alam nito na binili ang inn gamit ang pera. </w:t>
       </w:r>
       <w:r>
         <w:rPr>
@@ -3961,7 +3961,7 @@
         <w:t xml:space="preserve">Alam ko kung paano napasakamay ng pamilya mo ang inn na ito,</w:t>
       </w:r>
       <w:r>
-        <w:t xml:space="preserve"> ang sabi ng unang nota. Ang pagnanakaw mismo, ang brotse, ang bato, ang sanglaan sa Ridgeline, ay nasa mga liham ng mga Blackburn, sa arkibo ni Theo. Ngunit ang pagbili ng inn, ang pagbili noong 1924, ang bakas ng papel ng isang ari-arian na nagpalipat-lipat ng kamay, ay walang kinalaman sa anumang liham ng Blackburn. Iyon ay rekord ng ari-arian. Isang titulo.</w:t>
+        <w:t xml:space="preserve"> ang sabi ng unang nota. Ang pagnanakaw mismo, ang brotse, ang bato, ang sanglaan sa Ridgeline, ay nasa mga liham ng mga Blackburn, sa arkibo ni Theo. Ngunit ang pagbili ng inn, ang pagbili noong 1924, ang bakas ng papel ng isang ari-arian na nagpalipat-lipat ng kamay, ay wala sa alinmang liham ng Blackburn. Iyon ay rekord ng ari-arian. Isang titulo.</w:t>
       </w:r>
     </w:p>
     <w:p>
@@ -3971,7 +3971,7 @@
     </w:p>
     <w:p>
       <w:r>
-        <w:t xml:space="preserve">Nanatili akong tahimik sa liwanag ng lampara. Ang pagnanakaw sa brotse at ang pagbili ng inn ay dalawang magkaibang sikreto, na nakatago sa dalawang magkaibang gusali. Taglay ni Theo ang isa sa kanila. Taglay niya ang arkibo, ang mga liham, ang katalogo, ang papel. Taglay niya ang pagnanakaw. Ngunit ang patunay na ang ninakaw na pera ay naging minamahal na inn na ito ay nasa Gusaling Panlungsod, sa mga rekord ng ari-arian na, habang nakatingin sa aking mga mata, isinumpa ng isang matigas at pagod na babae na hinding-hindi niya binabasa.</w:t>
+        <w:t xml:space="preserve">Nanatili akong tahimik sa liwanag ng lampara. Ang pagnanakaw sa brotse at ang pagbili ng inn ay dalawang magkaibang sikreto, na nakatago sa dalawang magkaibang gusali. Hawak ni Theo ang isa sa mga iyon. Hawak niya ang arkibo, ang mga liham, ang kard sa katalogo, ang papel. Hawak niya ang lihim ng pagnanakaw. Ngunit ang patunay na ang ninakaw na pera ay naging minamahal na inn na ito ay nasa Gusaling Pambayan, sa mga rekord ng ari-arian na, habang nakatingin sa aking mga mata, isinumpa ng isang matigas at pagod na babae na hinding-hindi niya binabasa.</w:t>
       </w:r>
     </w:p>
     <w:p>
@@ -4019,7 +4019,7 @@
     <w:p/>
     <w:p>
       <w:r>
-        <w:t>Nagbukas ang Gusaling Panlungsod tuwing Sabado nang linggo ng pista. Bumalik ako roon kinaumagahan bitbit ang isang kuwento, sapagkat upang makatiyak kay Vera ay kailangan kong makita ang isang bagay, at para makita iyon ay kailangan ko siyang patayuin sa silya at tawirin ang silid.</w:t>
+        <w:t>Nagbukas ang Gusaling Pambayan tuwing Sabado nang linggo ng pista. Bumalik ako roon kinaumagahan bitbit ang isang kuwento, sapagkat upang makatiyak kay Vera ay kailangan kong makita ang isang bagay, at para makita iyon ay kailangan ko siyang patayuin sa silya at papuntahin sa kabilang dulo ng silid.</w:t>
       </w:r>
     </w:p>
     <w:p/>
@@ -4079,7 +4079,7 @@
     <w:p/>
     <w:p>
       <w:r>
-        <w:t>Naging makinang ang kanyang mga mata, at hindi niya maibaling ang mga ito upang salubungin ang sa akin, gayundin noong binabanggit nang malakas ang lumang kasaysayan. Naintindihan ko, habang nakatayo roon na suot ang aking amerikana at nasa bag ang titulo ng liwasan, na si Vera Reed ay hindi isang kontrabida. Siya ay isang natatakot na babae na nadala sa isang bagay ng isang lalaking pinagkatiwalaan niya, o kinaawaan, o pareho, at huli na ang lahat para umatras siya ngayon. Alam niya iyon, at hindi siya natutulog nang mas mahimbing kaysa sa babaeng tinutulungan niyang gibain.</w:t>
+        <w:t>Naging makinang ang kanyang mga mata, at hindi niya maibaling ang mga ito upang salubungin ang sa akin, gaya rin tuwing binabanggit nang malakas ang lumang kasaysayan. Naintindihan ko, habang nakatayo roon na suot ang aking amerikana at nasa bag ang titulo ng liwasan, na si Vera Reed ay hindi isang kontrabida. Siya ay isang natatakot na babae na nadala sa isang bagay ng isang lalaking pinagkatiwalaan niya, o kinaawaan, o pareho, at huli na ang lahat para umatras siya ngayon. Alam niya iyon, at hindi siya natutulog nang mas mahimbing kaysa sa babaeng tinutulungan niyang gibain.</w:t>
       </w:r>
     </w:p>
     <w:p/>
@@ -4091,19 +4091,19 @@
     <w:p/>
     <w:p>
       <w:r>
-        <w:t xml:space="preserve">Hawak ni Theo ang pagnanakaw. Natagpuan niya ito sa mga liham ng mga Blackburn, ang brotse, ang bato, ang sanglaan. Itinala niya ito gamit ang kanyang maingat na kamay, ang sapiro sa puso nito, at pagkatapos ay kinuha niya ang mga liham na iyon mula sa mga file at tinawag itong nawawala. Ngunit si Theo, na nalulunod, na pinapanood ng buong bayan, na hindi kailanman nasa bahay, ay hindi magagawa ang natitirang bahagi nito. Hindi niya mapatutunayang binili ang inn gamit ang pera, dahil ang patunay na iyon ay hindi matatagpuan sa kanyang gusali. At hindi niya nadala ang mga nota sa kabayanan at nakapag-iwan ng isa sa mataong mesa sa malinaw na sikat ng araw ng pista, dahil si Theo Hussein ay hindi makapaglakad sa Evergreen Avenue nang hindi napapansin para lamang iligtas ang kanyang buhay.</w:t>
-      </w:r>
-    </w:p>
-    <w:p/>
-    <w:p>
-      <w:r>
-        <w:t xml:space="preserve">Magagawa iyon ni Vera. Nasa mga drower sa likod ng silya ni Vera ang titulo, ang patunay ng pagbili. Si Vera ang nagdadala ng mga papeles mula sa opisina ng alkalde patungo sa arkibo, pabalik-balik, ordinaryo tulad ng panahon, na mayroong buong akses kay Theo at sa kanyang mga papel sa pagsusulat na nanaisin ng isang tao. At si Vera ay gumagalaw sa bayan nang hindi napapansin, isang babaeng gumagawa ng mga utos para sa bayan. Maaari siyang mag-iwan ng sobre sa mesa ng pagtanggap ng inn sa gitna ng karamihan ng pista at walang sinumang maghihinala ng anuman—ang kalihim ng alkalde na napadaan lamang sa inn. Naabutan ko siya sa mga baitang ng inn mismo, sa umaga ng pagdating ng ikalawang nota, at walang inisip na anuman.</w:t>
-      </w:r>
-    </w:p>
-    <w:p/>
-    <w:p>
-      <w:r>
-        <w:t xml:space="preserve">Ginawa nila ito nang magkasama. Si Theo para sa Historical Society na pinapanood niyang namamatay nang paunti-unti. Si Vera para sa perang malinaw niyang kailangan, sahod ng bayan para sa trabaho sa lungsod at mga singilin na halos sabihin niyang hindi niya kayang bayaran. O para sa kanya, bahagya, mula sa katapatan o awa na hindi ko makita ang ilalim. Hindi ko na kailangan ang kanyang eksaktong mga dahilan. Matatag ang hugis.</w:t>
+        <w:t xml:space="preserve">Hawak ni Theo ang lihim ng pagnanakaw. Natagpuan niya ito sa mga liham ng mga Blackburn, ang brotse, ang bato, ang sanglaan. Itinala niya ito sa kanyang maingat na sulat-kamay, ang sapiro sa puso nito, at pagkatapos ay kinuha niya ang mga liham na iyon mula sa mga file at tinawag itong nawawala. Ngunit si Theo, na nalulunod, na pinapanood ng buong bayan, na hindi kailanman nasa bahay, ay hindi magagawa ang natitirang bahagi nito. Hindi niya mapatutunayang binili ang inn gamit ang pera, dahil ang patunay na iyon ay hindi matatagpuan sa kanyang gusali. At hindi niya maaaring nadala ang mga nota sa kabayanan at nakapag-iwan ng isa sa mataong mesa sa malinaw na sikat ng araw ng pista, dahil si Theo Hussein ay hindi makapaglakad sa Evergreen Avenue nang hindi napapansin para lamang iligtas ang kanyang buhay.</w:t>
+      </w:r>
+    </w:p>
+    <w:p/>
+    <w:p>
+      <w:r>
+        <w:t xml:space="preserve">Magagawa iyon ni Vera. Nasa mga drower sa likod ng silya ni Vera ang titulo, ang patunay ng pagbili. Si Vera ang nagdadala ng mga papeles mula sa opisina ng alkalde patungo sa arkibo, pabalik-balik, ordinaryo tulad ng panahon, na mayroong buong akses kay Theo at sa kanyang mga papel sa pagsusulat na nanaisin ng isang tao. At si Vera ay gumagalaw sa bayan nang hindi napapansin, isang babaeng nag-aasikaso ng mga lakarin ng bayan. Maaari siyang mag-iwan ng sobre sa mesa ng pagtanggap ng inn sa gitna ng karamihan ng pista at walang sinumang maghihinala ng anuman—ang kalihim ng alkalde na napadaan lamang sa inn. Nakasalubong ko siya sa mga baitang ng inn mismo, sa umaga ng pagdating ng ikalawang nota, at walang inisip na anuman.</w:t>
+      </w:r>
+    </w:p>
+    <w:p/>
+    <w:p>
+      <w:r>
+        <w:t xml:space="preserve">Ginawa nila ito nang magkasama. Si Theo para sa Historical Society na pinapanood niyang namamatay nang paunti-unti. Si Vera para sa perang malinaw niyang kailangan, sahod na pang-maliit na bayan para sa trabahong pang-lungsod at mga singilin na halos sabihin niyang hindi niya kayang bayaran. O para sa kanya, bahagya, mula sa katapatan o awa na hindi ko makita ang ilalim. Hindi ko na kailangan ang kanyang eksaktong mga dahilan. Matatag ang hugis.</w:t>
       </w:r>
     </w:p>
     <w:p/>
@@ -4127,7 +4127,7 @@
     <w:p/>
     <w:p>
       <w:r>
-        <w:t>Habang naglalakad sa natitirang bahagi pauwi sa lamig, bitbit sa aking bag ang titulo ng liwasan at ang mga pangalan nilang dalawa ay nakabigat sa aking dibdib, naramdaman ko ang pagpili sa aking harapan. Taglay nito ang bigat ng pinakamahirap na uri, ang uring hindi ko na kailangang gawin mula noong araw na bumaba ako mula sa tuktok ng mundo.</w:t>
+        <w:t>Habang naglalakad sa natitirang bahagi pauwi sa lamig, bitbit sa aking bag ang titulo ng liwasan at ang mga pangalan nilang dalawa ay nakabigat sa aking dibdib, naramdaman ko ang pagpili sa aking harapan. Taglay nito ang bigat ng pinakamahirap na uri, ang uring hindi ko pa kinailangang gawin mula noong araw na bumaba ako mula sa tuktok ng mundo.</w:t>
       </w:r>
     </w:p>
     <w:p>
@@ -4174,7 +4174,7 @@
     <w:p/>
     <w:p>
       <w:r>
-        <w:t xml:space="preserve">At may pangalawang kasinungalingang nakatago sa loob ng una. Ang madaling landas ay nagpapakitang-tao bilang pagpapatawad, ngunit malayong-malayo rito. Ang ibibigay ko kina Theo at Vera ay paraan para hindi na kailanman harapin ang nagawa, upang lumaktaw nang diretso sa ibabaw ng mahirap na gitna kung saan pinapanagot ng tao ang sarili sa pinsalang idinulot, direkta mula sa krimen patungo sa kapatawaran nang walang anumang totoo sa pagitan. Pagtulong lamang iyon sa kanila para magpatuloy sa pagtatago, mula sa bayan at mula sa kanilang sarili. At kung hindi na nila kailanman kailangang pasanin ang bigat nito, maaari nila itong ulitin. Hindi ko ililigtas ang kaluluwa ni Theo sa pamamagitan ng pagbabaon ng kanyang krimen. Ninanakawan ko lamang siya ng kaisa-isang bagay na makapagpapagaling dito, ang pag-ako rito.</w:t>
+        <w:t xml:space="preserve">At may pangalawang kasinungalingang nakatago sa loob ng una. Ang madaling landas ay nagpapakitang-tao bilang pagpapatawad, ngunit malayong-malayo rito. Ang ibibigay ko kina Theo at Vera ay paraan para hindi na kailanman harapin ang nagawa, upang lumaktaw nang diretso sa ibabaw ng mahirap na gitna kung saan pinapanagot ng tao ang sarili sa pinsalang idinulot, direkta mula sa krimen patungo sa kapatawaran nang walang anumang totoo sa pagitan. Pagtulong lamang iyon sa kanila para magpatuloy sa pagtatago, mula sa bayan at mula sa kanilang sarili. At kung hindi na nila kailanman kailangang pasanin ang bigat nito, maaari nila itong ulitin. Hindi ko ililigtas ang kaluluwa ni Theo sa pamamagitan ng pagbabaon ng kanyang krimen. Sa halip, nanakawan ko pa siya ng kaisa-isang bagay na makapagpapagaling dito, ang pag-ako rito.</w:t>
       </w:r>
     </w:p>
     <w:p/>
@@ -4216,7 +4216,7 @@
     <w:p/>
     <w:p>
       <w:r>
-        <w:t>Nanatili ako sa takot na iyon at hinayaan itong maging totoo. Pagkatapos ay pinakawalan ko ito, dahil nasagot na ito ni Martha noon sa bilog, habang nakapatong ang kamay sa aking tuhod. Anuman ang dinadala mo, hindi mo kailangang dalhin itong mag-isa. Iyon ang buong punto ng isang bilog. Mahal ko ang isang lugar nang sapat para gawin ang mahirap at tamang bagay para rito, at nagtitiwala akong magiging akin pa rin ito sa kabilang panig.</w:t>
+        <w:t>Nanatili ako sa takot na iyon at hinayaan itong maging totoo. Pagkatapos ay pinakawalan ko ito, dahil nasagot na ito ni Martha noon sa bilog, habang nakapatong ang kamay sa aking tuhod. Anuman ang dinadala mo, hindi mo kailangang dalhin itong mag-isa. Iyon ang buong punto ng isang bilog. Kaya kong mahalin ang isang lugar nang sapat para gawin ang mahirap at tamang bagay para rito, at magtiwalang magiging akin pa rin ito sa kabilang panig.</w:t>
       </w:r>
     </w:p>
     <w:p/>
@@ -4228,7 +4228,7 @@
     <w:p/>
     <w:p>
       <w:r>
-        <w:t xml:space="preserve">“Sigurado ako,” sabi ko. “Liwanag, hindi dilim. Ngunit dahan-dahan, Nick. May kasingdaming awa hangga't kaya ng katotohanan. Lumilitaw ang krimen kung saan makikita ng lahat, ngunit walang sinumang mawawasak maliban kung kinakailangan. May paraan para magsagawa ng katarungan na may init pa rin. Mayroon dapat. At hahanapin ko iyon.”</w:t>
+        <w:t xml:space="preserve">“Sigurado ako,” sabi ko. “Liwanag, hindi dilim. Ngunit dahan-dahan, Nick. May kasingdaming awa hangga't kaya ng katotohanan. Lilitaw ang krimen kung saan makikita ng lahat, ngunit walang sinumang mawawasak maliban kung kinakailangan. May paraan para magsagawa ng katarungan na may init pa rin. Mayroon dapat. At hahanapin ko iyon.”</w:t>
       </w:r>
     </w:p>
     <w:p/>
@@ -4251,13 +4251,13 @@
     <w:p/>
     <w:p>
       <w:r>
-        <w:t>Ang unang ginawa ko ay puntahan si Noriko Tanaka. Pumunta ako sa kanya sa halip na mag-abang, dahil takot ang mga taong ito, hindi mga hayop, at gusto kong mangyari ang buong bagay sa paraang kaya naming panindigan pagkatapos nito.</w:t>
-      </w:r>
-    </w:p>
-    <w:p/>
-    <w:p>
-      <w:r>
-        <w:t xml:space="preserve">Pinakinggan ako ni Hepe Tanaka sa kanyang maliit na opisina sa istasyon habang nakabukas sa ibabaw ng mesa ang kanyang gasgas na kuwaderno at nakapatong doon ang kanyang bolpen nang hindi gumagalaw. Hindi siya nagsusulat habang pinagpapasyahan niya kung maniniwala ba siya sa iyo. Inilatag ko ang lahat, tulad ng paglalatag ko nito para sa aking sarili sa mesa sa kusina. Ang dalawang nota. Ang kard sa katalogo ni Theo na may limang magkatugmang salita. Ang papel ng Historical Society, na magkatugma ang mga hibla sa ilalim ng lampara. Ang titulo ng inn na nakalabas sa lalagyan nito sa basket ng mga papeles ni Vera. Si Constance, ang brotse, ang sanglaan sa Ridgeline, ang buong sandaang taong pinagmulan ng bagay na ito, at ang folder ni Neil sa ilalim ng lahat ng ito, ang bahaging gumawa sa pinagmulan na iyon bilang ukol sa tao.</w:t>
+        <w:t>Ang unang ginawa ko ay puntahan si Noriko Tanaka. Pumunta ako sa kanya sa halip na maglatag ng patibong, dahil takot ang mga taong ito, hindi mga hayop, at gusto kong mangyari ang buong bagay sa paraang kaya naming panindigan pagkatapos nito.</w:t>
+      </w:r>
+    </w:p>
+    <w:p/>
+    <w:p>
+      <w:r>
+        <w:t xml:space="preserve">Pinakinggan ako ni Hepe Tanaka sa kanyang maliit na opisina sa istasyon habang nakabukas sa ibabaw ng mesa ang kanyang gasgas na kuwaderno at nakapatong doon ang kanyang bolpen nang hindi gumagalaw. Hindi siya nagsusulat habang pinagpapasyahan niya kung maniniwala ba siya sa iyo. Inilatag ko ang lahat, tulad ng paglalatag ko nito para sa aking sarili sa mesa sa kusina. Ang dalawang nota. Ang kard sa katalogo ni Theo na may limang magkatugmang salita. Ang papel ng Historical Society, na magkatugma ang mga hibla sa ilalim ng lampara. Ang titulo ng inn na nakalabas sa lalagyan nito sa sisidlan ni Vera ng mga ibabalik sa file. Si Constance, ang brotse, ang sanglaan sa Ridgeline, ang buong sandaang taong pinagmulan ng bagay na ito, at ang folder ni Neil sa ilalim ng lahat ng ito, ang bahaging nagpakitang makatao ang pinagmulang iyon.</w:t>
       </w:r>
     </w:p>
     <w:p/>
@@ -4275,7 +4275,7 @@
     <w:p/>
     <w:p>
       <w:r>
-        <w:t xml:space="preserve">“Alam ko. Alam ko na noon pa.” Pinaikot-ikot ko ito sa isip sa buong paglalakad ko patungo sa istasyon. “Hindi ko ito dinala sa iyo para lang ibaon mo ito nang maayos para sa akin. Dinala ko ito sa iyo para magawa ito nang tama. Nararapat kay Fiona ang batas sa kanyang panig, hindi ang tahimik na pagkamay sa dilim na maaaring masira anumang taglamig sa nalalabing bahagi ng kanyang buhay. Gusto ko itong maging totoo, Noriko. Gusto ko lamang itong maging totoo at mainit nang sabay, kung may paraan man sa ilalim ng langit para magkaroon ng pareho.”</w:t>
+        <w:t xml:space="preserve">“Alam ko. Alam ko na noon pa.” Pinaikot-ikot ko ito sa isip sa buong paglalakad ko patungo sa istasyon. “Hindi ko ito dinala sa iyo para lang ibaon mo ito nang may kabaitan para sa akin. Dinala ko ito sa iyo para magawa ito nang tama. Nararapat kay Fiona ang batas sa kanyang panig, hindi ang tahimik na pagkamay sa dilim na maaaring masira anumang taglamig sa nalalabing bahagi ng kanyang buhay. Gusto ko itong maging totoo, Noriko. Gusto ko lamang itong maging totoo at mainit nang sabay, kung may paraan man sa ilalim ng langit para magkaroon ng pareho.”</w:t>
       </w:r>
     </w:p>
     <w:p/>
@@ -4287,7 +4287,7 @@
     <w:p/>
     <w:p>
       <w:r>
-        <w:t xml:space="preserve">“May paraan,” aniya. “Halos laging may paraan, kapag ang mga taong sangkot ay hindi mga halimaw, at sa lahat ng sinabi mo sa akin, ang dalawang ito ay hindi mga halimaw. Sila ay isang desperadong lalaki at isang natatakot na babae na gumawa ng masamang bagay para sa mga dahilang higit sa kalahati ay nakumbinsi nila ang kanilang sarili na mabuti.” Ibinaba niya ang bolpen. “Ito ang hindi ko gagawin. Hindi ako sisipa ng pinto at lalagyan ng posas si Theo Hussein sa gitna ng pista sa harap ng buong bayan. Walang natutulungan iyon, at hindi ito kinakailangan, at hindi ako gumagawa ng gayong kalupitan kung may gagana namang mas mabait.” Tiningnan niya ako nang diretso sa mesa. “Ito ang gagawin ko. Bibigyan ko siya ng pagkakataon na panagutan ito, habang ako ay nasa silid, upang ito ay naaayon sa batas at dokumentado. Kung bukal sa loob niyang panagutan ito at ituwid ang mali, may kabayaran at totoong pagtutuos, kung gayon may puwang dito para magwakas ito sa iba kaysa sa kapahamakan. Tinatawag namin itong katarungang nagpapanumbalik. Itinatama nito ang maaayos sa halip na sirain lamang ang natitira. Ngunit gagana lamang ito kung totoo, Jessica. Kung magsisinungaling siya o susubukang ilusot ang sarili sa pinto sa tagiliran, dadaan ito sa mahirap na paraan, at desisyon niya iyon, hindi sa akin at hindi sa iyo.”</w:t>
+        <w:t xml:space="preserve">“May paraan,” aniya. “Halos laging may paraan, kapag ang mga taong sangkot ay hindi mga halimaw, at sa lahat ng sinabi mo sa akin, ang dalawang ito ay hindi mga halimaw. Sila ay isang desperadong lalaki at isang natatakot na babae na gumawa ng masamang bagay para sa mga dahilang higit sa kalahati ay nakumbinsi nila ang kanilang sarili na mabuti.” Ibinaba niya ang bolpen. “Ito ang hindi ko gagawin. Hindi ako sisipa ng pinto at lalagyan ng posas si Theo Hussein sa gitna ng pista sa harap ng buong bayan. Walang natutulungan iyon, at hindi ito kinakailangan, at hindi ako gumagawa ng gayong kalupitan kung may gagana namang mas mabait.” Tiningnan niya ako nang diretso sa mesa. “Ito ang gagawin ko. Bibigyan ko siya ng pagkakataon na panagutan ito, habang ako ay nasa silid, upang ito ay naaayon sa batas at dokumentado. Kung bukal sa loob niyang panagutan ito at ituwid ang mali, may kabayaran at totoong pagtutuos, kung gayon may puwang dito para magwakas ito sa iba kaysa sa kapahamakan. Tinatawag namin itong katarungang nagpapanumbalik. Itinatama nito ang kayang ayusin sa halip na sirain lamang ang natitira. Ngunit gagana lamang ito kung totoo, Jessica. Kung magsisinungaling siya o susubukang ilusot ang sarili sa pinto sa tagiliran, dadaan ito sa mahirap na paraan, at desisyon niya iyon, hindi sa akin at hindi sa iyo.”</w:t>
       </w:r>
     </w:p>
     <w:p/>
@@ -4323,7 +4323,7 @@
     <w:p/>
     <w:p>
       <w:r>
-        <w:t xml:space="preserve">“Natatakot ka sa maling lihim sa buong panahong ito,” sabi ko sa kanya. “Akala mo ang lihim ay magnanakaw si Constance. Basahin mo ito, Fiona. Hindi siya binayaran ng mga Blackburn sa loob ng ilang buwan. Nag-aagaw-buhay ang kanyang ina tatlong kanto ang layo nang walang pera para sa doktor. Sinabi nila sa isang batang babae na magpasalamat sa isang bubong habang ang isang kayamanan ay nakaupo sa isang kahon na pinapahiran niya ng alikabok araw-araw. Hindi siya nagnakaw sa mga taong gumawa ng mabuti sa kanya. Kumuha siya sa mga taong nauna nang nagnakaw sa kanya, at nagtayo siya ng sandaang taon ng tapat na pagtanggap sa ibabaw nito.” Isinara ko ang kanyang mga kamay sa paligid ng folder. “Hindi iyon lihim na sumisira sa iyo. Iyon ay isang kuwento na maaari mong tayuan nang tuwid sa loob. Ang pangingikil ay gumana lamang dahil ginugol mo ang iyong buong buhay sa pagtatago ng kalahati nito na nagpahihiya sa iyo, at hindi kailanman nalaman na may kalahating hindi.”</w:t>
+        <w:t xml:space="preserve">“Natatakot ka sa maling lihim sa buong panahong ito,” sabi ko sa kanya. “Akala mo ang lihim ay magnanakaw si Constance. Basahin mo ito, Fiona. Hindi siya binayaran ng mga Blackburn sa loob ng ilang buwan. Nag-aagaw-buhay ang kanyang ina tatlong kanto ang layo nang walang pera para sa doktor. Sinabi nila sa isang batang babae na magpasalamat sa isang bubong habang ang isang kayamanan ay nakaupo sa isang kahon na pinupunasan niya araw-araw. Hindi siya nagnakaw sa mga taong gumawa ng mabuti sa kanya. Kumuha siya sa mga taong nauna nang nagnakaw sa kanya, at nagtayo siya ng sandaang taon ng tapat na pagtanggap sa ibabaw nito.” Isinara ko ang kanyang mga kamay sa paligid ng folder. “Hindi iyon lihim na sumisira sa iyo. Iyon ay isang kuwentong kaya mong panindigan nang may taas-noo. Ang pangingikil ay gumana lamang dahil ginugol mo ang iyong buong buhay sa pagtatago ng kalahati nito na nagpahihiya sa iyo, at hindi kailanman nalaman na may kalahating hindi.”</w:t>
       </w:r>
     </w:p>
     <w:p/>
@@ -4382,7 +4382,7 @@
     <w:p/>
     <w:p>
       <w:r>
-        <w:t xml:space="preserve">Ginawa namin ito noong huling hapon ng pista, sa maliit na silid-tanggapan ni Fiona, habang naririnig sa bintana ang papalubog na ingay ng karnabal, ang pagrereklamo ng isang bata tungkol sa pag-uwi, at ang kaluskos ng mga mesa habang tinitiklop sa liwasan. Pinapunta ni Noriko si Theo upang pag-usapan ang tinatawag niyang usapin ng Historical Society, at pinapunta naman si Vera para sa sinabi niyang utos mula sa tanggapan ng alkalde. Kaya naman dumating silang dalawa nang may ilang minutong pagitan, hiwalay, at walang kamalay-malay na darating ang isa't isa.</w:t>
+        <w:t xml:space="preserve">Ginawa namin ito noong huling hapon ng pista, sa maliit na silid-pahingahan ni Fiona, habang naririnig sa bintana ang papalubog na ingay ng karnabal, ang pagrereklamo ng isang bata tungkol sa pag-uwi, at ang kaluskos ng mga mesa habang tinitiklop sa liwasan. Pinapunta ni Noriko si Theo upang pag-usapan ang tinatawag niyang usapin ng Historical Society, at pinapunta naman si Vera para sa sinabi niyang lakarin mula sa tanggapan ng alkalde. Kaya naman dumating silang dalawa nang may ilang minutong pagitan, hiwalay, at walang kamalay-malay na darating ang isa't isa.</w:t>
       </w:r>
     </w:p>
     <w:p/>
@@ -4439,7 +4439,7 @@
     <w:p/>
     <w:p>
       <w:r>
-        <w:t xml:space="preserve">“Sinabi ko sa sarili ko na hindi talaga ito pagnanakaw,” wika niya. “Hindi kay Fiona. Sinabi ko sa sarili ko na ang inn ay binili gamit ang nakaw na pera sa simula pa lang, kaya ang pagkuha ng kaunti rito pabalik ay hindi pagnanakaw, kundi, ewan ko, ang kasaysayan na itinatama ang sarili nito, isang utang na sa wakas ay sisingilin na. Napakahusay ko sa pagpapaniwala sa nakaraan sa anumang kahulugang kailangan ko. Iyon ang buong pagsasanay sa akin, ang pagbibigay-katwiran sa nakaraan.” Idiniin niya ang kanyang mga kamao sa kanyang mga mata tulad ng isang bata. “Bumibigay na ang bubong. Malapit nang masira ang boiler. Isang daang taon ng alaala ng bayang ito, bawat liham at litrato at kasulatan, lahat ng ito ay nasisira, at bawat matuwid na pintuan na kinatok ko ay isinara sa mukha ko, ang alkalde, ang mga tulong-pinansyal, ang mga pundasyon, bawat isa. At pagkatapos ay natagpuan ko ang mga liham na iyon, at naroroon na, kalahating milyong dolyar, na nakatago lamang sa nakaraan, at naisip ko, kaya ko itong iligtas. Kaya kong iligtas ang lahat ng ito, bawat kapirasong papel, at walang talagang nasasaktan, dahil ang pera ay marumi naman talaga noong una pa man.” Tumingin siya nang may labis na kapighatian. “At pagkatapos ay pinanood ko ang ginagawa nito sa kanya. Kay Fiona. Pinanood ko siyang mamutla. At sinabi ko sa sarili ko na titigil na ako, at hindi ako tumigil, dahil noong mga sandaling iyon ay baon na ako roon, at nang magawa ko na ito, sinabi ko sa sarili ko na ang isa pa ay hindi na makakasama.” Bumaling siya kay Fiona, at nabasag ang kanyang boses. “Humihingi ng tawad ako. Humihingi ng tawad ako, Fiona. Nawala ang sarili ko kung saan sa gitna ng lahat ng ito. Mahal na mahal ko ang kasaysayan ng bayang ito kaya nakalimutan ko na ang bayan ay binubuo ng mga buhay na tao.”</w:t>
+        <w:t xml:space="preserve">“Sinabi ko sa sarili ko na hindi talaga ito pagnanakaw,” wika niya. “Hindi kay Fiona. Sinabi ko sa sarili ko na ang inn ay binili gamit ang nakaw na pera sa simula pa lang, kaya ang pagkuha ng kaunti rito pabalik ay hindi pagnanakaw, kundi, ewan ko, ang kasaysayan na itinatama ang sarili nito, isang utang na sa wakas ay sisingilin na. Napakahusay ko sa pagpapakahulugan sa nakaraan ayon sa anumang kailangan ko. Iyon ang buong pagsasanay sa akin, ang pagbibigay-saysay sa nakaraan.” Idiniin niya ang kanyang mga kamao sa kanyang mga mata tulad ng isang bata. “Bumibigay na ang bubong. Malapit nang masira ang boiler. Isang daang taon ng alaala ng bayang ito, bawat liham at litrato at titulo, lahat ng ito ay nasisira, at bawat tapat na pintuan na kinatok ko ay isinara sa mukha ko, ang alkalde, ang mga tulong-pinansyal, ang mga pundasyon, bawat isa. At pagkatapos ay natagpuan ko ang mga liham na iyon, at naroroon na, kalahating milyong dolyar, na nakatago lamang sa nakaraan, at naisip ko, kaya ko itong iligtas. Kaya kong iligtas ang lahat ng ito, bawat kapirasong papel, at walang talagang nasasaktan, dahil ang pera ay marumi naman talaga noong una pa man.” Tumingala siya nang may labis na kapighatian. “At pagkatapos ay pinanood ko ang ginagawa nito sa kanya. Kay Fiona. Pinanood ko siyang mamutla. At sinabi ko sa sarili ko na titigil na ako, at hindi ako tumigil, dahil noong mga sandaling iyon ay baon na ako roon, at nang magawa ko na ito, sinabi ko sa sarili ko na ang isa pa ay hindi na makakasama.” Bumaling siya kay Fiona, at nabasag ang kanyang boses. “Humihingi ako ng tawad. Humihingi ako ng tawad, Fiona. Nawala ang sarili ko kung saan sa gitna ng lahat ng ito. Mahal na mahal ko ang kasaysayan ng bayang ito kaya nakalimutan ko na ang bayan ay binubuo ng mga buhay na tao.”</w:t>
       </w:r>
     </w:p>
     <w:p/>
@@ -4457,7 +4457,7 @@
     <w:p/>
     <w:p>
       <w:r>
-        <w:t xml:space="preserve">“Vera,” sabi ko. “Na kay Theo ang pagnanakaw. Ngunit alam ng mga nota na ang inn ay binili gamit ang pera mula sa brotse, at iyon ay hindi kailanman naitala sa anumang liham ng Blackburn. Rekord iyon ng ari-arian. Isang titulo. At ang titulo ng inn na ito ay nakalabas sa lalagyan nito sa inyong basket ng muling pag-aayos kahapon ng umaga, na nahawakan, sa mesa ng isang babaeng nagsabi sa akin ng dalawang ulit na hindi kailanman siya nagbabasa ng mga rekord na nasa likod niya.” Pinanatili kong mahinahon ang aking boses. “Nasa kanya ang pagnanakaw. Nasa inyo ang titulo. At kayo ang may mga paa, Vera. Hindi niya kayang tahakin ang bayang ito nang hindi napapansin para lang iligtas ang kanyang buhay, kilala ng lahat si Theo, pinipigilan siya ng lahat. Ngunit walang nag-aalinlangan sa sekretarya ng alkalde na bumibisita sa inn sa panahon ng pista. Naabutan ko kayong naglalakad sa mga baitang nang umagang iyon, kasama ang inyong mga permiso sa paradahan. Hindi niya ito magagawa nang mag-isa. Kailangan niya ng isang taong makakagalaw sa bayan nang hindi nakikita. Kayo iyon.”</w:t>
+        <w:t xml:space="preserve">“Vera,” sabi ko. “Hawak ni Theo ang lihim ng pagnanakaw. Ngunit alam ng mga nota na ang inn ay binili gamit ang pera mula sa brotse, at iyon ay hindi kailanman naitala sa anumang liham ng Blackburn. Rekord iyon ng ari-arian. Isang titulo. At ang titulo ng inn na ito ay nakalabas sa lalagyan nito sa inyong sisidlan ng mga ibabalik sa file kahapon ng umaga, na nahawakan, sa mesa ng isang babaeng nagsabi sa akin ng dalawang ulit na hindi kailanman siya nagbabasa ng mga rekord na nasa likod niya.” Pinanatili kong mahinahon ang aking boses. “Nasa kanya ang lihim ng pagnanakaw. Nasa inyo ang titulo. At kayo ang may mga paa, Vera. Hindi niya kayang tahakin ang bayang ito nang hindi napapansin para lang iligtas ang kanyang buhay, kilala ng lahat si Theo, pinipigilan siya ng lahat. Ngunit walang nag-aalinlangan sa sekretarya ng alkalde na bumibisita sa inn sa panahon ng pista. Nakasalubong ko kayo sa mga baitang nang umagang iyon, kasama ang inyong mga permiso sa paradahan. Hindi niya ito magagawa nang mag-isa. Kailangan niya ng isang taong makakagalaw sa bayan nang hindi nakikita. Kayo iyon.”</w:t>
       </w:r>
     </w:p>
     <w:p/>
@@ -4469,13 +4469,13 @@
     <w:p/>
     <w:p>
       <w:r>
-        <w:t xml:space="preserve">“Lumapit siya sa akin,” wika niya. “Ilang linggo na ang nakalipas. Parang mawawala na ang katinuan sa pag-iisip, nagsasalita tungkol sa Historical Society, tungkol sa kung paano niya nahanap ang bagay na ito at hindi niya kayang gawin nang mag-isa. At dapat ay sinabi kong hindi. Alam kong dapat sinabi kong hindi, alam ko na noon pa man.” Bahagya siyang umugoy, habang mahigpit ang pagkakahawak ng mga braso sa sarili. “Ngunit napakahuli ko na, Ginang Claus. Walang ibinibigay na bayad sa akin ang alkalde at pinapagal ako hanggang sa mamatay, at may mga utang ako na hindi ninyo paniniwalaan, iyong uri na hindi kayo pinapatulog, at sinabi ni Theo na iyon ay perang ninakaw noong una pa man, mula sa isang mayamang pamilya isang daang taon na ang nakalipas, at na ililigtas nito ang Historical Society, at ang isang bahagi nito ay mapupunta sa akin, at sa wakas ay makakawala na ako sa hirap. Pinatunog niya itong halos marangal. Magaling siya rito, ang pagpapalabas sa isang bagay na parang kasaysayan sa halip na isang krimen. At gustong-gusto ko nang makaahon kaya hinayaan ko siyang ipalabas ito sa ganoong paraan, dahil gusto kong maniwala.” Tumingin siya kay Fiona, na may matinding pagsisisi. “Hindi ko kailanman inisip ka bilang isang tao. Iyon ang pinakamasama sa lahat, iyon ang dadalhin ko. Inisip ko lamang ang pera at ang kawalan ng tulog. Patawad. Patawad, Fiona.”</w:t>
-      </w:r>
-    </w:p>
-    <w:p/>
-    <w:p>
-      <w:r>
-        <w:t xml:space="preserve">Naging tahimik ang silid pagkatapos nito, maliban sa pag-iyak at sa malalayong ingay ng pista na inililigpit na sa labas. Dalawang taong gumawa ng malupit na bagay para sa mga dahilan na binihisan nila ng magagandang salita hanggang sa hindi na nila makita kung ano ang nasa ilalim, na nakaupo ngayon sa mga guho nito, inaako ito sa wakas, nang malakas. Walang bitag na sumambulat. Walang sinumang umabot mula sa dilim. Inilatag namin ito nang buo at tapat sa isang mainit na silid sa sikat ng araw sa hapon at binigyan sila ng pagkakataong maging matapat. Tinanggap nila ito, dahil sa huli, tulad ng sinabi ni Noriko, ang karamihan ng tao ay pagod na pagod na sa pagpasan nito.</w:t>
+        <w:t xml:space="preserve">“Lumapit siya sa akin,” wika niya. “Ilang linggo na ang nakalipas. Parang mawawala na ang katinuan sa pag-iisip, nagsasalita tungkol sa Historical Society, tungkol sa kung paano niya nahanap ang bagay na ito at hindi niya kayang gawin nang mag-isa. At dapat ay sinabi kong hindi. Alam kong dapat sinabi kong hindi, alam ko na noon pa man.” Bahagya siyang umugoy, habang mahigpit ang pagkakahawak ng mga braso sa sarili. “Ngunit lubog na lubog na ako sa utang, Ginang Claus. Walang ibinibigay na bayad sa akin ang alkalde at pinapagal ako hanggang sa mamatay, at may mga utang ako na hindi ninyo paniniwalaan, iyong uri na hindi kayo pinapatulog, at sinabi ni Theo na iyon ay perang ninakaw noong una pa man, mula sa isang mayamang pamilya isang daang taon na ang nakalipas, at na ililigtas nito ang Historical Society, at ang isang bahagi nito ay mapupunta sa akin, at sa wakas ay makakawala na ako sa hirap. Pinatunog niya itong halos marangal. Magaling siya rito, ang pagpapalabas sa isang bagay na parang kasaysayan sa halip na isang krimen. At gustong-gusto ko nang makaahon kaya hinayaan ko siyang ipalabas ito sa ganoong paraan, dahil gusto kong maniwala.” Tumingin siya kay Fiona, na may matinding pagsisisi. “Hindi ko kailanman inisip ka bilang isang tao. Iyon ang pinakamasama sa lahat, iyon ang dadalhin ko. Inisip ko lamang ang pera at ang kawalan ng tulog. Patawad. Patawad, Fiona.”</w:t>
+      </w:r>
+    </w:p>
+    <w:p/>
+    <w:p>
+      <w:r>
+        <w:t xml:space="preserve">Naging tahimik ang silid pagkatapos nito, maliban sa pag-iyak at sa malalayong ingay ng pista na inililigpit na sa labas. Dalawang taong gumawa ng malupit na bagay para sa mga dahilan na binihisan nila ng magagandang salita hanggang sa hindi na nila makita kung ano ang nasa ilalim, na nakaupo ngayon sa mga guho nito, inaako ito sa wakas, nang malakas. Walang bitag na sumara. Walang sinumang umabot mula sa dilim. Inilatag namin ito nang buo at tapat sa isang mainit na silid sa sikat ng araw sa hapon at binigyan sila ng pagkakataong maging matapat. Tinanggap nila ito, dahil sa huli, tulad ng sinabi ni Noriko, ang karamihan ng tao ay pagod na pagod na sa pagpasan nito.</w:t>
       </w:r>
     </w:p>
     <w:p/>
@@ -4487,7 +4487,7 @@
     <w:p/>
     <w:p>
       <w:r>
-        <w:t xml:space="preserve">“Sige,” aniya. “Inako ninyong dalawa, nang malaya, at mas mahalaga iyon kaysa sa alam ninyo ngayon. Ngayon ay pag-uusapan natin kung ano ang susunod. Dahil ang pag-aako sa isang bagay ay simula ng pagtatama nito. Hindi ito ang katapusan. Ang katapusan ay mas mahaba nang kaunti, at magsisimula ito bukas.”</w:t>
+        <w:t xml:space="preserve">“Sige,” aniya. “Inako ninyong dalawa, nang malaya, at mas mahalaga iyon kaysa sa alam ninyo ngayon. Ngayon ay pag-uusapan natin kung ano ang susunod. Dahil ang pag-aako sa isang bagay ay simula ng pagtatama nito. Hindi ito ang katapusan. Ang katapusan ay mas mahaba nang malaki, at magsisimula ito bukas.”</w:t>
       </w:r>
     </w:p>
     <w:p>
@@ -4498,13 +4498,13 @@
     <w:p/>
     <w:p>
       <w:r>
-        <w:t>Ang sumunod ay mas matagal kaysa sa isang hapon lamang. Mahirap ang mga oras na iyon, at karamihan sa mga ito ay nauwi kina Theo at Vera, hindi sa akin.</w:t>
-      </w:r>
-    </w:p>
-    <w:p/>
-    <w:p>
-      <w:r>
-        <w:t xml:space="preserve">Sabay na pinairal ni Noriko ang batas at ang puso. Walang tahimihang pagtatakip, walang “kalimutan na lang natin ito,” walang pagpapanggap na ang isang krimen ay hindi krimen. Nagbigay sina Theo at Vera ng buong salaysay, nakasulat at pirmado, tungkol sa lahat ng kanilang ginawa, sunod-sunod, nang walang pinalalampas. Naging ebidensiya ang dalawang nota, may tatak at nakatala. Opisyal nang nakatala sa papel na dalawang mamamayan ng Frost Falls ang nagtangkang mangikil ng kalahating milyong dolyar mula sa isang ikatlo.</w:t>
+        <w:t>Ang sumunod ay mas matagal kaysa sa isang hapon lamang. Mahirap ang mga oras na iyon, at marami sa mga ito ay para kina Theo at Vera, hindi sa akin.</w:t>
+      </w:r>
+    </w:p>
+    <w:p/>
+    <w:p>
+      <w:r>
+        <w:t xml:space="preserve">Sabay na pinairal ni Noriko ang batas at ang puso. Walang tahimik na pagtatakip, walang “kalimutan na lang natin ito,” walang pagpapanggap na ang isang krimen ay hindi krimen. Nagbigay sina Theo at Vera ng buong salaysay, nakasulat at pirmado, tungkol sa lahat ng kanilang ginawa, sunod-sunod, nang walang pinalalampas. Naging ebidensiya ang dalawang nota, may tatak at nakatala. Opisyal nang nakatala sa papel na dalawang mamamayan ng Frost Falls ang nagtangkang mangikil ng kalahating milyong dolyar mula sa isang ikatlo.</w:t>
       </w:r>
     </w:p>
     <w:p/>
@@ -4540,7 +4540,7 @@
     <w:p/>
     <w:p>
       <w:r>
-        <w:t xml:space="preserve">Bumaba siya sa puwesto. Hindi pansamantala, upang tahimik na makabalik sa silya kapag nagsawa na ang bayan sa pagkagalit. Nagbitiw siya bilang pinuno ng Frost Falls Historical Society, at ang lupon, nang malaman na ang lahat, ay tinanggap ang pagbibitiw at sineseryoso ito. Hindi maaaring mangikil ang isang tao sa isang kapitbahay gamit ang koleksyon at papel ng Historical Society, at pagkatapos ay panatilihin ang mga susi ng lugar.</w:t>
+        <w:t xml:space="preserve">Bumaba siya sa puwesto. Hindi pansamantala, upang tahimik na makabalik sa silya kapag nagsawa na ang bayan sa pagkagalit. Nagbitiw siya bilang pinuno ng Frost Falls Historical Society, at ang lupon, nang malaman na ang lahat, ay tinanggap ang pagbibitiw nang seryoso. Hindi maaaring mangikil ang isang tao sa isang kapitbahay gamit ang koleksyon at papel ng Historical Society, at pagkatapos ay panatilihin ang mga susi ng lugar.</w:t>
       </w:r>
     </w:p>
     <w:p/>
@@ -4570,37 +4570,37 @@
     <w:p/>
     <w:p>
       <w:r>
-        <w:t xml:space="preserve">Si Vera ay pinuntahan ko nang mag-isa, pagkatapos. Naabutan ko siyang nag-iimpake ng huling mga gamit sa kanyang mesa sa Gusaling Panlungsod, at tinulungan ko siyang magdala ng isang kahon papunta sa kanyang kotse. Naghintay si Pip sa pinakamabababang baitang habang nakatutok ang mata sa isang tansong pampabigat ng papel na sumisilip sa ibabaw nito. Sa malamig na baitang ay sinabi ko kay Vera ang sadya ko.</w:t>
-      </w:r>
-    </w:p>
-    <w:p/>
-    <w:p>
-      <w:r>
-        <w:t xml:space="preserve">“Gumawa kayo ng masamang bagay,” wika ko. “At pinagbabayaran ninyo ito nang tama, na siyang nararapat. Ngunit inamin ninyo ito sa mismong sandali na tinanong kayo, Vera. Hindi kayo nagsinungaling at hindi kayo nagpalusot. Hindi biro iyon. Iyon ang bahagi ninyo na mabuti pa rin, at mas malaki ito kaysa sa bahaging gumawa ng mali, at nais kong panghawakan ninyo iyon. Mahaba rin ang landas pabalik para sa inyo. Ngunit mayroon nito. Huwag ninyong hayaang sabihin ng sinuman na wala, at higit sa lahat, huwag ninyong sabihin iyon sa inyong sarili.”</w:t>
-      </w:r>
-    </w:p>
-    <w:p/>
-    <w:p>
-      <w:r>
-        <w:t>Umiyak siya. Niyakap niya ako, ang babaeng ito na may matigas na anyo na hindi ko kailanman nakitang yumakap kaninuman, at nagpasalamat sa aking balikat. Pagkatapos ay nagmaneho siya patungo sa bahay ng kanyang kapatid, at kami ni Pip ay naglakad pauwi sa maagang kadiliman. Walang anumang tagumpay doon. Pakiramdam ko ay mabigat at pagod na pagod ako hanggang kaibuturan, parang nilinis ko ang isang sugat hanggang sa ilalim: masakit ito nang labis kaysa sa pabayaan lamang ito, ngunit ngayon ay maaari na itong gumaling.</w:t>
-      </w:r>
-    </w:p>
-    <w:p/>
-    <w:p>
-      <w:r>
-        <w:t xml:space="preserve">Malaya na si Fiona. Huminto na ang mga nota. Lumitaw na ang lihim mula sa kadiliman, at mula sa kadiliman ay wala na itong pangil. Dalawang taong naligaw ng landas ang humaharap dito ngayon, at nagsisimula, kasisimula pa lamang, sa mahabang paglakad pabalik sa kanilang sarili.</w:t>
-      </w:r>
-    </w:p>
-    <w:p/>
-    <w:p>
-      <w:r>
-        <w:t xml:space="preserve">Dapat sana ay katapusan na ito. Ngunit naroon pa rin ang usapin ng mismong Historical Society, ang mismong bagay na sinira ni Theo sa pagtatangkang iligtas ito. Wala na siya rito ngayon. Tumutulo pa rin ang ulan sa bubong at nasisira pa rin ang boiler, at walang anuman sa buong pagtutuos na nagdala kahit isang dolyar para sa alinman dito.</w:t>
-      </w:r>
-    </w:p>
-    <w:p/>
-    <w:p>
-      <w:r>
-        <w:t>Ang bagay na kanyang nagawang mali upang iligtas ay nabibigo pa rin. At ngayon, sa pag-alis niya, kailangan itong iligtas sa tamang paraan, ng bayan, para sa sarili nito. O hindi na ito maililigtas kailanman.</w:t>
+        <w:t xml:space="preserve">Si Vera ay pinuntahan ko nang mag-isa, pagkatapos. Naabutan ko siyang nag-iimpake ng huling mga gamit sa kanyang mesa sa Gusaling Pambayan, at tinulungan ko siyang magdala ng isang kahon papunta sa kanyang kotse. Naghintay si Pip sa pinakamababang baitang habang nakatutok ang mata sa isang tansong pampabigat ng papel na sumisilip sa ibabaw nito. Sa malamig na baitang ay sinabi ko kay Vera ang sadya ko.</w:t>
+      </w:r>
+    </w:p>
+    <w:p/>
+    <w:p>
+      <w:r>
+        <w:t xml:space="preserve">“Gumawa kayo ng masamang bagay,” wika ko. “At pinagbabayaran ninyo ito nang tama, na siyang nararapat. Ngunit inamin ninyo ito sa mismong sandali na tinanong kayo, Vera. Hindi kayo nagsinungaling at hindi kayo nagpalusot. Hindi biro iyon. Iyon ang bahagi ninyo na mabuti pa rin, at mas malaki ito kaysa sa bahaging gumawa ng mali, at nais kong panghawakan ninyo iyon. Mahaba rin ang landas pabalik para sa inyo. Ngunit mayroon. Huwag ninyong hayaang sabihin ng sinuman na wala, at higit sa lahat, huwag ninyong sabihin iyon sa inyong sarili.”</w:t>
+      </w:r>
+    </w:p>
+    <w:p/>
+    <w:p>
+      <w:r>
+        <w:t>Umiyak siya. Niyakap niya ako, ang babaeng ito na may matigas na anyo na hindi ko kailanman nakitang yumakap kaninuman, at nagpasalamat sa aking balikat. Pagkatapos ay nagmaneho siya patungo sa bahay ng kanyang kapatid, at kami ni Pip ay naglakad pauwi sa maagang kadiliman. Walang anumang tagumpay doon. Pakiramdam ko ay mabigat at pagod na pagod ako hanggang kaibuturan, parang nilinis ko ang isang sugat hanggang sa ilalim: mas masakit ito nang labis kaysa sa pabayaan lamang ito, ngunit ngayon ay maaari na itong gumaling.</w:t>
+      </w:r>
+    </w:p>
+    <w:p/>
+    <w:p>
+      <w:r>
+        <w:t xml:space="preserve">Malaya na si Fiona. Huminto na ang mga nota. Lumitaw na ang lihim mula sa kadiliman, at ngayong wala na sa dilim, wala na itong pangil. Dalawang taong naligaw ng landas ang humaharap dito ngayon, at nagsisimula, kasisimula pa lamang, sa mahabang paglakad pabalik sa kanilang sarili.</w:t>
+      </w:r>
+    </w:p>
+    <w:p/>
+    <w:p>
+      <w:r>
+        <w:t xml:space="preserve">Dapat sana ay katapusan na ito. Ngunit naroon pa rin ang usapin ng mismong Historical Society, ang mismong bagay na sinikap iligtas ni Theo hanggang sa masira niya ang kanyang sarili. Wala na siya rito ngayon. Tumutulo pa rin ang ulan sa bubong at nasisira pa rin ang boiler, at walang anuman sa buong pagtutuos na nagdala kahit isang dolyar para sa alinman dito.</w:t>
+      </w:r>
+    </w:p>
+    <w:p/>
+    <w:p>
+      <w:r>
+        <w:t>Ang bagay na tinangka niyang iligtas sa maling paraan ay nabibigo pa rin. At ngayon, sa pag-alis niya, kailangan itong iligtas sa tamang paraan, ng bayan, para sa sarili nito. O hindi na ito maililigtas kailanman.</w:t>
       </w:r>
     </w:p>
     <w:p>
@@ -4629,7 +4629,7 @@
     <w:p/>
     <w:p>
       <w:r>
-        <w:t>Nakaabot ang kanyang kamay sa bulsa ng kanyang dibdib para sa isang gintong panulat. Si Pip, sa aking paanan, ay sinundan ito ng parehong mga mata.</w:t>
+        <w:t>Napunta na ang kanyang kamay sa bulsa sa kanyang dibdib para sa isang gintong panulat. Si Pip, sa aking paanan, ay sinundan ito ng parehong mga mata.</w:t>
       </w:r>
     </w:p>
     <w:p/>
@@ -4647,7 +4647,7 @@
     <w:p/>
     <w:p>
       <w:r>
-        <w:t xml:space="preserve">“Isang mapagbigay na puso iyan, Ginoong Worthington,” sabi ko. “At may sasabihin ako sa inyo ngayon na maaaring magtunog kakaiba, at umaasa ako na didinggin ninyo ito sa paraang inilaan, dahil hindi ito pagtanggi sa inyong kabaitan. Sa palagay ko ay dapat ninyong panatilihin ang inyong tseke. Sa ngayon.”</w:t>
+        <w:t xml:space="preserve">“Isang mapagbigay na puso iyan, Ginoong Worthington,” sabi ko. “At may sasabihin ako sa inyo ngayon na maaaring kakaiba pakinggan, at umaasa ako na didinggin ninyo ito sa paraang inilaan, dahil hindi ito pagtanggi sa inyong kabaitan. Sa palagay ko ay dapat ninyong itabi muna ang inyong tseke. Sa ngayon.”</w:t>
       </w:r>
     </w:p>
     <w:p/>
@@ -4665,7 +4665,7 @@
     <w:p/>
     <w:p>
       <w:r>
-        <w:t xml:space="preserve">Tinitigan ako ni Ginoong Worthington sa loob ng mahabang sandali, at sa kanyang kredito ay nagbago ang kanyang mukha, mula sa pagkalito tungo sa isang uri ng paggalang. “Tinatanggihan ninyo ang napakalaking halaga ng pera, Ginang Claus.”</w:t>
+        <w:t xml:space="preserve">Tinitigan ako ni Ginoong Worthington sa loob ng mahabang sandali, at kapuri-puri sa kanya, nagbago ang kanyang mukha, mula sa pagkalito tungo sa isang uri ng paggalang. “Tinatanggihan ninyo ang napakalaking halaga ng pera, Ginang Claus.”</w:t>
       </w:r>
     </w:p>
     <w:p/>
@@ -4677,7 +4677,7 @@
     <w:p/>
     <w:p>
       <w:r>
-        <w:t xml:space="preserve">Ngumiti noon si Ginang Worthington, ang unang tunay na mainit na ngiti na nakita ko mula sa kanya sa lahat ng mga linggo nila doon, at inilagay niya ang kanyang nakaguwantes na kamay sa braso ng kanyang asawa. “Gusto ko iyon,” wika niya. “Mas gusto ko iyon nang husto, Gerald. Napakarami na nating binili ang ating pagpasok sa paglipas ng mga taon. Bago naman, sa ating edad, ang maimbitahan sa isa.”</w:t>
+        <w:t xml:space="preserve">Ngumiti noon si Ginang Worthington, ang unang tunay na mainit na ngiti na nakita ko mula sa kanya sa lahat ng mga linggo nila doon, at inilagay niya ang kanyang nakaguwantes na kamay sa braso ng kanyang asawa. “Gusto ko iyon,” wika niya. “Mas gusto ko iyon nang husto, Gerald. Napakaraming bagay na ang napasok natin sa pamamagitan ng pera sa paglipas ng mga taon. Bago naman, sa ating edad, ang maimbitahan sa isa.”</w:t>
       </w:r>
     </w:p>
     <w:p/>
@@ -4695,13 +4695,13 @@
     <w:p/>
     <w:p>
       <w:r>
-        <w:t xml:space="preserve">Ngunit nagpapatuloy ako sa pagbabalik sa parehong lugar. Kailangang gawin ito ng bayan nang mag-isa. Iyon ang magiging gawain ng buong taglamig, marahil mas matagal pa: mga bentahan ng tinapay, mga bunutan, at ang mabagal at matigas ang ulo na kabaitan ng isang maliit na lugar na nagpapasya, dolyar sa bawat dolyar, na ang nakaraan nito ay karapat-dapat panatilihin. Maaaring maging dikit ang laban. Maaaring hindi ito magtagumpay nang tuluyan.</w:t>
-      </w:r>
-    </w:p>
-    <w:p/>
-    <w:p>
-      <w:r>
-        <w:t xml:space="preserve">Tapos na ang pagtutuos. Nagsimula na ang pagpapagaling sa mga taong naroroon. Ngunit nakabitin pa rin sa alanganin ang Historical Society, at malalaman namin kung sa ano gawa ang Frost Falls kapag dumating ang oras ng pagsubok.</w:t>
+        <w:t xml:space="preserve">Ngunit paulit-ulit akong bumabalik sa iisang konklusyon. Kailangang gawin ito ng bayan nang mag-isa. Iyon ang magiging gawain ng buong taglamig, marahil mas matagal pa: mga bentahan ng tinapay, mga bunutan, at ang mabagal at matigas ang ulo na kabaitan ng isang maliit na lugar na nagpapasya, dolyar sa bawat dolyar, na ang nakaraan nito ay karapat-dapat panatilihin. Maaaring maging dikit ang laban. Maaaring hindi ito magtagumpay nang tuluyan.</w:t>
+      </w:r>
+    </w:p>
+    <w:p/>
+    <w:p>
+      <w:r>
+        <w:t xml:space="preserve">Tapos na ang pagtutuos. Nagsimula na ang pagpapagaling sa mga taong naroroon. Ngunit nakabitin pa rin sa alanganin ang Historical Society, at malalaman namin kung saan gawa ang Frost Falls kapag dumating ang oras ng pagsubok.</w:t>
       </w:r>
     </w:p>
     <w:p/>
@@ -4724,7 +4724,7 @@
     <w:p/>
     <w:p>
       <w:r>
-        <w:t>Akala ko ay gugustuhin ni Fiona na mas malalim pang ibaon ang sikreto ngayong halos sirain na siya nito. Sana ay mas naging maingat ako sa pag-aakala. Sa halip, ginawa niya ang pinakamatapang na bagay na nasaksihan ko sa buong pangyayaring ito, mas matapang kaysa sa pagharap kay Theo sa loob ng munting sala. Nagpasya siyang isalaysay ito.</w:t>
+        <w:t>Akala ko ay gugustuhin ni Fiona na mas malalim pang ibaon ang sikreto ngayong halos sirain na siya nito. Dapat ay kilala ko na siya nang mas mabuti. Sa halip, ginawa niya ang pinakamatapang na bagay na nasaksihan ko sa buong pangyayaring ito, mas matapang kaysa sa pagharap kay Theo sa loob ng munting sala. Nagpasya siyang isalaysay ito.</w:t>
       </w:r>
     </w:p>
     <w:p/>
@@ -4763,7 +4763,7 @@
     <w:p/>
     <w:p>
       <w:r>
-        <w:t>Isinulat ito ni Claire nang may kabaitan, dahil mabait si Claire, at dahil ang katotohanan ay nagiging mabait kapag isinalaysay mo ang buong bersyon sa halip na ang pinakamasamang kalahati nito. Lumabas ang artikulo noong Huwebes, sumasaklaw sa buong unahan ng loob na pahina. Siyempre pa, nag-usap ang mga tao. Napag-usapan sana nila ang panahon kung wala nang ibang mapag-usapan. Ngunit hindi nila pinag-usapan si Fiona sa paraang kinatatakutan niya buong buhay niya. Walang umurong. Walang tumingin sa kanya nang tagilid sa kabila ng counter ng panaderya. Kadalasan ay isinama nila ito sa lahat ng alam nila tungkol sa kanilang sariling mga tao, na naghirap, nagkasala, at nagtiis. Kalahati sa kanila ay may lola na gumawa ng isang tahimik at desperadong bagay noong mahirap na taglamig.</w:t>
+        <w:t>Isinulat ito ni Claire nang may kabaitan, dahil mabait si Claire, at dahil ang katotohanan ay nagiging mabait kapag isinalaysay mo ang buong bersyon sa halip na ang pinakamasamang kalahati nito. Lumabas ang artikulo noong Huwebes, sumasaklaw sa buong unahan ng loob na pahina. Siyempre pa, nag-usap ang mga tao. Napag-usapan sana nila ang panahon kung wala nang ibang mapag-usapan. Ngunit hindi nila pinag-usapan si Fiona sa paraang kinatatakutan niya buong buhay niya. Walang umurong. Walang tumingin sa kanya nang tagilid sa kabila ng counter ng panaderya. Kadalasan ay isinama nila ito sa lahat ng alam nila tungkol sa kanilang sariling mga tao, na naghirap, nagkasala, at nagtiis. Kalahati sa kanila ay may lola sa tuhod na gumawa ng isang tahimik at desperadong bagay noong mahirap na taglamig.</w:t>
       </w:r>
     </w:p>
     <w:p/>
@@ -4793,13 +4793,13 @@
     <w:p/>
     <w:p>
       <w:r>
-        <w:t>Inihanda ko ang aking sarili na maging dayong sumira sa isang mabuting tao. Higit sa kalahati ang aking inaasahan na lalamig ang pakikitungo sa akin ng bayan, na nanaisin nilang sana ay hinayaan ko na lamang ito, na maaalala nila, sa tuwing titingin sila sa akin, na ako ang nag-ahon kay Theo Hussein sa liwanag at nagpalungkot sa lugar na ito. At may kaunting ganoon, dito at doon, sa loob ng ilang sandali. Ilan na hindi direktang makatingin sa aking mga mata, na medyo nanahimik nang pumasok ako sa isang tindahan. Nauunawaan ko iyon at hinayaan ko na lamang. Hindi ko na pinilit.</w:t>
-      </w:r>
-    </w:p>
-    <w:p/>
-    <w:p>
-      <w:r>
-        <w:t xml:space="preserve">Ngunit kadalasan, ang kabaligtaran ang nangyari. Nagsimula ang mga tao, nang tahimik, nang tagilid, sa paraan ng paggawa ng bayang ito sa pinakamalalim nitong mga bagay, na lumapit at magpasalamat. Iniabot sa akin ni Dot ang isang garapon ng kanyang mga preserbang prutas sa palengke at sinabing, magaspang ang tinig, habang nakatingin sa mga mansanas at hindi sa akin, “Tama ang ginawa mo para kay Fiona. Karamihan ay nagbingi-bingihan na sana.” Itinaas ni Sam Patel ang kanyang sumbrero sa akin sa kabilang panig ng Evergreen Avenue. Maging si Noriko, na matipid sa papuri, ay sinabi sa akin sa pag-inom ng kape na mas mahusay kong hinawakan ang bagay na iyon kaysa sa karamihan sa mga propesyonal na nakatrabaho niya sa kanyang karera, na nakatagpo ako ng isang mainit na paraan upang malutas ang isang bagay na karaniwan ay malamig lamang ang paraan ng pagkalutas.</w:t>
+        <w:t>Inihanda ko ang aking sarili na maging dayong sumira sa isang mabuting tao. Higit sa kalahati ang aking inaasahan na lalamig ang pakikitungo sa akin ng bayan, na nanaisin nilang sana ay hinayaan ko na lamang ito, na maaalala nila, sa tuwing titingin sila sa akin, na ako ang nag-ahon kay Theo Hussein sa liwanag at nagpalungkot sa lugar na ito. At may kaunting ganoon, dito at doon, sa loob ng ilang sandali. Ilan na hindi direktang makatingin sa aking mga mata, na medyo nanahimik nang pumasok ako sa isang tindahan. Naunawaan ko iyon at hinayaan ko na lamang. Hindi ko na pinilit.</w:t>
+      </w:r>
+    </w:p>
+    <w:p/>
+    <w:p>
+      <w:r>
+        <w:t xml:space="preserve">Ngunit kadalasan, ang kabaligtaran ang nangyari. Nagsimula ang mga tao, nang tahimik, nang tagilid, sa paraan ng paggawa ng bayang ito sa pinakamalalim nitong mga bagay, na lumapit at magpasalamat. Iniabot sa akin ni Dot ang isang garapon ng kanyang mga preserbang prutas sa palengke at sinabing, magaspang ang tinig, habang nakatingin sa mga mansanas at hindi sa akin, “Tama ang ginawa mo para kay Fiona. Karamihan ay nagbulag-bulagan na sana.” Itinaas ni Sam Patel ang kanyang sumbrero sa akin sa kabilang panig ng Evergreen Avenue. Maging si Noriko, na matipid sa papuri, ay sinabi sa akin sa pag-inom ng kape na mas mahusay kong hinawakan ang bagay na iyon kaysa sa karamihan sa mga propesyonal na nakatrabaho niya sa kanyang karera, na nakatagpo ako ng isang mainit na paraan upang malutas ang isang bagay na karaniwan ay malamig lamang ang paraan ng pagkalutas.</w:t>
       </w:r>
     </w:p>
     <w:p/>
@@ -4817,7 +4817,7 @@
     <w:p/>
     <w:p>
       <w:r>
-        <w:t xml:space="preserve">Naglakad ako pauwi nang hapon na iyon sa isang bayang naramdaman ko na buong-buo at walang pasubaling akin. Tapos na at wala na ang kapistahan, ngunit ang mga ilaw sa kahabaan ng Evergreen Avenue, na halos lahat ay kulay ginto na ngayon, ay patuloy pa ring sumisiklab nang matatag laban sa maagang kadiliman. Pakendeng-kendeng na nauna si Pip sa akin mula sa isang sikat ng ginto patungo sa susunod, humihinto sa bawat isa na para bang mayroon itong dalang makintab sa ilalim.</w:t>
+        <w:t xml:space="preserve">Naglakad ako pauwi nang hapon na iyon sa isang bayang naramdaman ko na buong-buo at walang pasubaling akin. Tapos na at wala na ang kapistahan, ngunit ang mga ilaw sa kahabaan ng Evergreen Avenue, na halos lahat ay kulay ginto na ngayon, ay patuloy pa ring nagniningning nang matatag laban sa maagang kadiliman. Pakendeng-kendeng na nauna si Pip sa akin mula sa isang sikat ng ginto patungo sa susunod, humihinto sa bawat isa na para bang mayroon itong dalang makintab sa ilalim.</w:t>
       </w:r>
     </w:p>
     <w:p>
@@ -4834,7 +4834,7 @@
     <w:p/>
     <w:p>
       <w:r>
-        <w:t xml:space="preserve">Isinauli na ni Theo ang mga liham ng mga Blackburn, bawat isa, bilang bahagi ng kaniyang pagbabayad-sala, at muli ko iyong isinasalansan kasama sina Olivia at Dot sa isang malamig na hapon, kaming tatlo sa mahabang mesa kung saan nakahapit ang magandang ilawan, nang may makita akong liham na noon ko pa lamang nasaksihan. Hindi ito tungkol sa brotse. Inilarawan nito ang isang araw ng taglamig noong 1924 nang magtipon ang mga pamilya ng bayan sa liwasan, nagselyo ng isang kahon ng mga kayamanan ng bayan, at inilibing iyon sa ilalim ng dambuhalang punong elm, </w:t>
+        <w:t xml:space="preserve">Isinauli na ni Theo ang mga liham ng mga Blackburn, bawat isa, bilang bahagi ng kaniyang pagbabayad-sala, at muli ko iyong isinasalansan kasama sina Olivia at Dot sa isang malamig na hapon, kaming tatlo sa mahabang mesa kung saan nakalapit ang magandang ilawan, nang may makita akong liham na noon ko pa lamang nasaksihan. Hindi ito tungkol sa brotse. Inilarawan nito ang isang araw ng taglamig noong 1924 nang magtipon ang mga pamilya ng bayan sa liwasan, nagselyo ng isang kahon ng mga kayamanan ng bayan, at inilibing iyon sa ilalim ng dambuhalang punong elm, </w:t>
       </w:r>
       <w:r>
         <w:rPr>
@@ -4918,7 +4918,7 @@
     <w:p/>
     <w:p>
       <w:r>
-        <w:t xml:space="preserve">“Ang aldaba, Ginang Claus!” sigaw ni Bram, na dumating na hinihingal. “Mula na naman sa maling panig! Sumusuko na ako, isinusuko ko na ang lahat, ang mga hayop ay nagpupunta kung nasaan ang mga tao, at ang bawat kaluluwa sa bayan ay narito ngayong gabi, ano ang magagawa ng isang katiwala roon, itinatanong ko sa iyo!”</w:t>
+        <w:t xml:space="preserve">“Ang trangka, Ginang Claus!” sigaw ni Bram, na dumating na hinihingal. “Mula na naman sa maling panig! Sumusuko na ako, isinusuko ko na ang lahat, ang mga hayop ay nagpupunta kung nasaan ang mga tao, at ang bawat kaluluwa sa bayan ay narito ngayong gabi, ano ang magagawa ng isang katiwala roon, itinatanong ko sa iyo!”</w:t>
       </w:r>
     </w:p>
     <w:p/>
@@ -4930,13 +4930,13 @@
     <w:p/>
     <w:p>
       <w:r>
-        <w:t xml:space="preserve">Nakatayo ako roon sa liwasan at lumibot ang aking paningin sa lahat ng iyon: ang puno ng elm at ang mga ginintuang ilaw, ang berdeng kahong tanso, ang reindeer, ang tumatawang bata, at ang buong bayang nagkakatipon sa liwanag ng parol. Si Pip ay lumapit upang tumayo sa ilalim ng ilong ni Dancer at binigyan ang reindeer ng mahaba at mahigpit na tingin, na para bang ipinapaalala kung kaninong penguin ito. Nahanap ng kamay ni Nick ang aking kamay. Sa kabila ng kulungan ay naroon ang apuyan na itinayo niya para sa mahika, at naisip ko kung gaano pa kaya rito ang iikot doon pag-uwi namin.</w:t>
-      </w:r>
-    </w:p>
-    <w:p/>
-    <w:p>
-      <w:r>
-        <w:t xml:space="preserve">Dinala namin ang kahon pataas sa Historical Society nang magkakasama, isang dosenang malamig na kamay sa isang berdeng kahong tanso, at inilagay ito sa lugar ng karangalan sa silid sa unahan, nakaselyo pa rin, puno ng anumang inisip ng isang bayan makalipas ang isang daang taon na nararapat itago para sa atin. Isang hiwaga na bubuksan sa bagong taon. Isang dahilan upang panatilihing bukas ang mga pintuan ng Historical Society nang kahit ganoong katagal.</w:t>
+        <w:t xml:space="preserve">Nakatayo ako roon sa liwasan at lumibot ang aking paningin sa lahat ng iyon: ang puno ng elm at ang mga ginintuang ilaw, ang berdeng kahong tanso, ang reindeer, ang tumatawang bata, at ang buong bayang nagkakatipon sa liwanag ng parol. Si Pip ay lumapit upang tumayo sa ilalim ng ilong ni Dancer at binigyan ang reindeer ng mahaba at mahigpit na tingin, na para bang ipinapaalala kung kaninong penguin ito. Nahanap ng kamay ni Nick ang aking kamay. Sa kabila ng kulungan ay naroon ang apuyan na itinayo niya para sa mahika, at naisip ko kung gaano pa karami nito ang iikot doon pagdating namin sa bahay.</w:t>
+      </w:r>
+    </w:p>
+    <w:p/>
+    <w:p>
+      <w:r>
+        <w:t xml:space="preserve">Dinala namin ang kahon pataas sa Historical Society nang magkakasama, isang dosenang malamig na kamay sa isang berdeng kahong tanso, at inilagay ito sa lugar ng karangalan sa silid sa unahan, nakaselyo pa rin, puno ng anumang inisip ng isang bayan noong isang siglo na ang nakararaan na nararapat itago para sa atin. Isang hiwaga na bubuksan sa bagong taon. Isang dahilan upang panatilihing bukas ang mga pintuan ng Historical Society nang kahit ganoong katagal.</w:t>
       </w:r>
     </w:p>
     <w:p/>
@@ -5036,7 +5036,7 @@
     <w:p/>
     <w:p>
       <w:r>
-        <w:t xml:space="preserve">Muli kong nakita si Theo nang linggong iyon. Naroon siya sa Historical Society, sa silid sa likod, nagkukumpuni ng napunit na lumang mapa, ang pinakamabababang gawaing ipinagkatiwala sa kanya kailanman, at malinaw na nagpapasalamat para rito. Hindi niya narinig ang pagpasok ko. Nang tumingala siya, tumuwid siya, at naghanda, tulad ng isang lalaking umaasang maaalala nang eksakto kung ano siya.</w:t>
+        <w:t xml:space="preserve">Muli kong nakita si Theo nang linggong iyon. Naroon siya sa Historical Society, sa silid sa likod, nagkukumpuni ng napunit na lumang mapa, ang pinakamababang gawaing ipinagkatiwala sa kanya kailanman, at malinaw na nagpapasalamat para rito. Hindi niya narinig ang pagpasok ko. Nang tumingala siya, tumuwid siya, at naghanda, tulad ng isang lalaking umaasang ipaaalala sa kanya kung ano talaga siya.</w:t>
       </w:r>
     </w:p>
     <w:p/>
@@ -5054,7 +5054,7 @@
     <w:p/>
     <w:p>
       <w:r>
-        <w:t xml:space="preserve">“Iyon lamang ang ipinagagawa nila sa akin,” sabi niya, at pagkatapos, mabilis, bago ako makasagot, “na siyang tama. Hindi ako nagrereklamo tungkol dito. Napakalaki nito kaysa sa ibinigay ko sana sa aking sarili, kung ako ang nasa posisyon nila.” Pinatag niya ang lumang papel gamit ang dalawang daliri. “Bubuksan nila ang kapsula sa bagong taon. Narinig mo ba? Sabi ni Noriko ay pinapayagan akong naroon. Para manood.” Puno ng luha ang kanyang mga mata. Pumikit siya nang mariin at yumuko nang lalo sa mapa. “Hindi ko nararapat na naroon. Pero sabi niya maaari akong manood. Pagkatapos ng lahat, makakatayo ako sa silid kapag binuksan ng bayan ang puso nito. Iniisip ko ito araw-araw. Malaking bahagi ito ng nagpapatuloy sa akin, kung magiging tapat ako.”</w:t>
+        <w:t xml:space="preserve">“Iyon lamang ang ipinagagawa nila sa akin,” sabi niya, at pagkatapos, mabilis, bago ako makasagot, “na siyang tama. Hindi ako nagrereklamo tungkol dito. Higit pa ito nang malaki kaysa sa ibibigay ko sana sa aking sarili, kung ako ang nasa posisyon nila.” Pinatag niya ang lumang papel gamit ang dalawang daliri. “Bubuksan nila ang kapsula sa bagong taon. Narinig mo ba? Sabi ni Noriko ay pinapayagan akong naroon. Para manood.” Puno ng luha ang kanyang mga mata. Pumikit siya nang mariin at yumuko nang lalo sa mapa. “Hindi ako karapat-dapat na naroon. Pero sabi niya maaari akong manood. Pagkatapos ng lahat, makakatayo ako sa silid kapag binuksan ng bayan ang puso nito. Iniisip ko ito araw-araw. Malaking bahagi ito ng nagpapatuloy sa akin, kung magiging tapat ako.”</w:t>
       </w:r>
     </w:p>
     <w:p/>
@@ -5066,13 +5066,13 @@
     <w:p/>
     <w:p>
       <w:r>
-        <w:t>Hindi niya iyon nasagot, kaya hindi na niya sinubukan. Tumango lamang siya at yumuko muli sa kanyang mapa. Iniwan ko siya sa mabagal na gawain ng pagbawi sa kanyang sarili.</w:t>
-      </w:r>
-    </w:p>
-    <w:p/>
-    <w:p>
-      <w:r>
-        <w:t xml:space="preserve">Naghihintay si Nick nang umuwi ako. Hinawakan niya ang aking kamay sa pinto at inakay ako sa malamig na bakuran patungo sa pagawaan nang walang imik, at binuksan ito. Ang dapugan na ginawa niya ay nagliliwanag sa gitna ng silid, ang mga bilog na bato sa bukid ay mainit at ginto, at ang mahika ay nakabitin sa ibabaw ng walang-lamang rehas sa mabagal na mga bilog. Mas marami ito kaysa noong una.</w:t>
+        <w:t>Hindi niya iyon nasagot, kaya hindi na niya sinubukan. Tumango lamang siya at yumuko muli sa kanyang mapa. Iniwan ko siya sa mabagal na gawain ng pagbawi ng kanyang lugar.</w:t>
+      </w:r>
+    </w:p>
+    <w:p/>
+    <w:p>
+      <w:r>
+        <w:t xml:space="preserve">Naghihintay si Nick nang umuwi ako. Hinawakan niya ang aking kamay sa pinto at inakay ako sa malamig na bakuran patungo sa pagawaan nang walang imik, at binuksan ito. Ang apuyan na ginawa niya ay nagliliwanag sa gitna ng silid, ang mga bilog na bato sa bukid ay mainit at ginto, at ang mahika ay nakabitin sa ibabaw ng walang-lamang rehas sa mabagal na mga bilog. Mas marami ito kaysa noong una.</w:t>
       </w:r>
     </w:p>
     <w:p/>
@@ -5084,19 +5084,19 @@
     <w:p/>
     <w:p>
       <w:r>
-        <w:t xml:space="preserve">“Kaunti lang. Ang simula nito.” Inilagay niya ang kanyang braso sa paligid ko. “Hindi lahat, hindi habambuhay, hindi pa ngayon. Maraming taon pa ng trabaho iyon, ang pagtatayo ng isang dapugan na sapat ang laki upang humawak sa buong mahika ng Pasko. Ngunit nagsimula na, Jess.”</w:t>
-      </w:r>
-    </w:p>
-    <w:p/>
-    <w:p>
-      <w:r>
-        <w:t xml:space="preserve">Sumandal ako sa kanya at pinanood ang pag-ikot ng ginto sa mabagal na mga bilog sa ibabaw ng rehas, at naisip ko ang darating na taglamig. Ang Historical Society na nasa bingit pa rin, upang mailigtas sa tamang paraan o hindi na kailanman, isang buong panahon ng mga bilihan ng tinapay at matigas ang ulong maliit na kabutihan sa unahan bago malaman ng sinuman. Ang kahon na tanso na nakaselyo sa harap na silid ng Historical Society hanggang sa bagong taon. Sina Vera at Theo na parehong naglalakad sa kanilang mahahabang landas pabalik, pulgada sa bawat mahirap na pulgada. Ang mahika, na naninirahan na ngayon ngunit hindi pa tuluyang nanatili, sumisiklab pa rin sa mga ilaw at trangka sa buong bayan. Napakaraming hindi pa tapos. Napakaraming dapat gawin.</w:t>
-      </w:r>
-    </w:p>
-    <w:p/>
-    <w:p>
-      <w:r>
-        <w:t xml:space="preserve">Ngunit ang mga ilaw ay ginto sa ibabaw ng Frost Falls. Ang isang bata na nanatiling tahimik ay muling daldal nang daldal tungkol sa kayamanan. Tumayo nang tuwid si Fiona sa wakas sa loob ng kanyang sariling tunay na kuwento, at si Theo ay binigyan ng daan pabalik. Hindi na ako estranghero rito. Nasa bahay na ako. Pareho kaming nasa bahay. At ang mahika ng Pasko, na sumunod sa amin sa buong daan mula sa Polo, ay nagsimula, kasisimula pa lamang, na manirahan.</w:t>
+        <w:t xml:space="preserve">“Kaunti lang. Ang simula nito.” Inilagay niya ang kanyang braso sa paligid ko. “Hindi lahat, hindi habambuhay, hindi pa ngayon. Maraming taon pa ng trabaho iyon, ang pagtatayo ng isang apuyan na sapat ang laki upang humawak sa buong mahika ng Pasko. Ngunit nagsimula na, Jess.”</w:t>
+      </w:r>
+    </w:p>
+    <w:p/>
+    <w:p>
+      <w:r>
+        <w:t xml:space="preserve">Sumandal ako sa kanya at pinanood ang pag-ikot ng ginto sa mabagal na mga bilog sa ibabaw ng rehas, at naisip ko ang darating na taglamig. Ang Historical Society na nasa bingit pa rin, upang mailigtas sa tamang paraan o hindi na kailanman, isang buong panahon ng mga bentahan ng tinapay at matigas ang ulong maliit na kabutihan sa unahan bago malaman ng sinuman. Ang kahon na tanso na nakaselyo sa harap na silid ng Historical Society hanggang sa bagong taon. Sina Vera at Theo na parehong naglalakad sa kanilang mahahabang landas pabalik, pulgada sa bawat mahirap na pulgada. Ang mahika, na nagsisimula nang manahan ngunit hindi pa tuluyang nakapanahan, sumisiklab pa rin sa mga ilaw at trangka sa buong bayan. Napakaraming hindi pa tapos. Napakaraming dapat gawin.</w:t>
+      </w:r>
+    </w:p>
+    <w:p/>
+    <w:p>
+      <w:r>
+        <w:t xml:space="preserve">Ngunit ang mga ilaw ay ginto sa ibabaw ng Frost Falls. Ang isang batang dating tahimik ay muling daldal nang daldal tungkol sa kayamanan. Tumayo nang tuwid si Fiona sa wakas sa loob ng kanyang sariling tunay na kuwento, at si Theo ay binigyan ng daan pabalik. Hindi na ako estranghero rito. Nasa bahay na ako. Pareho kaming nasa bahay. At ang mahika ng Pasko, na sumunod sa amin sa buong daan mula sa Polo, ay nagsimula, kasisimula pa lamang, na manirahan.</w:t>
       </w:r>
     </w:p>
     <w:p/>
@@ -5114,7 +5114,7 @@
     <w:p/>
     <w:p>
       <w:r>
-        <w:t xml:space="preserve">Pumasok kami nang magkasama mula sa gintong gabi. Naunahan kami ni Pip papunta sa pinto ng kusina at tumayo roon na nag-aangking papasukin sa init, at sa likod namin, sa buong bakuran, nagliliwanag pa rin ang dapugan sa pagawaan.</w:t>
+        <w:t xml:space="preserve">Pumasok kami nang magkasama mula sa gintong gabi. Naunahan kami ni Pip papunta sa pinto ng kusina at tumayo roon na nagpupumilit na papasukin sa init, at sa likod namin, sa buong bakuran, nagliliwanag pa rin ang apuyan sa pagawaan.</w:t>
       </w:r>
     </w:p>
     <w:p/>
@@ -5172,7 +5172,7 @@
     </w:p>
     <w:p>
       <w:r>
-        <w:t xml:space="preserve">Inaabot ng bayan ang mga madaling pangalan: ang magkakarneng nagkadena sa tarangkahan ng kargamento, ang pamilyang nahuhuli sa kanilang langis, isang nabagot na batang lalaki na may nakaw na lata. Inaabot ni Jessica ang bagay na akma—dahil sinuman ang gumawa nito ay bumili ng pulbos, alam ang dosis, at naghain ng reklamo na bumanggit sa kodigo sa kalusugan hanggang sa sub-seksyon. Hindi iyon bugso ng damdamin. Negosyo iyon.</w:t>
+        <w:t xml:space="preserve">Inaabot ng bayan ang mga madaling pangalan: ang magkakarneng nagkadena sa tarangkahan ng kargamento, ang pamilyang atrasado sa bayad sa kanilang langis, isang nabagot na batang lalaki na may nakaw na lata. Inaabot ni Jessica ang bagay na akma—dahil sinuman ang gumawa nito ay bumili ng pulbos, alam ang dosis, at naghain ng reklamo na bumanggit sa kodigo sa kalusugan hanggang sa sub-seksyon. Hindi iyon bugso ng damdamin. Negosyo iyon.</w:t>
       </w:r>
     </w:p>
     <w:p>
@@ -5269,12 +5269,12 @@
     </w:p>
     <w:p>
       <w:r>
-        <w:t xml:space="preserve">Tumawa si Dot ng kanyang maikli at tuyong tawa mula sa kabilang panig ng bilog, hindi tumitingin mula sa kanyang sariling korona, na kalahating beses nang mas malaki kaysa sa sinuman at dalawang beses ang kapal. “Matagal ka na niyang hinahabol mula pa noong araw na pumasok ka. Hinabol niya ang akin noong labing-siyam na walumpu't ano.” Si Dot ay matatag at kulay-abo at nagsasalita nang marami sa napakakaunting mga salita. Matagal na siyang gumagawa ng mga korona sa tindahang iyon sa loob ng mga dekada. Kitang-kita ito sa kanyang mga kamay. Hindi sila tumitigil at hindi kailanman nagkakamali.</w:t>
-      </w:r>
-    </w:p>
-    <w:p>
-      <w:r>
-        <w:t>Nandoon kaming lahat nang umagang iyon. Ang buong bilog, nang walang sinumang may sakit o nag-aalaga ng mga apo. Si Olivia sa unahan nito sa kanyang sariling tindahan, ang mga hibla ng lana ay nakasalansan sa likuran niya sa bawat kulay na gugustuhin ng taglamig. Si Dot sa tabi niya, payak at mabilis. Pagkatapos si Claire Bennett, na sumusulat para sa Gazette, isang kuwaderno na bukas sa braso ng kanyang upuan dahil si Claire ay hindi kailanman ganap na walang trabaho. Patuloy niyang ibinababa ang kanyang korona upang magsulat ng isang linya at pinupulot ito sa isang hakbang sa likod ng iba pa sa amin. Si Ivy sa tabi, na ang tawa ay napakalaki at napakaginhawa kaya't ang tindahan ay tila mas maliwanag sa pagkakaroon niya rito. Nagkaroon siya ng balsam sa kanyang buhok nang hindi namamalayan. Si Martha, ang retiradong guro, biyuda sa mga taong ito, ang kanyang maliit na puting aso na si Snowball ay natutulog sa kanyang bukung-bukong. Ang kanyang kamay ay bumababa paminsan-minsan upang hipuin ang kanyang tainga. Upang matiyak na naroon pa rin siya. At si Ellie, mabait at hindi nagmamadali, na nagboluntaryo sa ospital ng tatlong araw sa isang linggo. Dinala niya ang parehong matatag na lambot na iyon sa isang alambreng kuwadro. Ang kanyang korona ay lumabas na mukhang hindi ginawa kundi lumago.</w:t>
+        <w:t xml:space="preserve">Tumawa si Dot ng kanyang maikli at tuyong tawa mula sa kabilang panig ng bilog, hindi tumitingin mula sa kanyang sariling korona, na kalahating beses nang mas malaki kaysa sa sinuman at dalawang beses ang kapal. “Inaabangan na niya ang iyong sikreto mula pa noong araw na pumasok ka. Inaabangan din niya ang sa akin noong dekada otsenta o kung kailan man.” Si Dot ay matatag at kulay-abo at nagsasalita nang marami sa napakakaunting mga salita. Matagal na siyang gumagawa ng mga korona sa tindahang iyon sa loob ng mga dekada. Kitang-kita ito sa kanyang mga kamay. Hindi sila tumitigil at hindi kailanman nagkakamali.</w:t>
+      </w:r>
+    </w:p>
+    <w:p>
+      <w:r>
+        <w:t>Nandoon kaming lahat nang umagang iyon. Ang buong bilog, nang walang sinumang may sakit o nag-aalaga ng mga apo. Si Olivia sa unahan nito sa kanyang sariling tindahan, ang mga hibla ng lana ay nakasalansan sa likuran niya sa bawat kulay na gugustuhin ng taglamig. Si Dot sa tabi niya, payak at mabilis. Pagkatapos si Claire Bennett, na sumusulat para sa Gazette, isang kuwaderno na bukas sa braso ng kanyang upuan dahil si Claire ay hindi kailanman ganap na walang trabaho. Patuloy niyang ibinababa ang kanyang korona upang magsulat ng isang linya at pinupulot ito sa isang hakbang sa likod ng iba pa sa amin. Si Ivy sa tabi, na ang tawa ay napakalaki at napakaginhawa kaya't ang tindahan ay tila mas maliwanag sa pagkakaroon niya rito. Nagkaroon siya ng balsam sa kanyang buhok nang hindi namamalayan. Si Martha, ang retiradong guro, biyuda sa mga taong ito, ang kanyang maliit na puting aso na si Snowball ay natutulog sa kanyang bukung-bukong. Ang kanyang kamay ay bumababa paminsan-minsan upang hipuin ang kanyang tainga. Upang matiyak na naroon pa rin siya. At si Ellie, mabait at hindi nagmamadali, na nagboboluntaryo sa ospital nang tatlong araw sa isang linggo. Dinala niya ang parehong matatag na lambot na iyon sa isang alambreng kuwadro. Ang kanyang korona ay lumabas na mukhang hindi ginawa kundi lumago.</w:t>
       </w:r>
     </w:p>
     <w:p>
@@ -5304,7 +5304,7 @@
     </w:p>
     <w:p>
       <w:r>
-        <w:t>Naabot ko noon, habang inilalagay ang maliliit na usbong nang sunud-sunod, kung gaano kalayo ang aking nilakbay upang maupo roon. Hindi ang mga milya. Marami sa mga iyon, ngunit hindi ko ibig sabihin ang mga milya. Hindi pa nagtagal, ako ang bagong dumating sa Frost Falls. Ang babae mula sa Hilagang Polo na may sikat na asawa at kakaibang penguin. Ang mga tao ay mabait sa akin tulad ng pagiging mabait ng isang bayan sa isang panauhin, na ibig sabihin ay naglaan sila ng espasyo at nanood upang makita kung ano ang gagawin ko dito. At ngayon ay sinusubukan ni Olivia na magnakaw ng aking paraan ng pagtali ng korona. Ang aso ni Martha ay natulog sa aking upuan nang kasingdali ng sa kanya. Wala nang nagpapaliwanag ng anuman sa akin. Ipinapalagay na alam ko. Mabilis kong nakuha iyon sa isang mahirap na taglagas, sa isang nawalang aso at isang kapsula ng panahon.</w:t>
+        <w:t>Napagtanto ko noon, habang inilalagay ang maliliit na usbong nang sunud-sunod, kung gaano kalayo ang aking nilakbay upang maupo roon. Hindi ang mga milya. Marami sa mga iyon, ngunit hindi ko ibig sabihin ang mga milya. Hindi pa nagtagal, ako ang bagong dumating sa Frost Falls. Ang babae mula sa Hilagang Polo na may sikat na asawa at kakaibang penguin. Ang mga tao ay mabait sa akin tulad ng pagiging mabait ng isang bayan sa isang panauhin, na ibig sabihin ay naglaan sila ng espasyo at nanood upang makita kung ano ang gagawin ko dito. At ngayon ay sinusubukan ni Olivia na magnakaw ng aking paraan ng pagtali ng korona. Ang aso ni Martha ay natulog sa aking upuan nang kasingdali ng sa kanya. Wala nang nagpapaliwanag ng anuman sa akin. Ipinapalagay na alam ko. Mabilis kong nakuha iyon sa isang mahirap na taglagas, sa isang nawalang aso at isang kapsula ng panahon.</w:t>
       </w:r>
     </w:p>
     <w:p>
@@ -5329,7 +5329,7 @@
     </w:p>
     <w:p>
       <w:r>
-        <w:t xml:space="preserve">“Minsan lang iyon,” sabi ni Dot, “at napakagandang mga cupcake iyon.”</w:t>
+        <w:t xml:space="preserve">“Minsan lang iyon,” sabi ni Dot, “at napakasarap ng mga cupcake na iyon.”</w:t>
       </w:r>
     </w:p>
     <w:p>
@@ -5339,7 +5339,7 @@
     </w:p>
     <w:p>
       <w:r>
-        <w:t xml:space="preserve">Pinilit niya ako sa isang cupcake bago ako humingi, at isa kay Claire, na nagprotesta at kinuha ito. Nakatayo siya sa ibabaw ni Martha hanggang sa nangako si Martha na kainin ang sa kanya. At nang ang lahat ay mayroon nang isa, kumuha siya ng isa para sa kanyang sarili. Kinain niya ito nang nakatayo, pinapanood kaming nasisiyahan dito.</w:t>
+        <w:t xml:space="preserve">Pinilit niya akong kumuha ng cupcake bago pa ako humingi, at isa kay Claire, na nagprotesta at kinuha ito. Tumayo siya sa tabi ni Martha hanggang sa nangako si Martha na kainin ang sa kanya. At nang ang lahat ay mayroon nang isa, kumuha siya ng isa para sa kanyang sarili. Kinain niya ito nang nakatayo, pinapanood kaming nasisiyahan dito.</w:t>
       </w:r>
     </w:p>
     <w:p>
@@ -5384,17 +5384,17 @@
     </w:p>
     <w:p>
       <w:r>
-        <w:t xml:space="preserve">“Buweno,” sabi ni Ivy, na may kasiyahan, “may binubuksan. Panahon na. Ang madilim na tindahan ay kahihiyan sa isang kalye.” Nagkaroon ng pangkalahatang bulong ng kasunduan, dahil ang mga tao sa isang bayan tulad ng Frost Falls ay kumukuha ng bakanteng tindahan bilang maliit na personal na kalungkutan at ang bago bilang maliit na personal na regalo.</w:t>
-      </w:r>
-    </w:p>
-    <w:p>
-      <w:r>
-        <w:t>Binaliktad ko ang isang usbong ng balsam sa aking mga daliri na may dikit na dagta, at naramdaman ko, nang walang dahilan na maibibigay ko sa bilog, ang isang maliit na malamig na tusok ng kuryosidad sa likod ng aking leeg. Inilagay ko ito, tulad ng natutunan ko sa mahabang panahon na ilagay ang mga bagay na hindi pa nangangahulugan ng anuman, sakaling dumating ang mga ito.</w:t>
-      </w:r>
-    </w:p>
-    <w:p>
-      <w:r>
-        <w:t xml:space="preserve">“Buweno, sinuman iyon,” sabi ni Greta nang komportable, tinipon ang mga napkin, “gusto nilang pakainin tulad ng sinuman. Dadalhan ko sila ng pie sa araw na magbukas sila.”</w:t>
+        <w:t xml:space="preserve">“Buweno,” sabi ni Ivy, na may kasiyahan, “may binubuksan. Panahon na. Ang madilim na tindahan ay kahihiyan sa isang kalye.” Nagkaroon ng pangkalahatang bulong ng pagsang-ayon, dahil itinuturing ng mga tao sa isang bayan tulad ng Frost Falls ang bakanteng tindahan bilang maliit na personal na kalungkutan at ang bago bilang maliit na personal na regalo.</w:t>
+      </w:r>
+    </w:p>
+    <w:p>
+      <w:r>
+        <w:t>Binaliktad ko ang isang usbong ng balsam sa aking mga daliri na may dikit na dagta, at naramdaman ko, nang walang dahilan na maibibigay ko sa bilog, ang isang maliit na malamig na tusok ng kuryosidad sa likod ng aking leeg. Inilagay ko ito, tulad ng natutunan ko sa mahabang panahon na ilagay ang mga bagay na hindi pa nangangahulugan ng anuman, sakaling dumating ang panahon.</w:t>
+      </w:r>
+    </w:p>
+    <w:p>
+      <w:r>
+        <w:t xml:space="preserve">“Buweno, sinuman iyon,” sabi ni Greta nang komportable, tinipon ang mga napkin, “gusto nilang kumain gaya ng sinuman. Dadalhan ko sila ng pie sa araw na magbukas sila.”</w:t>
       </w:r>
     </w:p>
     <w:p>
@@ -5404,12 +5404,12 @@
     </w:p>
     <w:p>
       <w:r>
-        <w:t xml:space="preserve">“Ngayon kakaiba iyon,” sabi niya, sa kanyang banayad na paraan, at ang isang bagay sa kahinahunan ay nagpatiningin sa aming lahat. “Hindi ba't ang mga taong-niyebe ng mga bata ay nakaharap lahat sa daan kahapon?”</w:t>
-      </w:r>
-    </w:p>
-    <w:p>
-      <w:r>
-        <w:t xml:space="preserve">Ang liwasan ay nakaupo sa tapat ng Yarn Tales, isang malawak na puting patag na may bandstand sa isang dulo at ang war memorial sa kabilang dulo. Ang mga mag-aaral ay nagtayo ng isang hilera ng mga taong-niyebe sa kahabaan nito sa unang magandang niyebe. Tatlo sa kanila, mataba at hindi pantay at kinoronahan ng kung ano man ang mahanap ng mga bata. Kahapon, tulad ng sinabi ni Ellie, nakaharap sila sa daan, ang mga mata ay uling at magkasama, pinapanood ang trapiko na dumadaan tulad ng ginagawa ng mga taong-niyebe. Dumaan ako sa kanila mismo noong gabi bago iyon. Nakaharap sila sa kalye.</w:t>
+        <w:t xml:space="preserve">“Kakaiba iyon,” sabi niya, sa kanyang banayad na paraan, at ang isang bagay sa kahinahunan ay nagpatiningin sa aming lahat. “Hindi ba't ang mga taong-niyebe ng mga bata ay nakaharap lahat sa daan kahapon?”</w:t>
+      </w:r>
+    </w:p>
+    <w:p>
+      <w:r>
+        <w:t xml:space="preserve">Ang liwasan ay nasa tapat ng Yarn Tales, isang malawak na puting patag na may bandstand sa isang dulo at ang bantayog ng digmaan sa kabilang dulo. Ang mga mag-aaral ay nagtayo ng isang hilera ng mga taong-niyebe sa kahabaan nito sa unang magandang niyebe. Tatlo sa kanila, mataba at hindi pantay at kinoronahan ng kung ano man ang mahanap ng mga bata. Kahapon, tulad ng sinabi ni Ellie, nakaharap sila sa daan, ang mga mata ay uling at magkasama, pinapanood ang trapiko na dumadaan tulad ng ginagawa ng mga taong-niyebe. Dumaan ako sa kanila mismo noong gabi bago iyon. Nakaharap sila sa kalye.</w:t>
       </w:r>
     </w:p>
     <w:p>
@@ -5429,7 +5429,7 @@
     </w:p>
     <w:p>
       <w:r>
-        <w:t xml:space="preserve">“Ideya ng isang tao ng biro,” pahayag ni Dot. “Pinihit ito sa gabi. Mga bata.”</w:t>
+        <w:t xml:space="preserve">“Biro lang ng kung sino,” pahayag ni Dot. “Pinihit ito sa magdamag. Mga bata.”</w:t>
       </w:r>
     </w:p>
     <w:p>
@@ -5454,7 +5454,7 @@
     </w:p>
     <w:p>
       <w:r>
-        <w:t xml:space="preserve">Dahil alam ko ang pagkakaiba. Nabuhay ako ng mahabang panahon ngayon kasama ang mahika ng Pasko. Sapat na ang tagal upang malaman ito sa aking mga buto, malinaw na tulad ng yabag sa aking sariling hagdan. Hindi ito isang bata na may malamig na mga daliri. Ang mahika ay malaya sa Frost Falls. Malaya ito mula nang dumating kami, naghahanap ng tahanan. Ang aking asawa ay nagtatayo ng isa. Mabagal at matiyaga sa kanyang pagawaan, isang dapugan para tirahan nito, at lumalapit ito nang kaunti sa apoy araw-araw. Ngunit hindi pa ito permanente. Nasa labas pa rin ito sa bayan sa gabi, mainit at makulit at ganap na walang masamang hangarin, ginagawa ang maliliit na imposibleng bagay na ginagawa ng mahika kapag ito ay may higit na pakiramdam kaysa sa katwiran. Binabago ang mga ilaw ng pagdiriwang mula kahel patungo sa ginto. At ngayon, lumilitaw, pinaglakad ang taong-niyebe ng isang bata sa dilim upang harapin ang anumang nakakuha ng pagala-gala nitong atensyon.</w:t>
+        <w:t xml:space="preserve">Dahil alam ko ang pagkakaiba. Nabuhay ako ng mahabang panahon ngayon kasama ang mahika ng Pasko. Sapat na ang tagal upang malaman ito sa aking mga buto, malinaw na tulad ng yabag sa aking sariling hagdan. Hindi ito isang bata na may malamig na mga daliri. Ang mahika ay malaya sa Frost Falls. Malaya ito mula nang dumating kami, naghahanap ng tahanan. Ang aking asawa ay nagtatayo ng isa. Mabagal at matiyaga sa kanyang pagawaan, isang apuyan para tirahan nito, at lumalapit ito nang kaunti sa apoy araw-araw. Ngunit hindi pa ito tuluyang naninirahan. Nasa labas pa rin ito sa bayan sa gabi, mainit at makulit at ganap na walang masamang hangarin, ginagawa ang maliliit na imposibleng bagay na ginagawa ng mahika kapag ito ay may higit na pakiramdam kaysa sa katwiran. Binabago ang mga ilaw ng pagdiriwang mula kahel patungo sa ginto. At ngayon, lumilitaw, pinaglakad ang taong-niyebe ng isang bata sa dilim upang harapin ang anumang nakakuha ng pagala-gala nitong atensyon.</w:t>
       </w:r>
     </w:p>
     <w:p>

</xml_diff>